<commit_message>
Sync resume content and make application export PDF-only
</commit_message>
<xml_diff>
--- a/docs/downloads/bt-franklin-resume-full.docx
+++ b/docs/downloads/bt-franklin-resume-full.docx
@@ -93,6 +93,7 @@
     </w:p>
     <w:p>
       <w:pPr>
+        <w:keepNext/>
         <w:spacing w:before="0" w:after="160"/>
       </w:pPr>
       <w:r>
@@ -122,8 +123,25 @@
     <w:p>
       <w:pPr>
         <w:pStyle w:val="ListBullet"/>
+        <w:keepLines/>
+        <w:numPr>
+          <w:numId w:val="0"/>
+        </w:numPr>
+        <w:tabs>
+          <w:tab w:pos="360" w:val="left"/>
+        </w:tabs>
         <w:spacing w:before="0" w:after="160"/>
+        <w:ind w:left="360" w:hanging="360"/>
       </w:pPr>
+      <w:r>
+        <w:rPr>
+          <w:rFonts w:ascii="Helvetica Neue" w:hAnsi="Helvetica Neue" w:eastAsia="Helvetica Neue"/>
+          <w:color w:val="0C0C0C"/>
+          <w:sz w:val="24"/>
+        </w:rPr>
+        <w:t>•</w:t>
+        <w:tab/>
+      </w:r>
       <w:r>
         <w:rPr>
           <w:rFonts w:ascii="Helvetica Neue" w:hAnsi="Helvetica Neue" w:eastAsia="Helvetica Neue"/>
@@ -137,8 +155,25 @@
     <w:p>
       <w:pPr>
         <w:pStyle w:val="ListBullet"/>
+        <w:keepLines/>
+        <w:numPr>
+          <w:numId w:val="0"/>
+        </w:numPr>
+        <w:tabs>
+          <w:tab w:pos="360" w:val="left"/>
+        </w:tabs>
         <w:spacing w:before="0" w:after="160"/>
+        <w:ind w:left="360" w:hanging="360"/>
       </w:pPr>
+      <w:r>
+        <w:rPr>
+          <w:rFonts w:ascii="Helvetica Neue" w:hAnsi="Helvetica Neue" w:eastAsia="Helvetica Neue"/>
+          <w:color w:val="0C0C0C"/>
+          <w:sz w:val="24"/>
+        </w:rPr>
+        <w:t>•</w:t>
+        <w:tab/>
+      </w:r>
       <w:r>
         <w:rPr>
           <w:rFonts w:ascii="Helvetica Neue" w:hAnsi="Helvetica Neue" w:eastAsia="Helvetica Neue"/>
@@ -152,8 +187,25 @@
     <w:p>
       <w:pPr>
         <w:pStyle w:val="ListBullet"/>
+        <w:keepLines/>
+        <w:numPr>
+          <w:numId w:val="0"/>
+        </w:numPr>
+        <w:tabs>
+          <w:tab w:pos="360" w:val="left"/>
+        </w:tabs>
         <w:spacing w:before="0" w:after="160"/>
+        <w:ind w:left="360" w:hanging="360"/>
       </w:pPr>
+      <w:r>
+        <w:rPr>
+          <w:rFonts w:ascii="Helvetica Neue" w:hAnsi="Helvetica Neue" w:eastAsia="Helvetica Neue"/>
+          <w:color w:val="0C0C0C"/>
+          <w:sz w:val="24"/>
+        </w:rPr>
+        <w:t>•</w:t>
+        <w:tab/>
+      </w:r>
       <w:r>
         <w:rPr>
           <w:rFonts w:ascii="Helvetica Neue" w:hAnsi="Helvetica Neue" w:eastAsia="Helvetica Neue"/>
@@ -166,6 +218,7 @@
     </w:p>
     <w:p>
       <w:pPr>
+        <w:keepNext/>
         <w:spacing w:before="320" w:after="160"/>
       </w:pPr>
       <w:r>
@@ -181,8 +234,25 @@
     <w:p>
       <w:pPr>
         <w:pStyle w:val="ListBullet"/>
+        <w:keepLines/>
+        <w:numPr>
+          <w:numId w:val="0"/>
+        </w:numPr>
+        <w:tabs>
+          <w:tab w:pos="360" w:val="left"/>
+        </w:tabs>
         <w:spacing w:before="0" w:after="160"/>
+        <w:ind w:left="360" w:hanging="360"/>
       </w:pPr>
+      <w:r>
+        <w:rPr>
+          <w:rFonts w:ascii="Helvetica Neue" w:hAnsi="Helvetica Neue" w:eastAsia="Helvetica Neue"/>
+          <w:color w:val="0C0C0C"/>
+          <w:sz w:val="24"/>
+        </w:rPr>
+        <w:t>•</w:t>
+        <w:tab/>
+      </w:r>
       <w:r>
         <w:rPr>
           <w:rFonts w:ascii="Helvetica Neue" w:hAnsi="Helvetica Neue" w:eastAsia="Helvetica Neue"/>
@@ -196,8 +266,25 @@
     <w:p>
       <w:pPr>
         <w:pStyle w:val="ListBullet"/>
+        <w:keepLines/>
+        <w:numPr>
+          <w:numId w:val="0"/>
+        </w:numPr>
+        <w:tabs>
+          <w:tab w:pos="360" w:val="left"/>
+        </w:tabs>
         <w:spacing w:before="0" w:after="160"/>
+        <w:ind w:left="360" w:hanging="360"/>
       </w:pPr>
+      <w:r>
+        <w:rPr>
+          <w:rFonts w:ascii="Helvetica Neue" w:hAnsi="Helvetica Neue" w:eastAsia="Helvetica Neue"/>
+          <w:color w:val="0C0C0C"/>
+          <w:sz w:val="24"/>
+        </w:rPr>
+        <w:t>•</w:t>
+        <w:tab/>
+      </w:r>
       <w:r>
         <w:rPr>
           <w:rFonts w:ascii="Helvetica Neue" w:hAnsi="Helvetica Neue" w:eastAsia="Helvetica Neue"/>
@@ -211,8 +298,25 @@
     <w:p>
       <w:pPr>
         <w:pStyle w:val="ListBullet"/>
+        <w:keepLines/>
+        <w:numPr>
+          <w:numId w:val="0"/>
+        </w:numPr>
+        <w:tabs>
+          <w:tab w:pos="360" w:val="left"/>
+        </w:tabs>
         <w:spacing w:before="0" w:after="160"/>
+        <w:ind w:left="360" w:hanging="360"/>
       </w:pPr>
+      <w:r>
+        <w:rPr>
+          <w:rFonts w:ascii="Helvetica Neue" w:hAnsi="Helvetica Neue" w:eastAsia="Helvetica Neue"/>
+          <w:color w:val="0C0C0C"/>
+          <w:sz w:val="24"/>
+        </w:rPr>
+        <w:t>•</w:t>
+        <w:tab/>
+      </w:r>
       <w:r>
         <w:rPr>
           <w:rFonts w:ascii="Helvetica Neue" w:hAnsi="Helvetica Neue" w:eastAsia="Helvetica Neue"/>
@@ -226,8 +330,25 @@
     <w:p>
       <w:pPr>
         <w:pStyle w:val="ListBullet"/>
+        <w:keepLines/>
+        <w:numPr>
+          <w:numId w:val="0"/>
+        </w:numPr>
+        <w:tabs>
+          <w:tab w:pos="360" w:val="left"/>
+        </w:tabs>
         <w:spacing w:before="0" w:after="160"/>
+        <w:ind w:left="360" w:hanging="360"/>
       </w:pPr>
+      <w:r>
+        <w:rPr>
+          <w:rFonts w:ascii="Helvetica Neue" w:hAnsi="Helvetica Neue" w:eastAsia="Helvetica Neue"/>
+          <w:color w:val="0C0C0C"/>
+          <w:sz w:val="24"/>
+        </w:rPr>
+        <w:t>•</w:t>
+        <w:tab/>
+      </w:r>
       <w:r>
         <w:rPr>
           <w:rFonts w:ascii="Helvetica Neue" w:hAnsi="Helvetica Neue" w:eastAsia="Helvetica Neue"/>
@@ -241,8 +362,25 @@
     <w:p>
       <w:pPr>
         <w:pStyle w:val="ListBullet"/>
+        <w:keepLines/>
+        <w:numPr>
+          <w:numId w:val="0"/>
+        </w:numPr>
+        <w:tabs>
+          <w:tab w:pos="360" w:val="left"/>
+        </w:tabs>
         <w:spacing w:before="0" w:after="160"/>
+        <w:ind w:left="360" w:hanging="360"/>
       </w:pPr>
+      <w:r>
+        <w:rPr>
+          <w:rFonts w:ascii="Helvetica Neue" w:hAnsi="Helvetica Neue" w:eastAsia="Helvetica Neue"/>
+          <w:color w:val="0C0C0C"/>
+          <w:sz w:val="24"/>
+        </w:rPr>
+        <w:t>•</w:t>
+        <w:tab/>
+      </w:r>
       <w:r>
         <w:rPr>
           <w:rFonts w:ascii="Helvetica Neue" w:hAnsi="Helvetica Neue" w:eastAsia="Helvetica Neue"/>
@@ -256,8 +394,25 @@
     <w:p>
       <w:pPr>
         <w:pStyle w:val="ListBullet"/>
+        <w:keepLines/>
+        <w:numPr>
+          <w:numId w:val="0"/>
+        </w:numPr>
+        <w:tabs>
+          <w:tab w:pos="360" w:val="left"/>
+        </w:tabs>
         <w:spacing w:before="0" w:after="160"/>
+        <w:ind w:left="360" w:hanging="360"/>
       </w:pPr>
+      <w:r>
+        <w:rPr>
+          <w:rFonts w:ascii="Helvetica Neue" w:hAnsi="Helvetica Neue" w:eastAsia="Helvetica Neue"/>
+          <w:color w:val="0C0C0C"/>
+          <w:sz w:val="24"/>
+        </w:rPr>
+        <w:t>•</w:t>
+        <w:tab/>
+      </w:r>
       <w:r>
         <w:rPr>
           <w:rFonts w:ascii="Helvetica Neue" w:hAnsi="Helvetica Neue" w:eastAsia="Helvetica Neue"/>
@@ -271,8 +426,25 @@
     <w:p>
       <w:pPr>
         <w:pStyle w:val="ListBullet"/>
+        <w:keepLines/>
+        <w:numPr>
+          <w:numId w:val="0"/>
+        </w:numPr>
+        <w:tabs>
+          <w:tab w:pos="360" w:val="left"/>
+        </w:tabs>
         <w:spacing w:before="0" w:after="160"/>
+        <w:ind w:left="360" w:hanging="360"/>
       </w:pPr>
+      <w:r>
+        <w:rPr>
+          <w:rFonts w:ascii="Helvetica Neue" w:hAnsi="Helvetica Neue" w:eastAsia="Helvetica Neue"/>
+          <w:color w:val="0C0C0C"/>
+          <w:sz w:val="24"/>
+        </w:rPr>
+        <w:t>•</w:t>
+        <w:tab/>
+      </w:r>
       <w:r>
         <w:rPr>
           <w:rFonts w:ascii="Helvetica Neue" w:hAnsi="Helvetica Neue" w:eastAsia="Helvetica Neue"/>
@@ -286,8 +458,25 @@
     <w:p>
       <w:pPr>
         <w:pStyle w:val="ListBullet"/>
+        <w:keepLines/>
+        <w:numPr>
+          <w:numId w:val="0"/>
+        </w:numPr>
+        <w:tabs>
+          <w:tab w:pos="360" w:val="left"/>
+        </w:tabs>
         <w:spacing w:before="0" w:after="160"/>
+        <w:ind w:left="360" w:hanging="360"/>
       </w:pPr>
+      <w:r>
+        <w:rPr>
+          <w:rFonts w:ascii="Helvetica Neue" w:hAnsi="Helvetica Neue" w:eastAsia="Helvetica Neue"/>
+          <w:color w:val="0C0C0C"/>
+          <w:sz w:val="24"/>
+        </w:rPr>
+        <w:t>•</w:t>
+        <w:tab/>
+      </w:r>
       <w:r>
         <w:rPr>
           <w:rFonts w:ascii="Helvetica Neue" w:hAnsi="Helvetica Neue" w:eastAsia="Helvetica Neue"/>
@@ -295,14 +484,31 @@
           <w:color w:val="0C0C0C"/>
           <w:sz w:val="24"/>
         </w:rPr>
-        <w:t>Full-Stack Product Engineering</w:t>
+        <w:t>Full-Stack Product Engineering with React, Next.js, Node.js, and Python</w:t>
       </w:r>
     </w:p>
     <w:p>
       <w:pPr>
         <w:pStyle w:val="ListBullet"/>
+        <w:keepLines/>
+        <w:numPr>
+          <w:numId w:val="0"/>
+        </w:numPr>
+        <w:tabs>
+          <w:tab w:pos="360" w:val="left"/>
+        </w:tabs>
         <w:spacing w:before="0" w:after="160"/>
+        <w:ind w:left="360" w:hanging="360"/>
       </w:pPr>
+      <w:r>
+        <w:rPr>
+          <w:rFonts w:ascii="Helvetica Neue" w:hAnsi="Helvetica Neue" w:eastAsia="Helvetica Neue"/>
+          <w:color w:val="0C0C0C"/>
+          <w:sz w:val="24"/>
+        </w:rPr>
+        <w:t>•</w:t>
+        <w:tab/>
+      </w:r>
       <w:r>
         <w:rPr>
           <w:rFonts w:ascii="Helvetica Neue" w:hAnsi="Helvetica Neue" w:eastAsia="Helvetica Neue"/>
@@ -315,6 +521,7 @@
     </w:p>
     <w:p>
       <w:pPr>
+        <w:keepNext/>
         <w:spacing w:before="320" w:after="160"/>
       </w:pPr>
       <w:r>
@@ -330,8 +537,25 @@
     <w:p>
       <w:pPr>
         <w:pStyle w:val="ListBullet"/>
+        <w:keepLines/>
+        <w:numPr>
+          <w:numId w:val="0"/>
+        </w:numPr>
+        <w:tabs>
+          <w:tab w:pos="360" w:val="left"/>
+        </w:tabs>
         <w:spacing w:before="0" w:after="160"/>
+        <w:ind w:left="360" w:hanging="360"/>
       </w:pPr>
+      <w:r>
+        <w:rPr>
+          <w:rFonts w:ascii="Helvetica Neue" w:hAnsi="Helvetica Neue" w:eastAsia="Helvetica Neue"/>
+          <w:color w:val="0C0C0C"/>
+          <w:sz w:val="24"/>
+        </w:rPr>
+        <w:t>•</w:t>
+        <w:tab/>
+      </w:r>
       <w:r>
         <w:rPr>
           <w:rFonts w:ascii="Helvetica Neue" w:hAnsi="Helvetica Neue" w:eastAsia="Helvetica Neue"/>
@@ -345,8 +569,25 @@
     <w:p>
       <w:pPr>
         <w:pStyle w:val="ListBullet"/>
+        <w:keepLines/>
+        <w:numPr>
+          <w:numId w:val="0"/>
+        </w:numPr>
+        <w:tabs>
+          <w:tab w:pos="360" w:val="left"/>
+        </w:tabs>
         <w:spacing w:before="0" w:after="160"/>
+        <w:ind w:left="360" w:hanging="360"/>
       </w:pPr>
+      <w:r>
+        <w:rPr>
+          <w:rFonts w:ascii="Helvetica Neue" w:hAnsi="Helvetica Neue" w:eastAsia="Helvetica Neue"/>
+          <w:color w:val="0C0C0C"/>
+          <w:sz w:val="24"/>
+        </w:rPr>
+        <w:t>•</w:t>
+        <w:tab/>
+      </w:r>
       <w:r>
         <w:rPr>
           <w:rFonts w:ascii="Helvetica Neue" w:hAnsi="Helvetica Neue" w:eastAsia="Helvetica Neue"/>
@@ -360,8 +601,25 @@
     <w:p>
       <w:pPr>
         <w:pStyle w:val="ListBullet"/>
+        <w:keepLines/>
+        <w:numPr>
+          <w:numId w:val="0"/>
+        </w:numPr>
+        <w:tabs>
+          <w:tab w:pos="360" w:val="left"/>
+        </w:tabs>
         <w:spacing w:before="0" w:after="160"/>
+        <w:ind w:left="360" w:hanging="360"/>
       </w:pPr>
+      <w:r>
+        <w:rPr>
+          <w:rFonts w:ascii="Helvetica Neue" w:hAnsi="Helvetica Neue" w:eastAsia="Helvetica Neue"/>
+          <w:color w:val="0C0C0C"/>
+          <w:sz w:val="24"/>
+        </w:rPr>
+        <w:t>•</w:t>
+        <w:tab/>
+      </w:r>
       <w:r>
         <w:rPr>
           <w:rFonts w:ascii="Helvetica Neue" w:hAnsi="Helvetica Neue" w:eastAsia="Helvetica Neue"/>
@@ -375,8 +633,25 @@
     <w:p>
       <w:pPr>
         <w:pStyle w:val="ListBullet"/>
+        <w:keepLines/>
+        <w:numPr>
+          <w:numId w:val="0"/>
+        </w:numPr>
+        <w:tabs>
+          <w:tab w:pos="360" w:val="left"/>
+        </w:tabs>
         <w:spacing w:before="0" w:after="160"/>
+        <w:ind w:left="360" w:hanging="360"/>
       </w:pPr>
+      <w:r>
+        <w:rPr>
+          <w:rFonts w:ascii="Helvetica Neue" w:hAnsi="Helvetica Neue" w:eastAsia="Helvetica Neue"/>
+          <w:color w:val="0C0C0C"/>
+          <w:sz w:val="24"/>
+        </w:rPr>
+        <w:t>•</w:t>
+        <w:tab/>
+      </w:r>
       <w:r>
         <w:rPr>
           <w:rFonts w:ascii="Helvetica Neue" w:hAnsi="Helvetica Neue" w:eastAsia="Helvetica Neue"/>
@@ -390,8 +665,25 @@
     <w:p>
       <w:pPr>
         <w:pStyle w:val="ListBullet"/>
+        <w:keepLines/>
+        <w:numPr>
+          <w:numId w:val="0"/>
+        </w:numPr>
+        <w:tabs>
+          <w:tab w:pos="360" w:val="left"/>
+        </w:tabs>
         <w:spacing w:before="0" w:after="160"/>
+        <w:ind w:left="360" w:hanging="360"/>
       </w:pPr>
+      <w:r>
+        <w:rPr>
+          <w:rFonts w:ascii="Helvetica Neue" w:hAnsi="Helvetica Neue" w:eastAsia="Helvetica Neue"/>
+          <w:color w:val="0C0C0C"/>
+          <w:sz w:val="24"/>
+        </w:rPr>
+        <w:t>•</w:t>
+        <w:tab/>
+      </w:r>
       <w:r>
         <w:rPr>
           <w:rFonts w:ascii="Helvetica Neue" w:hAnsi="Helvetica Neue" w:eastAsia="Helvetica Neue"/>
@@ -399,11 +691,12 @@
           <w:color w:val="0C0C0C"/>
           <w:sz w:val="24"/>
         </w:rPr>
-        <w:t>Applied AI quality and evaluation practices including rubric grading, human review, tracing, observability, guardrail-style parsing checks, skill/workflow evaluation, automation-oriented review loops, and practical output quality checks.</w:t>
+        <w:t>Has practical AI quality and evaluation experience through rubric grading, human review, tracing, observability, guardrail-style parsing checks, skill/workflow evaluation, automation-oriented review loops, and practical output quality checks; interested in moving deeper into formal LLM and agent evaluation without claiming deep platform-specific eval-tool specialization.</w:t>
       </w:r>
     </w:p>
     <w:p>
       <w:pPr>
+        <w:keepNext/>
         <w:spacing w:before="320" w:after="160"/>
       </w:pPr>
       <w:r>
@@ -419,8 +712,25 @@
     <w:p>
       <w:pPr>
         <w:pStyle w:val="ListBullet"/>
+        <w:keepLines/>
+        <w:numPr>
+          <w:numId w:val="0"/>
+        </w:numPr>
+        <w:tabs>
+          <w:tab w:pos="360" w:val="left"/>
+        </w:tabs>
         <w:spacing w:before="0" w:after="160"/>
+        <w:ind w:left="360" w:hanging="360"/>
       </w:pPr>
+      <w:r>
+        <w:rPr>
+          <w:rFonts w:ascii="Helvetica Neue" w:hAnsi="Helvetica Neue" w:eastAsia="Helvetica Neue"/>
+          <w:color w:val="0C0C0C"/>
+          <w:sz w:val="24"/>
+        </w:rPr>
+        <w:t>•</w:t>
+        <w:tab/>
+      </w:r>
       <w:r>
         <w:rPr>
           <w:rFonts w:ascii="Helvetica Neue" w:hAnsi="Helvetica Neue" w:eastAsia="Helvetica Neue"/>
@@ -434,8 +744,25 @@
     <w:p>
       <w:pPr>
         <w:pStyle w:val="ListBullet"/>
+        <w:keepLines/>
+        <w:numPr>
+          <w:numId w:val="0"/>
+        </w:numPr>
+        <w:tabs>
+          <w:tab w:pos="360" w:val="left"/>
+        </w:tabs>
         <w:spacing w:before="0" w:after="160"/>
+        <w:ind w:left="360" w:hanging="360"/>
       </w:pPr>
+      <w:r>
+        <w:rPr>
+          <w:rFonts w:ascii="Helvetica Neue" w:hAnsi="Helvetica Neue" w:eastAsia="Helvetica Neue"/>
+          <w:color w:val="0C0C0C"/>
+          <w:sz w:val="24"/>
+        </w:rPr>
+        <w:t>•</w:t>
+        <w:tab/>
+      </w:r>
       <w:r>
         <w:rPr>
           <w:rFonts w:ascii="Helvetica Neue" w:hAnsi="Helvetica Neue" w:eastAsia="Helvetica Neue"/>
@@ -443,14 +770,31 @@
           <w:color w:val="0C0C0C"/>
           <w:sz w:val="24"/>
         </w:rPr>
-        <w:t>Historical domain experience in Salesforce and GTM systems, including Salesforce UI/UX, Lightning Web Components, enterprise implementation strategy, and configuration migration workflows.</w:t>
+        <w:t>Historical domain experience in Salesforce and GTM systems, including Salesforce UI/UX, Lightning Web Components, enterprise implementation strategy, and configuration migration workflows; this is supporting context for enterprise/platform architecture, not a desired future specialization.</w:t>
       </w:r>
     </w:p>
     <w:p>
       <w:pPr>
         <w:pStyle w:val="ListBullet"/>
+        <w:keepLines/>
+        <w:numPr>
+          <w:numId w:val="0"/>
+        </w:numPr>
+        <w:tabs>
+          <w:tab w:pos="360" w:val="left"/>
+        </w:tabs>
         <w:spacing w:before="0" w:after="160"/>
+        <w:ind w:left="360" w:hanging="360"/>
       </w:pPr>
+      <w:r>
+        <w:rPr>
+          <w:rFonts w:ascii="Helvetica Neue" w:hAnsi="Helvetica Neue" w:eastAsia="Helvetica Neue"/>
+          <w:color w:val="0C0C0C"/>
+          <w:sz w:val="24"/>
+        </w:rPr>
+        <w:t>•</w:t>
+        <w:tab/>
+      </w:r>
       <w:r>
         <w:rPr>
           <w:rFonts w:ascii="Helvetica Neue" w:hAnsi="Helvetica Neue" w:eastAsia="Helvetica Neue"/>
@@ -464,8 +808,25 @@
     <w:p>
       <w:pPr>
         <w:pStyle w:val="ListBullet"/>
+        <w:keepLines/>
+        <w:numPr>
+          <w:numId w:val="0"/>
+        </w:numPr>
+        <w:tabs>
+          <w:tab w:pos="360" w:val="left"/>
+        </w:tabs>
         <w:spacing w:before="0" w:after="160"/>
+        <w:ind w:left="360" w:hanging="360"/>
       </w:pPr>
+      <w:r>
+        <w:rPr>
+          <w:rFonts w:ascii="Helvetica Neue" w:hAnsi="Helvetica Neue" w:eastAsia="Helvetica Neue"/>
+          <w:color w:val="0C0C0C"/>
+          <w:sz w:val="24"/>
+        </w:rPr>
+        <w:t>•</w:t>
+        <w:tab/>
+      </w:r>
       <w:r>
         <w:rPr>
           <w:rFonts w:ascii="Helvetica Neue" w:hAnsi="Helvetica Neue" w:eastAsia="Helvetica Neue"/>
@@ -479,8 +840,25 @@
     <w:p>
       <w:pPr>
         <w:pStyle w:val="ListBullet"/>
+        <w:keepLines/>
+        <w:numPr>
+          <w:numId w:val="0"/>
+        </w:numPr>
+        <w:tabs>
+          <w:tab w:pos="360" w:val="left"/>
+        </w:tabs>
         <w:spacing w:before="0" w:after="160"/>
+        <w:ind w:left="360" w:hanging="360"/>
       </w:pPr>
+      <w:r>
+        <w:rPr>
+          <w:rFonts w:ascii="Helvetica Neue" w:hAnsi="Helvetica Neue" w:eastAsia="Helvetica Neue"/>
+          <w:color w:val="0C0C0C"/>
+          <w:sz w:val="24"/>
+        </w:rPr>
+        <w:t>•</w:t>
+        <w:tab/>
+      </w:r>
       <w:r>
         <w:rPr>
           <w:rFonts w:ascii="Helvetica Neue" w:hAnsi="Helvetica Neue" w:eastAsia="Helvetica Neue"/>
@@ -488,11 +866,12 @@
           <w:color w:val="0C0C0C"/>
           <w:sz w:val="24"/>
         </w:rPr>
-        <w:t>Earlier medical imaging software experience, including refactoring product systems that expanded clinical applicability and strengthened product value.</w:t>
+        <w:t>Historical medical imaging software experience from earlier career work, with the understanding that the domain knowledge is older and less current than the pricing, Salesforce, AI tooling, and repository-intelligence domains.</w:t>
       </w:r>
     </w:p>
     <w:p>
       <w:pPr>
+        <w:keepNext/>
         <w:spacing w:before="320" w:after="160"/>
       </w:pPr>
       <w:r>
@@ -508,8 +887,25 @@
     <w:p>
       <w:pPr>
         <w:pStyle w:val="ListBullet"/>
+        <w:keepLines/>
+        <w:numPr>
+          <w:numId w:val="0"/>
+        </w:numPr>
+        <w:tabs>
+          <w:tab w:pos="360" w:val="left"/>
+        </w:tabs>
         <w:spacing w:before="0" w:after="160"/>
+        <w:ind w:left="360" w:hanging="360"/>
       </w:pPr>
+      <w:r>
+        <w:rPr>
+          <w:rFonts w:ascii="Helvetica Neue" w:hAnsi="Helvetica Neue" w:eastAsia="Helvetica Neue"/>
+          <w:color w:val="0C0C0C"/>
+          <w:sz w:val="24"/>
+        </w:rPr>
+        <w:t>•</w:t>
+        <w:tab/>
+      </w:r>
       <w:r>
         <w:rPr>
           <w:rFonts w:ascii="Helvetica Neue" w:hAnsi="Helvetica Neue" w:eastAsia="Helvetica Neue"/>
@@ -523,8 +919,25 @@
     <w:p>
       <w:pPr>
         <w:pStyle w:val="ListBullet"/>
+        <w:keepLines/>
+        <w:numPr>
+          <w:numId w:val="0"/>
+        </w:numPr>
+        <w:tabs>
+          <w:tab w:pos="360" w:val="left"/>
+        </w:tabs>
         <w:spacing w:before="0" w:after="160"/>
+        <w:ind w:left="360" w:hanging="360"/>
       </w:pPr>
+      <w:r>
+        <w:rPr>
+          <w:rFonts w:ascii="Helvetica Neue" w:hAnsi="Helvetica Neue" w:eastAsia="Helvetica Neue"/>
+          <w:color w:val="0C0C0C"/>
+          <w:sz w:val="24"/>
+        </w:rPr>
+        <w:t>•</w:t>
+        <w:tab/>
+      </w:r>
       <w:r>
         <w:rPr>
           <w:rFonts w:ascii="Helvetica Neue" w:hAnsi="Helvetica Neue" w:eastAsia="Helvetica Neue"/>
@@ -538,8 +951,25 @@
     <w:p>
       <w:pPr>
         <w:pStyle w:val="ListBullet"/>
+        <w:keepLines/>
+        <w:numPr>
+          <w:numId w:val="0"/>
+        </w:numPr>
+        <w:tabs>
+          <w:tab w:pos="360" w:val="left"/>
+        </w:tabs>
         <w:spacing w:before="0" w:after="160"/>
+        <w:ind w:left="360" w:hanging="360"/>
       </w:pPr>
+      <w:r>
+        <w:rPr>
+          <w:rFonts w:ascii="Helvetica Neue" w:hAnsi="Helvetica Neue" w:eastAsia="Helvetica Neue"/>
+          <w:color w:val="0C0C0C"/>
+          <w:sz w:val="24"/>
+        </w:rPr>
+        <w:t>•</w:t>
+        <w:tab/>
+      </w:r>
       <w:r>
         <w:rPr>
           <w:rFonts w:ascii="Helvetica Neue" w:hAnsi="Helvetica Neue" w:eastAsia="Helvetica Neue"/>
@@ -553,8 +983,25 @@
     <w:p>
       <w:pPr>
         <w:pStyle w:val="ListBullet"/>
+        <w:keepLines/>
+        <w:numPr>
+          <w:numId w:val="0"/>
+        </w:numPr>
+        <w:tabs>
+          <w:tab w:pos="360" w:val="left"/>
+        </w:tabs>
         <w:spacing w:before="0" w:after="160"/>
+        <w:ind w:left="360" w:hanging="360"/>
       </w:pPr>
+      <w:r>
+        <w:rPr>
+          <w:rFonts w:ascii="Helvetica Neue" w:hAnsi="Helvetica Neue" w:eastAsia="Helvetica Neue"/>
+          <w:color w:val="0C0C0C"/>
+          <w:sz w:val="24"/>
+        </w:rPr>
+        <w:t>•</w:t>
+        <w:tab/>
+      </w:r>
       <w:r>
         <w:rPr>
           <w:rFonts w:ascii="Helvetica Neue" w:hAnsi="Helvetica Neue" w:eastAsia="Helvetica Neue"/>
@@ -568,8 +1015,25 @@
     <w:p>
       <w:pPr>
         <w:pStyle w:val="ListBullet"/>
+        <w:keepLines/>
+        <w:numPr>
+          <w:numId w:val="0"/>
+        </w:numPr>
+        <w:tabs>
+          <w:tab w:pos="360" w:val="left"/>
+        </w:tabs>
         <w:spacing w:before="0" w:after="160"/>
+        <w:ind w:left="360" w:hanging="360"/>
       </w:pPr>
+      <w:r>
+        <w:rPr>
+          <w:rFonts w:ascii="Helvetica Neue" w:hAnsi="Helvetica Neue" w:eastAsia="Helvetica Neue"/>
+          <w:color w:val="0C0C0C"/>
+          <w:sz w:val="24"/>
+        </w:rPr>
+        <w:t>•</w:t>
+        <w:tab/>
+      </w:r>
       <w:r>
         <w:rPr>
           <w:rFonts w:ascii="Helvetica Neue" w:hAnsi="Helvetica Neue" w:eastAsia="Helvetica Neue"/>
@@ -583,8 +1047,25 @@
     <w:p>
       <w:pPr>
         <w:pStyle w:val="ListBullet"/>
+        <w:keepLines/>
+        <w:numPr>
+          <w:numId w:val="0"/>
+        </w:numPr>
+        <w:tabs>
+          <w:tab w:pos="360" w:val="left"/>
+        </w:tabs>
         <w:spacing w:before="0" w:after="160"/>
+        <w:ind w:left="360" w:hanging="360"/>
       </w:pPr>
+      <w:r>
+        <w:rPr>
+          <w:rFonts w:ascii="Helvetica Neue" w:hAnsi="Helvetica Neue" w:eastAsia="Helvetica Neue"/>
+          <w:color w:val="0C0C0C"/>
+          <w:sz w:val="24"/>
+        </w:rPr>
+        <w:t>•</w:t>
+        <w:tab/>
+      </w:r>
       <w:r>
         <w:rPr>
           <w:rFonts w:ascii="Helvetica Neue" w:hAnsi="Helvetica Neue" w:eastAsia="Helvetica Neue"/>
@@ -598,8 +1079,25 @@
     <w:p>
       <w:pPr>
         <w:pStyle w:val="ListBullet"/>
+        <w:keepLines/>
+        <w:numPr>
+          <w:numId w:val="0"/>
+        </w:numPr>
+        <w:tabs>
+          <w:tab w:pos="360" w:val="left"/>
+        </w:tabs>
         <w:spacing w:before="0" w:after="160"/>
+        <w:ind w:left="360" w:hanging="360"/>
       </w:pPr>
+      <w:r>
+        <w:rPr>
+          <w:rFonts w:ascii="Helvetica Neue" w:hAnsi="Helvetica Neue" w:eastAsia="Helvetica Neue"/>
+          <w:color w:val="0C0C0C"/>
+          <w:sz w:val="24"/>
+        </w:rPr>
+        <w:t>•</w:t>
+        <w:tab/>
+      </w:r>
       <w:r>
         <w:rPr>
           <w:rFonts w:ascii="Helvetica Neue" w:hAnsi="Helvetica Neue" w:eastAsia="Helvetica Neue"/>
@@ -613,8 +1111,25 @@
     <w:p>
       <w:pPr>
         <w:pStyle w:val="ListBullet"/>
+        <w:keepLines/>
+        <w:numPr>
+          <w:numId w:val="0"/>
+        </w:numPr>
+        <w:tabs>
+          <w:tab w:pos="360" w:val="left"/>
+        </w:tabs>
         <w:spacing w:before="0" w:after="160"/>
+        <w:ind w:left="360" w:hanging="360"/>
       </w:pPr>
+      <w:r>
+        <w:rPr>
+          <w:rFonts w:ascii="Helvetica Neue" w:hAnsi="Helvetica Neue" w:eastAsia="Helvetica Neue"/>
+          <w:color w:val="0C0C0C"/>
+          <w:sz w:val="24"/>
+        </w:rPr>
+        <w:t>•</w:t>
+        <w:tab/>
+      </w:r>
       <w:r>
         <w:rPr>
           <w:rFonts w:ascii="Helvetica Neue" w:hAnsi="Helvetica Neue" w:eastAsia="Helvetica Neue"/>
@@ -628,8 +1143,25 @@
     <w:p>
       <w:pPr>
         <w:pStyle w:val="ListBullet"/>
+        <w:keepLines/>
+        <w:numPr>
+          <w:numId w:val="0"/>
+        </w:numPr>
+        <w:tabs>
+          <w:tab w:pos="360" w:val="left"/>
+        </w:tabs>
         <w:spacing w:before="0" w:after="160"/>
+        <w:ind w:left="360" w:hanging="360"/>
       </w:pPr>
+      <w:r>
+        <w:rPr>
+          <w:rFonts w:ascii="Helvetica Neue" w:hAnsi="Helvetica Neue" w:eastAsia="Helvetica Neue"/>
+          <w:color w:val="0C0C0C"/>
+          <w:sz w:val="24"/>
+        </w:rPr>
+        <w:t>•</w:t>
+        <w:tab/>
+      </w:r>
       <w:r>
         <w:rPr>
           <w:rFonts w:ascii="Helvetica Neue" w:hAnsi="Helvetica Neue" w:eastAsia="Helvetica Neue"/>
@@ -643,8 +1175,25 @@
     <w:p>
       <w:pPr>
         <w:pStyle w:val="ListBullet"/>
+        <w:keepLines/>
+        <w:numPr>
+          <w:numId w:val="0"/>
+        </w:numPr>
+        <w:tabs>
+          <w:tab w:pos="360" w:val="left"/>
+        </w:tabs>
         <w:spacing w:before="0" w:after="160"/>
+        <w:ind w:left="360" w:hanging="360"/>
       </w:pPr>
+      <w:r>
+        <w:rPr>
+          <w:rFonts w:ascii="Helvetica Neue" w:hAnsi="Helvetica Neue" w:eastAsia="Helvetica Neue"/>
+          <w:color w:val="0C0C0C"/>
+          <w:sz w:val="24"/>
+        </w:rPr>
+        <w:t>•</w:t>
+        <w:tab/>
+      </w:r>
       <w:r>
         <w:rPr>
           <w:rFonts w:ascii="Helvetica Neue" w:hAnsi="Helvetica Neue" w:eastAsia="Helvetica Neue"/>
@@ -657,6 +1206,7 @@
     </w:p>
     <w:p>
       <w:pPr>
+        <w:keepNext/>
         <w:spacing w:before="320" w:after="160"/>
       </w:pPr>
       <w:r>
@@ -672,8 +1222,25 @@
     <w:p>
       <w:pPr>
         <w:pStyle w:val="ListBullet"/>
+        <w:keepLines/>
+        <w:numPr>
+          <w:numId w:val="0"/>
+        </w:numPr>
+        <w:tabs>
+          <w:tab w:pos="360" w:val="left"/>
+        </w:tabs>
         <w:spacing w:before="0" w:after="160"/>
+        <w:ind w:left="360" w:hanging="360"/>
       </w:pPr>
+      <w:r>
+        <w:rPr>
+          <w:rFonts w:ascii="Helvetica Neue" w:hAnsi="Helvetica Neue" w:eastAsia="Helvetica Neue"/>
+          <w:color w:val="0C0C0C"/>
+          <w:sz w:val="24"/>
+        </w:rPr>
+        <w:t>•</w:t>
+        <w:tab/>
+      </w:r>
       <w:r>
         <w:rPr>
           <w:rFonts w:ascii="Helvetica Neue" w:hAnsi="Helvetica Neue" w:eastAsia="Helvetica Neue"/>
@@ -687,8 +1254,25 @@
     <w:p>
       <w:pPr>
         <w:pStyle w:val="ListBullet"/>
+        <w:keepLines/>
+        <w:numPr>
+          <w:numId w:val="0"/>
+        </w:numPr>
+        <w:tabs>
+          <w:tab w:pos="360" w:val="left"/>
+        </w:tabs>
         <w:spacing w:before="0" w:after="160"/>
+        <w:ind w:left="360" w:hanging="360"/>
       </w:pPr>
+      <w:r>
+        <w:rPr>
+          <w:rFonts w:ascii="Helvetica Neue" w:hAnsi="Helvetica Neue" w:eastAsia="Helvetica Neue"/>
+          <w:color w:val="0C0C0C"/>
+          <w:sz w:val="24"/>
+        </w:rPr>
+        <w:t>•</w:t>
+        <w:tab/>
+      </w:r>
       <w:r>
         <w:rPr>
           <w:rFonts w:ascii="Helvetica Neue" w:hAnsi="Helvetica Neue" w:eastAsia="Helvetica Neue"/>
@@ -702,8 +1286,25 @@
     <w:p>
       <w:pPr>
         <w:pStyle w:val="ListBullet"/>
+        <w:keepLines/>
+        <w:numPr>
+          <w:numId w:val="0"/>
+        </w:numPr>
+        <w:tabs>
+          <w:tab w:pos="360" w:val="left"/>
+        </w:tabs>
         <w:spacing w:before="0" w:after="160"/>
+        <w:ind w:left="360" w:hanging="360"/>
       </w:pPr>
+      <w:r>
+        <w:rPr>
+          <w:rFonts w:ascii="Helvetica Neue" w:hAnsi="Helvetica Neue" w:eastAsia="Helvetica Neue"/>
+          <w:color w:val="0C0C0C"/>
+          <w:sz w:val="24"/>
+        </w:rPr>
+        <w:t>•</w:t>
+        <w:tab/>
+      </w:r>
       <w:r>
         <w:rPr>
           <w:rFonts w:ascii="Helvetica Neue" w:hAnsi="Helvetica Neue" w:eastAsia="Helvetica Neue"/>
@@ -717,8 +1318,25 @@
     <w:p>
       <w:pPr>
         <w:pStyle w:val="ListBullet"/>
+        <w:keepLines/>
+        <w:numPr>
+          <w:numId w:val="0"/>
+        </w:numPr>
+        <w:tabs>
+          <w:tab w:pos="360" w:val="left"/>
+        </w:tabs>
         <w:spacing w:before="0" w:after="160"/>
+        <w:ind w:left="360" w:hanging="360"/>
       </w:pPr>
+      <w:r>
+        <w:rPr>
+          <w:rFonts w:ascii="Helvetica Neue" w:hAnsi="Helvetica Neue" w:eastAsia="Helvetica Neue"/>
+          <w:color w:val="0C0C0C"/>
+          <w:sz w:val="24"/>
+        </w:rPr>
+        <w:t>•</w:t>
+        <w:tab/>
+      </w:r>
       <w:r>
         <w:rPr>
           <w:rFonts w:ascii="Helvetica Neue" w:hAnsi="Helvetica Neue" w:eastAsia="Helvetica Neue"/>
@@ -726,14 +1344,31 @@
           <w:color w:val="0C0C0C"/>
           <w:sz w:val="24"/>
         </w:rPr>
-        <w:t>Brings a broad AI perspective spanning agent workflows, tool use, MCP, structured prompts, RAG, semantic matching, computational creativity, human-facing AI product UX, developer workflow acceleration, and evidence-grounded automation.</w:t>
+        <w:t>Brings a broader AI perspective than model-training-focused ML alone: agent workflows, tool use, MCP, structured prompts, RAG, semantic matching, computational creativity, human-facing AI product UX, developer workflow acceleration, and evidence-grounded automation.</w:t>
       </w:r>
     </w:p>
     <w:p>
       <w:pPr>
         <w:pStyle w:val="ListBullet"/>
+        <w:keepLines/>
+        <w:numPr>
+          <w:numId w:val="0"/>
+        </w:numPr>
+        <w:tabs>
+          <w:tab w:pos="360" w:val="left"/>
+        </w:tabs>
         <w:spacing w:before="0" w:after="160"/>
+        <w:ind w:left="360" w:hanging="360"/>
       </w:pPr>
+      <w:r>
+        <w:rPr>
+          <w:rFonts w:ascii="Helvetica Neue" w:hAnsi="Helvetica Neue" w:eastAsia="Helvetica Neue"/>
+          <w:color w:val="0C0C0C"/>
+          <w:sz w:val="24"/>
+        </w:rPr>
+        <w:t>•</w:t>
+        <w:tab/>
+      </w:r>
       <w:r>
         <w:rPr>
           <w:rFonts w:ascii="Helvetica Neue" w:hAnsi="Helvetica Neue" w:eastAsia="Helvetica Neue"/>
@@ -746,6 +1381,7 @@
     </w:p>
     <w:p>
       <w:pPr>
+        <w:keepNext/>
         <w:spacing w:before="320" w:after="160"/>
       </w:pPr>
       <w:r>
@@ -760,6 +1396,7 @@
     </w:p>
     <w:p>
       <w:pPr>
+        <w:keepNext/>
         <w:spacing w:before="0" w:after="160"/>
       </w:pPr>
       <w:r>
@@ -774,6 +1411,7 @@
     </w:p>
     <w:p>
       <w:pPr>
+        <w:keepNext/>
         <w:spacing w:before="0" w:after="160"/>
       </w:pPr>
       <w:r>
@@ -801,8 +1439,25 @@
     <w:p>
       <w:pPr>
         <w:pStyle w:val="ListBullet"/>
+        <w:keepLines/>
+        <w:numPr>
+          <w:numId w:val="0"/>
+        </w:numPr>
+        <w:tabs>
+          <w:tab w:pos="360" w:val="left"/>
+        </w:tabs>
         <w:spacing w:before="0" w:after="160"/>
+        <w:ind w:left="360" w:hanging="360"/>
       </w:pPr>
+      <w:r>
+        <w:rPr>
+          <w:rFonts w:ascii="Helvetica Neue" w:hAnsi="Helvetica Neue" w:eastAsia="Helvetica Neue"/>
+          <w:color w:val="0C0C0C"/>
+          <w:sz w:val="24"/>
+        </w:rPr>
+        <w:t>•</w:t>
+        <w:tab/>
+      </w:r>
       <w:r>
         <w:rPr>
           <w:rFonts w:ascii="Helvetica Neue" w:hAnsi="Helvetica Neue" w:eastAsia="Helvetica Neue"/>
@@ -816,8 +1471,25 @@
     <w:p>
       <w:pPr>
         <w:pStyle w:val="ListBullet"/>
+        <w:keepLines/>
+        <w:numPr>
+          <w:numId w:val="0"/>
+        </w:numPr>
+        <w:tabs>
+          <w:tab w:pos="360" w:val="left"/>
+        </w:tabs>
         <w:spacing w:before="0" w:after="160"/>
+        <w:ind w:left="360" w:hanging="360"/>
       </w:pPr>
+      <w:r>
+        <w:rPr>
+          <w:rFonts w:ascii="Helvetica Neue" w:hAnsi="Helvetica Neue" w:eastAsia="Helvetica Neue"/>
+          <w:color w:val="0C0C0C"/>
+          <w:sz w:val="24"/>
+        </w:rPr>
+        <w:t>•</w:t>
+        <w:tab/>
+      </w:r>
       <w:r>
         <w:rPr>
           <w:rFonts w:ascii="Helvetica Neue" w:hAnsi="Helvetica Neue" w:eastAsia="Helvetica Neue"/>
@@ -825,14 +1497,95 @@
           <w:color w:val="0C0C0C"/>
           <w:sz w:val="24"/>
         </w:rPr>
-        <w:t>Architected the company's first Model Context Protocol (MCP) server and directed implementation by a third-party contractor, connecting the classic price management stack and formula evaluation service to agent workflows.</w:t>
+        <w:t>Contributed across the client and server sides of Zilliant's Pricing Plus application, a React application built with Next.js and a Node.js server.</w:t>
       </w:r>
     </w:p>
     <w:p>
       <w:pPr>
         <w:pStyle w:val="ListBullet"/>
+        <w:keepLines/>
+        <w:numPr>
+          <w:numId w:val="0"/>
+        </w:numPr>
+        <w:tabs>
+          <w:tab w:pos="360" w:val="left"/>
+        </w:tabs>
         <w:spacing w:before="0" w:after="160"/>
+        <w:ind w:left="360" w:hanging="360"/>
       </w:pPr>
+      <w:r>
+        <w:rPr>
+          <w:rFonts w:ascii="Helvetica Neue" w:hAnsi="Helvetica Neue" w:eastAsia="Helvetica Neue"/>
+          <w:color w:val="0C0C0C"/>
+          <w:sz w:val="24"/>
+        </w:rPr>
+        <w:t>•</w:t>
+        <w:tab/>
+      </w:r>
+      <w:r>
+        <w:rPr>
+          <w:rFonts w:ascii="Helvetica Neue" w:hAnsi="Helvetica Neue" w:eastAsia="Helvetica Neue"/>
+          <w:i w:val="0"/>
+          <w:color w:val="0C0C0C"/>
+          <w:sz w:val="24"/>
+        </w:rPr>
+        <w:t>Served as technical lead and prototype implementer for an agentic offering deployed on AWS and built with the Strands Agents SDK, enabling users to explore and understand pricing formulas through a conversational interface.</w:t>
+      </w:r>
+    </w:p>
+    <w:p>
+      <w:pPr>
+        <w:pStyle w:val="ListBullet"/>
+        <w:keepLines/>
+        <w:numPr>
+          <w:numId w:val="0"/>
+        </w:numPr>
+        <w:tabs>
+          <w:tab w:pos="360" w:val="left"/>
+        </w:tabs>
+        <w:spacing w:before="0" w:after="160"/>
+        <w:ind w:left="360" w:hanging="360"/>
+      </w:pPr>
+      <w:r>
+        <w:rPr>
+          <w:rFonts w:ascii="Helvetica Neue" w:hAnsi="Helvetica Neue" w:eastAsia="Helvetica Neue"/>
+          <w:color w:val="0C0C0C"/>
+          <w:sz w:val="24"/>
+        </w:rPr>
+        <w:t>•</w:t>
+        <w:tab/>
+      </w:r>
+      <w:r>
+        <w:rPr>
+          <w:rFonts w:ascii="Helvetica Neue" w:hAnsi="Helvetica Neue" w:eastAsia="Helvetica Neue"/>
+          <w:i w:val="0"/>
+          <w:color w:val="0C0C0C"/>
+          <w:sz w:val="24"/>
+        </w:rPr>
+        <w:t>Architected the company's first Model Context Protocol (MCP) server and worked alongside a third-party contractor on its implementation, connecting the classic price management stack and formula evaluation service to agent workflows.</w:t>
+      </w:r>
+    </w:p>
+    <w:p>
+      <w:pPr>
+        <w:pStyle w:val="ListBullet"/>
+        <w:keepLines/>
+        <w:numPr>
+          <w:numId w:val="0"/>
+        </w:numPr>
+        <w:tabs>
+          <w:tab w:pos="360" w:val="left"/>
+        </w:tabs>
+        <w:spacing w:before="0" w:after="160"/>
+        <w:ind w:left="360" w:hanging="360"/>
+      </w:pPr>
+      <w:r>
+        <w:rPr>
+          <w:rFonts w:ascii="Helvetica Neue" w:hAnsi="Helvetica Neue" w:eastAsia="Helvetica Neue"/>
+          <w:color w:val="0C0C0C"/>
+          <w:sz w:val="24"/>
+        </w:rPr>
+        <w:t>•</w:t>
+        <w:tab/>
+      </w:r>
       <w:r>
         <w:rPr>
           <w:rFonts w:ascii="Helvetica Neue" w:hAnsi="Helvetica Neue" w:eastAsia="Helvetica Neue"/>
@@ -846,8 +1599,25 @@
     <w:p>
       <w:pPr>
         <w:pStyle w:val="ListBullet"/>
+        <w:keepLines/>
+        <w:numPr>
+          <w:numId w:val="0"/>
+        </w:numPr>
+        <w:tabs>
+          <w:tab w:pos="360" w:val="left"/>
+        </w:tabs>
         <w:spacing w:before="0" w:after="160"/>
+        <w:ind w:left="360" w:hanging="360"/>
       </w:pPr>
+      <w:r>
+        <w:rPr>
+          <w:rFonts w:ascii="Helvetica Neue" w:hAnsi="Helvetica Neue" w:eastAsia="Helvetica Neue"/>
+          <w:color w:val="0C0C0C"/>
+          <w:sz w:val="24"/>
+        </w:rPr>
+        <w:t>•</w:t>
+        <w:tab/>
+      </w:r>
       <w:r>
         <w:rPr>
           <w:rFonts w:ascii="Helvetica Neue" w:hAnsi="Helvetica Neue" w:eastAsia="Helvetica Neue"/>
@@ -861,8 +1631,25 @@
     <w:p>
       <w:pPr>
         <w:pStyle w:val="ListBullet"/>
+        <w:keepLines/>
+        <w:numPr>
+          <w:numId w:val="0"/>
+        </w:numPr>
+        <w:tabs>
+          <w:tab w:pos="360" w:val="left"/>
+        </w:tabs>
         <w:spacing w:before="0" w:after="160"/>
+        <w:ind w:left="360" w:hanging="360"/>
       </w:pPr>
+      <w:r>
+        <w:rPr>
+          <w:rFonts w:ascii="Helvetica Neue" w:hAnsi="Helvetica Neue" w:eastAsia="Helvetica Neue"/>
+          <w:color w:val="0C0C0C"/>
+          <w:sz w:val="24"/>
+        </w:rPr>
+        <w:t>•</w:t>
+        <w:tab/>
+      </w:r>
       <w:r>
         <w:rPr>
           <w:rFonts w:ascii="Helvetica Neue" w:hAnsi="Helvetica Neue" w:eastAsia="Helvetica Neue"/>
@@ -876,8 +1663,25 @@
     <w:p>
       <w:pPr>
         <w:pStyle w:val="ListBullet"/>
+        <w:keepLines/>
+        <w:numPr>
+          <w:numId w:val="0"/>
+        </w:numPr>
+        <w:tabs>
+          <w:tab w:pos="360" w:val="left"/>
+        </w:tabs>
         <w:spacing w:before="0" w:after="160"/>
+        <w:ind w:left="360" w:hanging="360"/>
       </w:pPr>
+      <w:r>
+        <w:rPr>
+          <w:rFonts w:ascii="Helvetica Neue" w:hAnsi="Helvetica Neue" w:eastAsia="Helvetica Neue"/>
+          <w:color w:val="0C0C0C"/>
+          <w:sz w:val="24"/>
+        </w:rPr>
+        <w:t>•</w:t>
+        <w:tab/>
+      </w:r>
       <w:r>
         <w:rPr>
           <w:rFonts w:ascii="Helvetica Neue" w:hAnsi="Helvetica Neue" w:eastAsia="Helvetica Neue"/>
@@ -891,8 +1695,25 @@
     <w:p>
       <w:pPr>
         <w:pStyle w:val="ListBullet"/>
+        <w:keepLines/>
+        <w:numPr>
+          <w:numId w:val="0"/>
+        </w:numPr>
+        <w:tabs>
+          <w:tab w:pos="360" w:val="left"/>
+        </w:tabs>
         <w:spacing w:before="0" w:after="160"/>
+        <w:ind w:left="360" w:hanging="360"/>
       </w:pPr>
+      <w:r>
+        <w:rPr>
+          <w:rFonts w:ascii="Helvetica Neue" w:hAnsi="Helvetica Neue" w:eastAsia="Helvetica Neue"/>
+          <w:color w:val="0C0C0C"/>
+          <w:sz w:val="24"/>
+        </w:rPr>
+        <w:t>•</w:t>
+        <w:tab/>
+      </w:r>
       <w:r>
         <w:rPr>
           <w:rFonts w:ascii="Helvetica Neue" w:hAnsi="Helvetica Neue" w:eastAsia="Helvetica Neue"/>
@@ -905,6 +1726,7 @@
     </w:p>
     <w:p>
       <w:pPr>
+        <w:keepNext/>
         <w:spacing w:before="0" w:after="160"/>
       </w:pPr>
       <w:r>
@@ -932,8 +1754,25 @@
     <w:p>
       <w:pPr>
         <w:pStyle w:val="ListBullet"/>
+        <w:keepLines/>
+        <w:numPr>
+          <w:numId w:val="0"/>
+        </w:numPr>
+        <w:tabs>
+          <w:tab w:pos="360" w:val="left"/>
+        </w:tabs>
         <w:spacing w:before="0" w:after="160"/>
+        <w:ind w:left="360" w:hanging="360"/>
       </w:pPr>
+      <w:r>
+        <w:rPr>
+          <w:rFonts w:ascii="Helvetica Neue" w:hAnsi="Helvetica Neue" w:eastAsia="Helvetica Neue"/>
+          <w:color w:val="0C0C0C"/>
+          <w:sz w:val="24"/>
+        </w:rPr>
+        <w:t>•</w:t>
+        <w:tab/>
+      </w:r>
       <w:r>
         <w:rPr>
           <w:rFonts w:ascii="Helvetica Neue" w:hAnsi="Helvetica Neue" w:eastAsia="Helvetica Neue"/>
@@ -947,8 +1786,25 @@
     <w:p>
       <w:pPr>
         <w:pStyle w:val="ListBullet"/>
+        <w:keepLines/>
+        <w:numPr>
+          <w:numId w:val="0"/>
+        </w:numPr>
+        <w:tabs>
+          <w:tab w:pos="360" w:val="left"/>
+        </w:tabs>
         <w:spacing w:before="0" w:after="160"/>
+        <w:ind w:left="360" w:hanging="360"/>
       </w:pPr>
+      <w:r>
+        <w:rPr>
+          <w:rFonts w:ascii="Helvetica Neue" w:hAnsi="Helvetica Neue" w:eastAsia="Helvetica Neue"/>
+          <w:color w:val="0C0C0C"/>
+          <w:sz w:val="24"/>
+        </w:rPr>
+        <w:t>•</w:t>
+        <w:tab/>
+      </w:r>
       <w:r>
         <w:rPr>
           <w:rFonts w:ascii="Helvetica Neue" w:hAnsi="Helvetica Neue" w:eastAsia="Helvetica Neue"/>
@@ -962,8 +1818,25 @@
     <w:p>
       <w:pPr>
         <w:pStyle w:val="ListBullet"/>
+        <w:keepLines/>
+        <w:numPr>
+          <w:numId w:val="0"/>
+        </w:numPr>
+        <w:tabs>
+          <w:tab w:pos="360" w:val="left"/>
+        </w:tabs>
         <w:spacing w:before="0" w:after="160"/>
+        <w:ind w:left="360" w:hanging="360"/>
       </w:pPr>
+      <w:r>
+        <w:rPr>
+          <w:rFonts w:ascii="Helvetica Neue" w:hAnsi="Helvetica Neue" w:eastAsia="Helvetica Neue"/>
+          <w:color w:val="0C0C0C"/>
+          <w:sz w:val="24"/>
+        </w:rPr>
+        <w:t>•</w:t>
+        <w:tab/>
+      </w:r>
       <w:r>
         <w:rPr>
           <w:rFonts w:ascii="Helvetica Neue" w:hAnsi="Helvetica Neue" w:eastAsia="Helvetica Neue"/>
@@ -977,8 +1850,25 @@
     <w:p>
       <w:pPr>
         <w:pStyle w:val="ListBullet"/>
+        <w:keepLines/>
+        <w:numPr>
+          <w:numId w:val="0"/>
+        </w:numPr>
+        <w:tabs>
+          <w:tab w:pos="360" w:val="left"/>
+        </w:tabs>
         <w:spacing w:before="0" w:after="160"/>
+        <w:ind w:left="360" w:hanging="360"/>
       </w:pPr>
+      <w:r>
+        <w:rPr>
+          <w:rFonts w:ascii="Helvetica Neue" w:hAnsi="Helvetica Neue" w:eastAsia="Helvetica Neue"/>
+          <w:color w:val="0C0C0C"/>
+          <w:sz w:val="24"/>
+        </w:rPr>
+        <w:t>•</w:t>
+        <w:tab/>
+      </w:r>
       <w:r>
         <w:rPr>
           <w:rFonts w:ascii="Helvetica Neue" w:hAnsi="Helvetica Neue" w:eastAsia="Helvetica Neue"/>
@@ -992,8 +1882,25 @@
     <w:p>
       <w:pPr>
         <w:pStyle w:val="ListBullet"/>
+        <w:keepLines/>
+        <w:numPr>
+          <w:numId w:val="0"/>
+        </w:numPr>
+        <w:tabs>
+          <w:tab w:pos="360" w:val="left"/>
+        </w:tabs>
         <w:spacing w:before="0" w:after="160"/>
+        <w:ind w:left="360" w:hanging="360"/>
       </w:pPr>
+      <w:r>
+        <w:rPr>
+          <w:rFonts w:ascii="Helvetica Neue" w:hAnsi="Helvetica Neue" w:eastAsia="Helvetica Neue"/>
+          <w:color w:val="0C0C0C"/>
+          <w:sz w:val="24"/>
+        </w:rPr>
+        <w:t>•</w:t>
+        <w:tab/>
+      </w:r>
       <w:r>
         <w:rPr>
           <w:rFonts w:ascii="Helvetica Neue" w:hAnsi="Helvetica Neue" w:eastAsia="Helvetica Neue"/>
@@ -1007,8 +1914,25 @@
     <w:p>
       <w:pPr>
         <w:pStyle w:val="ListBullet"/>
+        <w:keepLines/>
+        <w:numPr>
+          <w:numId w:val="0"/>
+        </w:numPr>
+        <w:tabs>
+          <w:tab w:pos="360" w:val="left"/>
+        </w:tabs>
         <w:spacing w:before="0" w:after="160"/>
+        <w:ind w:left="360" w:hanging="360"/>
       </w:pPr>
+      <w:r>
+        <w:rPr>
+          <w:rFonts w:ascii="Helvetica Neue" w:hAnsi="Helvetica Neue" w:eastAsia="Helvetica Neue"/>
+          <w:color w:val="0C0C0C"/>
+          <w:sz w:val="24"/>
+        </w:rPr>
+        <w:t>•</w:t>
+        <w:tab/>
+      </w:r>
       <w:r>
         <w:rPr>
           <w:rFonts w:ascii="Helvetica Neue" w:hAnsi="Helvetica Neue" w:eastAsia="Helvetica Neue"/>
@@ -1021,6 +1945,7 @@
     </w:p>
     <w:p>
       <w:pPr>
+        <w:keepNext/>
         <w:spacing w:before="0" w:after="160"/>
       </w:pPr>
       <w:r>
@@ -1048,8 +1973,25 @@
     <w:p>
       <w:pPr>
         <w:pStyle w:val="ListBullet"/>
+        <w:keepLines/>
+        <w:numPr>
+          <w:numId w:val="0"/>
+        </w:numPr>
+        <w:tabs>
+          <w:tab w:pos="360" w:val="left"/>
+        </w:tabs>
         <w:spacing w:before="0" w:after="160"/>
+        <w:ind w:left="360" w:hanging="360"/>
       </w:pPr>
+      <w:r>
+        <w:rPr>
+          <w:rFonts w:ascii="Helvetica Neue" w:hAnsi="Helvetica Neue" w:eastAsia="Helvetica Neue"/>
+          <w:color w:val="0C0C0C"/>
+          <w:sz w:val="24"/>
+        </w:rPr>
+        <w:t>•</w:t>
+        <w:tab/>
+      </w:r>
       <w:r>
         <w:rPr>
           <w:rFonts w:ascii="Helvetica Neue" w:hAnsi="Helvetica Neue" w:eastAsia="Helvetica Neue"/>
@@ -1063,8 +2005,25 @@
     <w:p>
       <w:pPr>
         <w:pStyle w:val="ListBullet"/>
+        <w:keepLines/>
+        <w:numPr>
+          <w:numId w:val="0"/>
+        </w:numPr>
+        <w:tabs>
+          <w:tab w:pos="360" w:val="left"/>
+        </w:tabs>
         <w:spacing w:before="0" w:after="160"/>
+        <w:ind w:left="360" w:hanging="360"/>
       </w:pPr>
+      <w:r>
+        <w:rPr>
+          <w:rFonts w:ascii="Helvetica Neue" w:hAnsi="Helvetica Neue" w:eastAsia="Helvetica Neue"/>
+          <w:color w:val="0C0C0C"/>
+          <w:sz w:val="24"/>
+        </w:rPr>
+        <w:t>•</w:t>
+        <w:tab/>
+      </w:r>
       <w:r>
         <w:rPr>
           <w:rFonts w:ascii="Helvetica Neue" w:hAnsi="Helvetica Neue" w:eastAsia="Helvetica Neue"/>
@@ -1078,8 +2037,25 @@
     <w:p>
       <w:pPr>
         <w:pStyle w:val="ListBullet"/>
+        <w:keepLines/>
+        <w:numPr>
+          <w:numId w:val="0"/>
+        </w:numPr>
+        <w:tabs>
+          <w:tab w:pos="360" w:val="left"/>
+        </w:tabs>
         <w:spacing w:before="0" w:after="160"/>
+        <w:ind w:left="360" w:hanging="360"/>
       </w:pPr>
+      <w:r>
+        <w:rPr>
+          <w:rFonts w:ascii="Helvetica Neue" w:hAnsi="Helvetica Neue" w:eastAsia="Helvetica Neue"/>
+          <w:color w:val="0C0C0C"/>
+          <w:sz w:val="24"/>
+        </w:rPr>
+        <w:t>•</w:t>
+        <w:tab/>
+      </w:r>
       <w:r>
         <w:rPr>
           <w:rFonts w:ascii="Helvetica Neue" w:hAnsi="Helvetica Neue" w:eastAsia="Helvetica Neue"/>
@@ -1092,6 +2068,7 @@
     </w:p>
     <w:p>
       <w:pPr>
+        <w:keepNext/>
         <w:spacing w:before="0" w:after="160"/>
       </w:pPr>
       <w:r>
@@ -1119,8 +2096,25 @@
     <w:p>
       <w:pPr>
         <w:pStyle w:val="ListBullet"/>
+        <w:keepLines/>
+        <w:numPr>
+          <w:numId w:val="0"/>
+        </w:numPr>
+        <w:tabs>
+          <w:tab w:pos="360" w:val="left"/>
+        </w:tabs>
         <w:spacing w:before="0" w:after="160"/>
+        <w:ind w:left="360" w:hanging="360"/>
       </w:pPr>
+      <w:r>
+        <w:rPr>
+          <w:rFonts w:ascii="Helvetica Neue" w:hAnsi="Helvetica Neue" w:eastAsia="Helvetica Neue"/>
+          <w:color w:val="0C0C0C"/>
+          <w:sz w:val="24"/>
+        </w:rPr>
+        <w:t>•</w:t>
+        <w:tab/>
+      </w:r>
       <w:r>
         <w:rPr>
           <w:rFonts w:ascii="Helvetica Neue" w:hAnsi="Helvetica Neue" w:eastAsia="Helvetica Neue"/>
@@ -1134,8 +2128,25 @@
     <w:p>
       <w:pPr>
         <w:pStyle w:val="ListBullet"/>
+        <w:keepLines/>
+        <w:numPr>
+          <w:numId w:val="0"/>
+        </w:numPr>
+        <w:tabs>
+          <w:tab w:pos="360" w:val="left"/>
+        </w:tabs>
         <w:spacing w:before="0" w:after="160"/>
+        <w:ind w:left="360" w:hanging="360"/>
       </w:pPr>
+      <w:r>
+        <w:rPr>
+          <w:rFonts w:ascii="Helvetica Neue" w:hAnsi="Helvetica Neue" w:eastAsia="Helvetica Neue"/>
+          <w:color w:val="0C0C0C"/>
+          <w:sz w:val="24"/>
+        </w:rPr>
+        <w:t>•</w:t>
+        <w:tab/>
+      </w:r>
       <w:r>
         <w:rPr>
           <w:rFonts w:ascii="Helvetica Neue" w:hAnsi="Helvetica Neue" w:eastAsia="Helvetica Neue"/>
@@ -1149,8 +2160,25 @@
     <w:p>
       <w:pPr>
         <w:pStyle w:val="ListBullet"/>
+        <w:keepLines/>
+        <w:numPr>
+          <w:numId w:val="0"/>
+        </w:numPr>
+        <w:tabs>
+          <w:tab w:pos="360" w:val="left"/>
+        </w:tabs>
         <w:spacing w:before="0" w:after="160"/>
+        <w:ind w:left="360" w:hanging="360"/>
       </w:pPr>
+      <w:r>
+        <w:rPr>
+          <w:rFonts w:ascii="Helvetica Neue" w:hAnsi="Helvetica Neue" w:eastAsia="Helvetica Neue"/>
+          <w:color w:val="0C0C0C"/>
+          <w:sz w:val="24"/>
+        </w:rPr>
+        <w:t>•</w:t>
+        <w:tab/>
+      </w:r>
       <w:r>
         <w:rPr>
           <w:rFonts w:ascii="Helvetica Neue" w:hAnsi="Helvetica Neue" w:eastAsia="Helvetica Neue"/>
@@ -1163,6 +2191,7 @@
     </w:p>
     <w:p>
       <w:pPr>
+        <w:keepNext/>
         <w:spacing w:before="320" w:after="160"/>
       </w:pPr>
       <w:r>
@@ -1177,6 +2206,7 @@
     </w:p>
     <w:p>
       <w:pPr>
+        <w:keepNext/>
         <w:spacing w:before="0" w:after="160"/>
       </w:pPr>
       <w:r>
@@ -1209,8 +2239,25 @@
     <w:p>
       <w:pPr>
         <w:pStyle w:val="ListBullet"/>
+        <w:keepLines/>
+        <w:numPr>
+          <w:numId w:val="0"/>
+        </w:numPr>
+        <w:tabs>
+          <w:tab w:pos="360" w:val="left"/>
+        </w:tabs>
         <w:spacing w:before="0" w:after="160"/>
+        <w:ind w:left="360" w:hanging="360"/>
       </w:pPr>
+      <w:r>
+        <w:rPr>
+          <w:rFonts w:ascii="Helvetica Neue" w:hAnsi="Helvetica Neue" w:eastAsia="Helvetica Neue"/>
+          <w:color w:val="0C0C0C"/>
+          <w:sz w:val="24"/>
+        </w:rPr>
+        <w:t>•</w:t>
+        <w:tab/>
+      </w:r>
       <w:r>
         <w:rPr>
           <w:rFonts w:ascii="Helvetica Neue" w:hAnsi="Helvetica Neue" w:eastAsia="Helvetica Neue"/>
@@ -1218,14 +2265,31 @@
           <w:color w:val="0C0C0C"/>
           <w:sz w:val="24"/>
         </w:rPr>
-        <w:t>Built and publicly deployed a solo GitHub App-backed repository intelligence SaaS, later sunset and open-sourced as an archived reference project after market validation.</w:t>
+        <w:t>Built and publicly deployed a solo GitHub App-backed repository intelligence SaaS, later sunset and open-sourced as an archived reference project after it did not gain customer traction.</w:t>
       </w:r>
     </w:p>
     <w:p>
       <w:pPr>
         <w:pStyle w:val="ListBullet"/>
+        <w:keepLines/>
+        <w:numPr>
+          <w:numId w:val="0"/>
+        </w:numPr>
+        <w:tabs>
+          <w:tab w:pos="360" w:val="left"/>
+        </w:tabs>
         <w:spacing w:before="0" w:after="160"/>
+        <w:ind w:left="360" w:hanging="360"/>
       </w:pPr>
+      <w:r>
+        <w:rPr>
+          <w:rFonts w:ascii="Helvetica Neue" w:hAnsi="Helvetica Neue" w:eastAsia="Helvetica Neue"/>
+          <w:color w:val="0C0C0C"/>
+          <w:sz w:val="24"/>
+        </w:rPr>
+        <w:t>•</w:t>
+        <w:tab/>
+      </w:r>
       <w:r>
         <w:rPr>
           <w:rFonts w:ascii="Helvetica Neue" w:hAnsi="Helvetica Neue" w:eastAsia="Helvetica Neue"/>
@@ -1239,8 +2303,25 @@
     <w:p>
       <w:pPr>
         <w:pStyle w:val="ListBullet"/>
+        <w:keepLines/>
+        <w:numPr>
+          <w:numId w:val="0"/>
+        </w:numPr>
+        <w:tabs>
+          <w:tab w:pos="360" w:val="left"/>
+        </w:tabs>
         <w:spacing w:before="0" w:after="160"/>
+        <w:ind w:left="360" w:hanging="360"/>
       </w:pPr>
+      <w:r>
+        <w:rPr>
+          <w:rFonts w:ascii="Helvetica Neue" w:hAnsi="Helvetica Neue" w:eastAsia="Helvetica Neue"/>
+          <w:color w:val="0C0C0C"/>
+          <w:sz w:val="24"/>
+        </w:rPr>
+        <w:t>•</w:t>
+        <w:tab/>
+      </w:r>
       <w:r>
         <w:rPr>
           <w:rFonts w:ascii="Helvetica Neue" w:hAnsi="Helvetica Neue" w:eastAsia="Helvetica Neue"/>
@@ -1254,8 +2335,25 @@
     <w:p>
       <w:pPr>
         <w:pStyle w:val="ListBullet"/>
+        <w:keepLines/>
+        <w:numPr>
+          <w:numId w:val="0"/>
+        </w:numPr>
+        <w:tabs>
+          <w:tab w:pos="360" w:val="left"/>
+        </w:tabs>
         <w:spacing w:before="0" w:after="160"/>
+        <w:ind w:left="360" w:hanging="360"/>
       </w:pPr>
+      <w:r>
+        <w:rPr>
+          <w:rFonts w:ascii="Helvetica Neue" w:hAnsi="Helvetica Neue" w:eastAsia="Helvetica Neue"/>
+          <w:color w:val="0C0C0C"/>
+          <w:sz w:val="24"/>
+        </w:rPr>
+        <w:t>•</w:t>
+        <w:tab/>
+      </w:r>
       <w:r>
         <w:rPr>
           <w:rFonts w:ascii="Helvetica Neue" w:hAnsi="Helvetica Neue" w:eastAsia="Helvetica Neue"/>
@@ -1269,8 +2367,25 @@
     <w:p>
       <w:pPr>
         <w:pStyle w:val="ListBullet"/>
+        <w:keepLines/>
+        <w:numPr>
+          <w:numId w:val="0"/>
+        </w:numPr>
+        <w:tabs>
+          <w:tab w:pos="360" w:val="left"/>
+        </w:tabs>
         <w:spacing w:before="0" w:after="160"/>
+        <w:ind w:left="360" w:hanging="360"/>
       </w:pPr>
+      <w:r>
+        <w:rPr>
+          <w:rFonts w:ascii="Helvetica Neue" w:hAnsi="Helvetica Neue" w:eastAsia="Helvetica Neue"/>
+          <w:color w:val="0C0C0C"/>
+          <w:sz w:val="24"/>
+        </w:rPr>
+        <w:t>•</w:t>
+        <w:tab/>
+      </w:r>
       <w:r>
         <w:rPr>
           <w:rFonts w:ascii="Helvetica Neue" w:hAnsi="Helvetica Neue" w:eastAsia="Helvetica Neue"/>
@@ -1284,8 +2399,25 @@
     <w:p>
       <w:pPr>
         <w:pStyle w:val="ListBullet"/>
+        <w:keepLines/>
+        <w:numPr>
+          <w:numId w:val="0"/>
+        </w:numPr>
+        <w:tabs>
+          <w:tab w:pos="360" w:val="left"/>
+        </w:tabs>
         <w:spacing w:before="0" w:after="160"/>
+        <w:ind w:left="360" w:hanging="360"/>
       </w:pPr>
+      <w:r>
+        <w:rPr>
+          <w:rFonts w:ascii="Helvetica Neue" w:hAnsi="Helvetica Neue" w:eastAsia="Helvetica Neue"/>
+          <w:color w:val="0C0C0C"/>
+          <w:sz w:val="24"/>
+        </w:rPr>
+        <w:t>•</w:t>
+        <w:tab/>
+      </w:r>
       <w:r>
         <w:rPr>
           <w:rFonts w:ascii="Helvetica Neue" w:hAnsi="Helvetica Neue" w:eastAsia="Helvetica Neue"/>
@@ -1299,8 +2431,25 @@
     <w:p>
       <w:pPr>
         <w:pStyle w:val="ListBullet"/>
+        <w:keepLines/>
+        <w:numPr>
+          <w:numId w:val="0"/>
+        </w:numPr>
+        <w:tabs>
+          <w:tab w:pos="360" w:val="left"/>
+        </w:tabs>
         <w:spacing w:before="0" w:after="160"/>
+        <w:ind w:left="360" w:hanging="360"/>
       </w:pPr>
+      <w:r>
+        <w:rPr>
+          <w:rFonts w:ascii="Helvetica Neue" w:hAnsi="Helvetica Neue" w:eastAsia="Helvetica Neue"/>
+          <w:color w:val="0C0C0C"/>
+          <w:sz w:val="24"/>
+        </w:rPr>
+        <w:t>•</w:t>
+        <w:tab/>
+      </w:r>
       <w:r>
         <w:rPr>
           <w:rFonts w:ascii="Helvetica Neue" w:hAnsi="Helvetica Neue" w:eastAsia="Helvetica Neue"/>
@@ -1314,8 +2463,25 @@
     <w:p>
       <w:pPr>
         <w:pStyle w:val="ListBullet"/>
+        <w:keepLines/>
+        <w:numPr>
+          <w:numId w:val="0"/>
+        </w:numPr>
+        <w:tabs>
+          <w:tab w:pos="360" w:val="left"/>
+        </w:tabs>
         <w:spacing w:before="0" w:after="160"/>
+        <w:ind w:left="360" w:hanging="360"/>
       </w:pPr>
+      <w:r>
+        <w:rPr>
+          <w:rFonts w:ascii="Helvetica Neue" w:hAnsi="Helvetica Neue" w:eastAsia="Helvetica Neue"/>
+          <w:color w:val="0C0C0C"/>
+          <w:sz w:val="24"/>
+        </w:rPr>
+        <w:t>•</w:t>
+        <w:tab/>
+      </w:r>
       <w:r>
         <w:rPr>
           <w:rFonts w:ascii="Helvetica Neue" w:hAnsi="Helvetica Neue" w:eastAsia="Helvetica Neue"/>
@@ -1329,8 +2495,25 @@
     <w:p>
       <w:pPr>
         <w:pStyle w:val="ListBullet"/>
+        <w:keepLines/>
+        <w:numPr>
+          <w:numId w:val="0"/>
+        </w:numPr>
+        <w:tabs>
+          <w:tab w:pos="360" w:val="left"/>
+        </w:tabs>
         <w:spacing w:before="0" w:after="160"/>
+        <w:ind w:left="360" w:hanging="360"/>
       </w:pPr>
+      <w:r>
+        <w:rPr>
+          <w:rFonts w:ascii="Helvetica Neue" w:hAnsi="Helvetica Neue" w:eastAsia="Helvetica Neue"/>
+          <w:color w:val="0C0C0C"/>
+          <w:sz w:val="24"/>
+        </w:rPr>
+        <w:t>•</w:t>
+        <w:tab/>
+      </w:r>
       <w:r>
         <w:rPr>
           <w:rFonts w:ascii="Helvetica Neue" w:hAnsi="Helvetica Neue" w:eastAsia="Helvetica Neue"/>
@@ -1343,6 +2526,7 @@
     </w:p>
     <w:p>
       <w:pPr>
+        <w:keepNext/>
         <w:spacing w:before="0" w:after="160"/>
       </w:pPr>
       <w:r>
@@ -1375,8 +2559,25 @@
     <w:p>
       <w:pPr>
         <w:pStyle w:val="ListBullet"/>
+        <w:keepLines/>
+        <w:numPr>
+          <w:numId w:val="0"/>
+        </w:numPr>
+        <w:tabs>
+          <w:tab w:pos="360" w:val="left"/>
+        </w:tabs>
         <w:spacing w:before="0" w:after="160"/>
+        <w:ind w:left="360" w:hanging="360"/>
       </w:pPr>
+      <w:r>
+        <w:rPr>
+          <w:rFonts w:ascii="Helvetica Neue" w:hAnsi="Helvetica Neue" w:eastAsia="Helvetica Neue"/>
+          <w:color w:val="0C0C0C"/>
+          <w:sz w:val="24"/>
+        </w:rPr>
+        <w:t>•</w:t>
+        <w:tab/>
+      </w:r>
       <w:r>
         <w:rPr>
           <w:rFonts w:ascii="Helvetica Neue" w:hAnsi="Helvetica Neue" w:eastAsia="Helvetica Neue"/>
@@ -1390,8 +2591,25 @@
     <w:p>
       <w:pPr>
         <w:pStyle w:val="ListBullet"/>
+        <w:keepLines/>
+        <w:numPr>
+          <w:numId w:val="0"/>
+        </w:numPr>
+        <w:tabs>
+          <w:tab w:pos="360" w:val="left"/>
+        </w:tabs>
         <w:spacing w:before="0" w:after="160"/>
+        <w:ind w:left="360" w:hanging="360"/>
       </w:pPr>
+      <w:r>
+        <w:rPr>
+          <w:rFonts w:ascii="Helvetica Neue" w:hAnsi="Helvetica Neue" w:eastAsia="Helvetica Neue"/>
+          <w:color w:val="0C0C0C"/>
+          <w:sz w:val="24"/>
+        </w:rPr>
+        <w:t>•</w:t>
+        <w:tab/>
+      </w:r>
       <w:r>
         <w:rPr>
           <w:rFonts w:ascii="Helvetica Neue" w:hAnsi="Helvetica Neue" w:eastAsia="Helvetica Neue"/>
@@ -1405,8 +2623,25 @@
     <w:p>
       <w:pPr>
         <w:pStyle w:val="ListBullet"/>
+        <w:keepLines/>
+        <w:numPr>
+          <w:numId w:val="0"/>
+        </w:numPr>
+        <w:tabs>
+          <w:tab w:pos="360" w:val="left"/>
+        </w:tabs>
         <w:spacing w:before="0" w:after="160"/>
+        <w:ind w:left="360" w:hanging="360"/>
       </w:pPr>
+      <w:r>
+        <w:rPr>
+          <w:rFonts w:ascii="Helvetica Neue" w:hAnsi="Helvetica Neue" w:eastAsia="Helvetica Neue"/>
+          <w:color w:val="0C0C0C"/>
+          <w:sz w:val="24"/>
+        </w:rPr>
+        <w:t>•</w:t>
+        <w:tab/>
+      </w:r>
       <w:r>
         <w:rPr>
           <w:rFonts w:ascii="Helvetica Neue" w:hAnsi="Helvetica Neue" w:eastAsia="Helvetica Neue"/>
@@ -1420,8 +2655,25 @@
     <w:p>
       <w:pPr>
         <w:pStyle w:val="ListBullet"/>
+        <w:keepLines/>
+        <w:numPr>
+          <w:numId w:val="0"/>
+        </w:numPr>
+        <w:tabs>
+          <w:tab w:pos="360" w:val="left"/>
+        </w:tabs>
         <w:spacing w:before="0" w:after="160"/>
+        <w:ind w:left="360" w:hanging="360"/>
       </w:pPr>
+      <w:r>
+        <w:rPr>
+          <w:rFonts w:ascii="Helvetica Neue" w:hAnsi="Helvetica Neue" w:eastAsia="Helvetica Neue"/>
+          <w:color w:val="0C0C0C"/>
+          <w:sz w:val="24"/>
+        </w:rPr>
+        <w:t>•</w:t>
+        <w:tab/>
+      </w:r>
       <w:r>
         <w:rPr>
           <w:rFonts w:ascii="Helvetica Neue" w:hAnsi="Helvetica Neue" w:eastAsia="Helvetica Neue"/>
@@ -1435,8 +2687,25 @@
     <w:p>
       <w:pPr>
         <w:pStyle w:val="ListBullet"/>
+        <w:keepLines/>
+        <w:numPr>
+          <w:numId w:val="0"/>
+        </w:numPr>
+        <w:tabs>
+          <w:tab w:pos="360" w:val="left"/>
+        </w:tabs>
         <w:spacing w:before="0" w:after="160"/>
+        <w:ind w:left="360" w:hanging="360"/>
       </w:pPr>
+      <w:r>
+        <w:rPr>
+          <w:rFonts w:ascii="Helvetica Neue" w:hAnsi="Helvetica Neue" w:eastAsia="Helvetica Neue"/>
+          <w:color w:val="0C0C0C"/>
+          <w:sz w:val="24"/>
+        </w:rPr>
+        <w:t>•</w:t>
+        <w:tab/>
+      </w:r>
       <w:r>
         <w:rPr>
           <w:rFonts w:ascii="Helvetica Neue" w:hAnsi="Helvetica Neue" w:eastAsia="Helvetica Neue"/>
@@ -1450,8 +2719,25 @@
     <w:p>
       <w:pPr>
         <w:pStyle w:val="ListBullet"/>
+        <w:keepLines/>
+        <w:numPr>
+          <w:numId w:val="0"/>
+        </w:numPr>
+        <w:tabs>
+          <w:tab w:pos="360" w:val="left"/>
+        </w:tabs>
         <w:spacing w:before="0" w:after="160"/>
+        <w:ind w:left="360" w:hanging="360"/>
       </w:pPr>
+      <w:r>
+        <w:rPr>
+          <w:rFonts w:ascii="Helvetica Neue" w:hAnsi="Helvetica Neue" w:eastAsia="Helvetica Neue"/>
+          <w:color w:val="0C0C0C"/>
+          <w:sz w:val="24"/>
+        </w:rPr>
+        <w:t>•</w:t>
+        <w:tab/>
+      </w:r>
       <w:r>
         <w:rPr>
           <w:rFonts w:ascii="Helvetica Neue" w:hAnsi="Helvetica Neue" w:eastAsia="Helvetica Neue"/>
@@ -1465,8 +2751,25 @@
     <w:p>
       <w:pPr>
         <w:pStyle w:val="ListBullet"/>
+        <w:keepLines/>
+        <w:numPr>
+          <w:numId w:val="0"/>
+        </w:numPr>
+        <w:tabs>
+          <w:tab w:pos="360" w:val="left"/>
+        </w:tabs>
         <w:spacing w:before="0" w:after="160"/>
+        <w:ind w:left="360" w:hanging="360"/>
       </w:pPr>
+      <w:r>
+        <w:rPr>
+          <w:rFonts w:ascii="Helvetica Neue" w:hAnsi="Helvetica Neue" w:eastAsia="Helvetica Neue"/>
+          <w:color w:val="0C0C0C"/>
+          <w:sz w:val="24"/>
+        </w:rPr>
+        <w:t>•</w:t>
+        <w:tab/>
+      </w:r>
       <w:r>
         <w:rPr>
           <w:rFonts w:ascii="Helvetica Neue" w:hAnsi="Helvetica Neue" w:eastAsia="Helvetica Neue"/>
@@ -1480,8 +2783,25 @@
     <w:p>
       <w:pPr>
         <w:pStyle w:val="ListBullet"/>
+        <w:keepLines/>
+        <w:numPr>
+          <w:numId w:val="0"/>
+        </w:numPr>
+        <w:tabs>
+          <w:tab w:pos="360" w:val="left"/>
+        </w:tabs>
         <w:spacing w:before="0" w:after="160"/>
+        <w:ind w:left="360" w:hanging="360"/>
       </w:pPr>
+      <w:r>
+        <w:rPr>
+          <w:rFonts w:ascii="Helvetica Neue" w:hAnsi="Helvetica Neue" w:eastAsia="Helvetica Neue"/>
+          <w:color w:val="0C0C0C"/>
+          <w:sz w:val="24"/>
+        </w:rPr>
+        <w:t>•</w:t>
+        <w:tab/>
+      </w:r>
       <w:r>
         <w:rPr>
           <w:rFonts w:ascii="Helvetica Neue" w:hAnsi="Helvetica Neue" w:eastAsia="Helvetica Neue"/>
@@ -1495,8 +2815,25 @@
     <w:p>
       <w:pPr>
         <w:pStyle w:val="ListBullet"/>
+        <w:keepLines/>
+        <w:numPr>
+          <w:numId w:val="0"/>
+        </w:numPr>
+        <w:tabs>
+          <w:tab w:pos="360" w:val="left"/>
+        </w:tabs>
         <w:spacing w:before="0" w:after="160"/>
+        <w:ind w:left="360" w:hanging="360"/>
       </w:pPr>
+      <w:r>
+        <w:rPr>
+          <w:rFonts w:ascii="Helvetica Neue" w:hAnsi="Helvetica Neue" w:eastAsia="Helvetica Neue"/>
+          <w:color w:val="0C0C0C"/>
+          <w:sz w:val="24"/>
+        </w:rPr>
+        <w:t>•</w:t>
+        <w:tab/>
+      </w:r>
       <w:r>
         <w:rPr>
           <w:rFonts w:ascii="Helvetica Neue" w:hAnsi="Helvetica Neue" w:eastAsia="Helvetica Neue"/>
@@ -1510,8 +2847,25 @@
     <w:p>
       <w:pPr>
         <w:pStyle w:val="ListBullet"/>
+        <w:keepLines/>
+        <w:numPr>
+          <w:numId w:val="0"/>
+        </w:numPr>
+        <w:tabs>
+          <w:tab w:pos="360" w:val="left"/>
+        </w:tabs>
         <w:spacing w:before="0" w:after="160"/>
+        <w:ind w:left="360" w:hanging="360"/>
       </w:pPr>
+      <w:r>
+        <w:rPr>
+          <w:rFonts w:ascii="Helvetica Neue" w:hAnsi="Helvetica Neue" w:eastAsia="Helvetica Neue"/>
+          <w:color w:val="0C0C0C"/>
+          <w:sz w:val="24"/>
+        </w:rPr>
+        <w:t>•</w:t>
+        <w:tab/>
+      </w:r>
       <w:r>
         <w:rPr>
           <w:rFonts w:ascii="Helvetica Neue" w:hAnsi="Helvetica Neue" w:eastAsia="Helvetica Neue"/>
@@ -1525,8 +2879,25 @@
     <w:p>
       <w:pPr>
         <w:pStyle w:val="ListBullet"/>
+        <w:keepLines/>
+        <w:numPr>
+          <w:numId w:val="0"/>
+        </w:numPr>
+        <w:tabs>
+          <w:tab w:pos="360" w:val="left"/>
+        </w:tabs>
         <w:spacing w:before="0" w:after="160"/>
+        <w:ind w:left="360" w:hanging="360"/>
       </w:pPr>
+      <w:r>
+        <w:rPr>
+          <w:rFonts w:ascii="Helvetica Neue" w:hAnsi="Helvetica Neue" w:eastAsia="Helvetica Neue"/>
+          <w:color w:val="0C0C0C"/>
+          <w:sz w:val="24"/>
+        </w:rPr>
+        <w:t>•</w:t>
+        <w:tab/>
+      </w:r>
       <w:r>
         <w:rPr>
           <w:rFonts w:ascii="Helvetica Neue" w:hAnsi="Helvetica Neue" w:eastAsia="Helvetica Neue"/>
@@ -1540,8 +2911,25 @@
     <w:p>
       <w:pPr>
         <w:pStyle w:val="ListBullet"/>
+        <w:keepLines/>
+        <w:numPr>
+          <w:numId w:val="0"/>
+        </w:numPr>
+        <w:tabs>
+          <w:tab w:pos="360" w:val="left"/>
+        </w:tabs>
         <w:spacing w:before="0" w:after="160"/>
+        <w:ind w:left="360" w:hanging="360"/>
       </w:pPr>
+      <w:r>
+        <w:rPr>
+          <w:rFonts w:ascii="Helvetica Neue" w:hAnsi="Helvetica Neue" w:eastAsia="Helvetica Neue"/>
+          <w:color w:val="0C0C0C"/>
+          <w:sz w:val="24"/>
+        </w:rPr>
+        <w:t>•</w:t>
+        <w:tab/>
+      </w:r>
       <w:r>
         <w:rPr>
           <w:rFonts w:ascii="Helvetica Neue" w:hAnsi="Helvetica Neue" w:eastAsia="Helvetica Neue"/>
@@ -1554,6 +2942,7 @@
     </w:p>
     <w:p>
       <w:pPr>
+        <w:keepNext/>
         <w:spacing w:before="320" w:after="160"/>
       </w:pPr>
       <w:r>
@@ -1569,8 +2958,25 @@
     <w:p>
       <w:pPr>
         <w:pStyle w:val="ListBullet"/>
+        <w:keepLines/>
+        <w:numPr>
+          <w:numId w:val="0"/>
+        </w:numPr>
+        <w:tabs>
+          <w:tab w:pos="360" w:val="left"/>
+        </w:tabs>
         <w:spacing w:before="0" w:after="160"/>
+        <w:ind w:left="360" w:hanging="360"/>
       </w:pPr>
+      <w:r>
+        <w:rPr>
+          <w:rFonts w:ascii="Helvetica Neue" w:hAnsi="Helvetica Neue" w:eastAsia="Helvetica Neue"/>
+          <w:color w:val="0C0C0C"/>
+          <w:sz w:val="24"/>
+        </w:rPr>
+        <w:t>•</w:t>
+        <w:tab/>
+      </w:r>
       <w:r>
         <w:rPr>
           <w:rFonts w:ascii="Helvetica Neue" w:hAnsi="Helvetica Neue" w:eastAsia="Helvetica Neue"/>
@@ -1584,8 +2990,25 @@
     <w:p>
       <w:pPr>
         <w:pStyle w:val="ListBullet"/>
+        <w:keepLines/>
+        <w:numPr>
+          <w:numId w:val="0"/>
+        </w:numPr>
+        <w:tabs>
+          <w:tab w:pos="360" w:val="left"/>
+        </w:tabs>
         <w:spacing w:before="0" w:after="160"/>
+        <w:ind w:left="360" w:hanging="360"/>
       </w:pPr>
+      <w:r>
+        <w:rPr>
+          <w:rFonts w:ascii="Helvetica Neue" w:hAnsi="Helvetica Neue" w:eastAsia="Helvetica Neue"/>
+          <w:color w:val="0C0C0C"/>
+          <w:sz w:val="24"/>
+        </w:rPr>
+        <w:t>•</w:t>
+        <w:tab/>
+      </w:r>
       <w:r>
         <w:rPr>
           <w:rFonts w:ascii="Helvetica Neue" w:hAnsi="Helvetica Neue" w:eastAsia="Helvetica Neue"/>
@@ -1599,8 +3022,25 @@
     <w:p>
       <w:pPr>
         <w:pStyle w:val="ListBullet"/>
+        <w:keepLines/>
+        <w:numPr>
+          <w:numId w:val="0"/>
+        </w:numPr>
+        <w:tabs>
+          <w:tab w:pos="360" w:val="left"/>
+        </w:tabs>
         <w:spacing w:before="0" w:after="160"/>
+        <w:ind w:left="360" w:hanging="360"/>
       </w:pPr>
+      <w:r>
+        <w:rPr>
+          <w:rFonts w:ascii="Helvetica Neue" w:hAnsi="Helvetica Neue" w:eastAsia="Helvetica Neue"/>
+          <w:color w:val="0C0C0C"/>
+          <w:sz w:val="24"/>
+        </w:rPr>
+        <w:t>•</w:t>
+        <w:tab/>
+      </w:r>
       <w:r>
         <w:rPr>
           <w:rFonts w:ascii="Helvetica Neue" w:hAnsi="Helvetica Neue" w:eastAsia="Helvetica Neue"/>
@@ -1614,8 +3054,25 @@
     <w:p>
       <w:pPr>
         <w:pStyle w:val="ListBullet"/>
+        <w:keepLines/>
+        <w:numPr>
+          <w:numId w:val="0"/>
+        </w:numPr>
+        <w:tabs>
+          <w:tab w:pos="360" w:val="left"/>
+        </w:tabs>
         <w:spacing w:before="0" w:after="160"/>
+        <w:ind w:left="360" w:hanging="360"/>
       </w:pPr>
+      <w:r>
+        <w:rPr>
+          <w:rFonts w:ascii="Helvetica Neue" w:hAnsi="Helvetica Neue" w:eastAsia="Helvetica Neue"/>
+          <w:color w:val="0C0C0C"/>
+          <w:sz w:val="24"/>
+        </w:rPr>
+        <w:t>•</w:t>
+        <w:tab/>
+      </w:r>
       <w:r>
         <w:rPr>
           <w:rFonts w:ascii="Helvetica Neue" w:hAnsi="Helvetica Neue" w:eastAsia="Helvetica Neue"/>
@@ -1629,8 +3086,25 @@
     <w:p>
       <w:pPr>
         <w:pStyle w:val="ListBullet"/>
+        <w:keepLines/>
+        <w:numPr>
+          <w:numId w:val="0"/>
+        </w:numPr>
+        <w:tabs>
+          <w:tab w:pos="360" w:val="left"/>
+        </w:tabs>
         <w:spacing w:before="0" w:after="160"/>
+        <w:ind w:left="360" w:hanging="360"/>
       </w:pPr>
+      <w:r>
+        <w:rPr>
+          <w:rFonts w:ascii="Helvetica Neue" w:hAnsi="Helvetica Neue" w:eastAsia="Helvetica Neue"/>
+          <w:color w:val="0C0C0C"/>
+          <w:sz w:val="24"/>
+        </w:rPr>
+        <w:t>•</w:t>
+        <w:tab/>
+      </w:r>
       <w:r>
         <w:rPr>
           <w:rFonts w:ascii="Helvetica Neue" w:hAnsi="Helvetica Neue" w:eastAsia="Helvetica Neue"/>
@@ -1644,8 +3118,25 @@
     <w:p>
       <w:pPr>
         <w:pStyle w:val="ListBullet"/>
+        <w:keepLines/>
+        <w:numPr>
+          <w:numId w:val="0"/>
+        </w:numPr>
+        <w:tabs>
+          <w:tab w:pos="360" w:val="left"/>
+        </w:tabs>
         <w:spacing w:before="0" w:after="160"/>
+        <w:ind w:left="360" w:hanging="360"/>
       </w:pPr>
+      <w:r>
+        <w:rPr>
+          <w:rFonts w:ascii="Helvetica Neue" w:hAnsi="Helvetica Neue" w:eastAsia="Helvetica Neue"/>
+          <w:color w:val="0C0C0C"/>
+          <w:sz w:val="24"/>
+        </w:rPr>
+        <w:t>•</w:t>
+        <w:tab/>
+      </w:r>
       <w:r>
         <w:rPr>
           <w:rFonts w:ascii="Helvetica Neue" w:hAnsi="Helvetica Neue" w:eastAsia="Helvetica Neue"/>
@@ -1659,8 +3150,25 @@
     <w:p>
       <w:pPr>
         <w:pStyle w:val="ListBullet"/>
+        <w:keepLines/>
+        <w:numPr>
+          <w:numId w:val="0"/>
+        </w:numPr>
+        <w:tabs>
+          <w:tab w:pos="360" w:val="left"/>
+        </w:tabs>
         <w:spacing w:before="0" w:after="160"/>
+        <w:ind w:left="360" w:hanging="360"/>
       </w:pPr>
+      <w:r>
+        <w:rPr>
+          <w:rFonts w:ascii="Helvetica Neue" w:hAnsi="Helvetica Neue" w:eastAsia="Helvetica Neue"/>
+          <w:color w:val="0C0C0C"/>
+          <w:sz w:val="24"/>
+        </w:rPr>
+        <w:t>•</w:t>
+        <w:tab/>
+      </w:r>
       <w:r>
         <w:rPr>
           <w:rFonts w:ascii="Helvetica Neue" w:hAnsi="Helvetica Neue" w:eastAsia="Helvetica Neue"/>
@@ -1674,8 +3182,25 @@
     <w:p>
       <w:pPr>
         <w:pStyle w:val="ListBullet"/>
+        <w:keepLines/>
+        <w:numPr>
+          <w:numId w:val="0"/>
+        </w:numPr>
+        <w:tabs>
+          <w:tab w:pos="360" w:val="left"/>
+        </w:tabs>
         <w:spacing w:before="0" w:after="160"/>
+        <w:ind w:left="360" w:hanging="360"/>
       </w:pPr>
+      <w:r>
+        <w:rPr>
+          <w:rFonts w:ascii="Helvetica Neue" w:hAnsi="Helvetica Neue" w:eastAsia="Helvetica Neue"/>
+          <w:color w:val="0C0C0C"/>
+          <w:sz w:val="24"/>
+        </w:rPr>
+        <w:t>•</w:t>
+        <w:tab/>
+      </w:r>
       <w:r>
         <w:rPr>
           <w:rFonts w:ascii="Helvetica Neue" w:hAnsi="Helvetica Neue" w:eastAsia="Helvetica Neue"/>
@@ -1689,8 +3214,25 @@
     <w:p>
       <w:pPr>
         <w:pStyle w:val="ListBullet"/>
+        <w:keepLines/>
+        <w:numPr>
+          <w:numId w:val="0"/>
+        </w:numPr>
+        <w:tabs>
+          <w:tab w:pos="360" w:val="left"/>
+        </w:tabs>
         <w:spacing w:before="0" w:after="160"/>
+        <w:ind w:left="360" w:hanging="360"/>
       </w:pPr>
+      <w:r>
+        <w:rPr>
+          <w:rFonts w:ascii="Helvetica Neue" w:hAnsi="Helvetica Neue" w:eastAsia="Helvetica Neue"/>
+          <w:color w:val="0C0C0C"/>
+          <w:sz w:val="24"/>
+        </w:rPr>
+        <w:t>•</w:t>
+        <w:tab/>
+      </w:r>
       <w:r>
         <w:rPr>
           <w:rFonts w:ascii="Helvetica Neue" w:hAnsi="Helvetica Neue" w:eastAsia="Helvetica Neue"/>
@@ -1704,8 +3246,25 @@
     <w:p>
       <w:pPr>
         <w:pStyle w:val="ListBullet"/>
+        <w:keepLines/>
+        <w:numPr>
+          <w:numId w:val="0"/>
+        </w:numPr>
+        <w:tabs>
+          <w:tab w:pos="360" w:val="left"/>
+        </w:tabs>
         <w:spacing w:before="0" w:after="160"/>
+        <w:ind w:left="360" w:hanging="360"/>
       </w:pPr>
+      <w:r>
+        <w:rPr>
+          <w:rFonts w:ascii="Helvetica Neue" w:hAnsi="Helvetica Neue" w:eastAsia="Helvetica Neue"/>
+          <w:color w:val="0C0C0C"/>
+          <w:sz w:val="24"/>
+        </w:rPr>
+        <w:t>•</w:t>
+        <w:tab/>
+      </w:r>
       <w:r>
         <w:rPr>
           <w:rFonts w:ascii="Helvetica Neue" w:hAnsi="Helvetica Neue" w:eastAsia="Helvetica Neue"/>
@@ -1718,6 +3277,7 @@
     </w:p>
     <w:p>
       <w:pPr>
+        <w:keepNext/>
         <w:spacing w:before="320" w:after="160"/>
       </w:pPr>
       <w:r>
@@ -1733,8 +3293,25 @@
     <w:p>
       <w:pPr>
         <w:pStyle w:val="ListBullet"/>
+        <w:keepLines/>
+        <w:numPr>
+          <w:numId w:val="0"/>
+        </w:numPr>
+        <w:tabs>
+          <w:tab w:pos="360" w:val="left"/>
+        </w:tabs>
         <w:spacing w:before="0" w:after="160"/>
+        <w:ind w:left="360" w:hanging="360"/>
       </w:pPr>
+      <w:r>
+        <w:rPr>
+          <w:rFonts w:ascii="Helvetica Neue" w:hAnsi="Helvetica Neue" w:eastAsia="Helvetica Neue"/>
+          <w:color w:val="0C0C0C"/>
+          <w:sz w:val="24"/>
+        </w:rPr>
+        <w:t>•</w:t>
+        <w:tab/>
+      </w:r>
       <w:r>
         <w:rPr>
           <w:rFonts w:ascii="Helvetica Neue" w:hAnsi="Helvetica Neue" w:eastAsia="Helvetica Neue"/>
@@ -1758,8 +3335,25 @@
     <w:p>
       <w:pPr>
         <w:pStyle w:val="ListBullet"/>
+        <w:keepLines/>
+        <w:numPr>
+          <w:numId w:val="0"/>
+        </w:numPr>
+        <w:tabs>
+          <w:tab w:pos="360" w:val="left"/>
+        </w:tabs>
         <w:spacing w:before="0" w:after="160"/>
+        <w:ind w:left="360" w:hanging="360"/>
       </w:pPr>
+      <w:r>
+        <w:rPr>
+          <w:rFonts w:ascii="Helvetica Neue" w:hAnsi="Helvetica Neue" w:eastAsia="Helvetica Neue"/>
+          <w:color w:val="0C0C0C"/>
+          <w:sz w:val="24"/>
+        </w:rPr>
+        <w:t>•</w:t>
+        <w:tab/>
+      </w:r>
       <w:r>
         <w:rPr>
           <w:rFonts w:ascii="Helvetica Neue" w:hAnsi="Helvetica Neue" w:eastAsia="Helvetica Neue"/>
@@ -1783,8 +3377,25 @@
     <w:p>
       <w:pPr>
         <w:pStyle w:val="ListBullet"/>
+        <w:keepLines/>
+        <w:numPr>
+          <w:numId w:val="0"/>
+        </w:numPr>
+        <w:tabs>
+          <w:tab w:pos="360" w:val="left"/>
+        </w:tabs>
         <w:spacing w:before="0" w:after="160"/>
+        <w:ind w:left="360" w:hanging="360"/>
       </w:pPr>
+      <w:r>
+        <w:rPr>
+          <w:rFonts w:ascii="Helvetica Neue" w:hAnsi="Helvetica Neue" w:eastAsia="Helvetica Neue"/>
+          <w:color w:val="0C0C0C"/>
+          <w:sz w:val="24"/>
+        </w:rPr>
+        <w:t>•</w:t>
+        <w:tab/>
+      </w:r>
       <w:r>
         <w:rPr>
           <w:rFonts w:ascii="Helvetica Neue" w:hAnsi="Helvetica Neue" w:eastAsia="Helvetica Neue"/>
@@ -1808,8 +3419,25 @@
     <w:p>
       <w:pPr>
         <w:pStyle w:val="ListBullet"/>
+        <w:keepLines/>
+        <w:numPr>
+          <w:numId w:val="0"/>
+        </w:numPr>
+        <w:tabs>
+          <w:tab w:pos="360" w:val="left"/>
+        </w:tabs>
         <w:spacing w:before="0" w:after="160"/>
+        <w:ind w:left="360" w:hanging="360"/>
       </w:pPr>
+      <w:r>
+        <w:rPr>
+          <w:rFonts w:ascii="Helvetica Neue" w:hAnsi="Helvetica Neue" w:eastAsia="Helvetica Neue"/>
+          <w:color w:val="0C0C0C"/>
+          <w:sz w:val="24"/>
+        </w:rPr>
+        <w:t>•</w:t>
+        <w:tab/>
+      </w:r>
       <w:r>
         <w:rPr>
           <w:rFonts w:ascii="Helvetica Neue" w:hAnsi="Helvetica Neue" w:eastAsia="Helvetica Neue"/>
@@ -1832,6 +3460,7 @@
     </w:p>
     <w:p>
       <w:pPr>
+        <w:keepNext/>
         <w:spacing w:before="320" w:after="160"/>
       </w:pPr>
       <w:r>
@@ -1847,8 +3476,25 @@
     <w:p>
       <w:pPr>
         <w:pStyle w:val="ListBullet"/>
+        <w:keepLines/>
+        <w:numPr>
+          <w:numId w:val="0"/>
+        </w:numPr>
+        <w:tabs>
+          <w:tab w:pos="360" w:val="left"/>
+        </w:tabs>
         <w:spacing w:before="0" w:after="160"/>
+        <w:ind w:left="360" w:hanging="360"/>
       </w:pPr>
+      <w:r>
+        <w:rPr>
+          <w:rFonts w:ascii="Helvetica Neue" w:hAnsi="Helvetica Neue" w:eastAsia="Helvetica Neue"/>
+          <w:color w:val="0C0C0C"/>
+          <w:sz w:val="24"/>
+        </w:rPr>
+        <w:t>•</w:t>
+        <w:tab/>
+      </w:r>
       <w:r>
         <w:rPr>
           <w:rFonts w:ascii="Helvetica Neue" w:hAnsi="Helvetica Neue" w:eastAsia="Helvetica Neue"/>
@@ -1880,8 +3526,25 @@
     <w:p>
       <w:pPr>
         <w:pStyle w:val="ListBullet"/>
+        <w:keepLines/>
+        <w:numPr>
+          <w:numId w:val="0"/>
+        </w:numPr>
+        <w:tabs>
+          <w:tab w:pos="360" w:val="left"/>
+        </w:tabs>
         <w:spacing w:before="0" w:after="160"/>
+        <w:ind w:left="360" w:hanging="360"/>
       </w:pPr>
+      <w:r>
+        <w:rPr>
+          <w:rFonts w:ascii="Helvetica Neue" w:hAnsi="Helvetica Neue" w:eastAsia="Helvetica Neue"/>
+          <w:color w:val="0C0C0C"/>
+          <w:sz w:val="24"/>
+        </w:rPr>
+        <w:t>•</w:t>
+        <w:tab/>
+      </w:r>
       <w:r>
         <w:rPr>
           <w:rFonts w:ascii="Helvetica Neue" w:hAnsi="Helvetica Neue" w:eastAsia="Helvetica Neue"/>
@@ -1913,8 +3576,25 @@
     <w:p>
       <w:pPr>
         <w:pStyle w:val="ListBullet"/>
+        <w:keepLines/>
+        <w:numPr>
+          <w:numId w:val="0"/>
+        </w:numPr>
+        <w:tabs>
+          <w:tab w:pos="360" w:val="left"/>
+        </w:tabs>
         <w:spacing w:before="0" w:after="160"/>
+        <w:ind w:left="360" w:hanging="360"/>
       </w:pPr>
+      <w:r>
+        <w:rPr>
+          <w:rFonts w:ascii="Helvetica Neue" w:hAnsi="Helvetica Neue" w:eastAsia="Helvetica Neue"/>
+          <w:color w:val="0C0C0C"/>
+          <w:sz w:val="24"/>
+        </w:rPr>
+        <w:t>•</w:t>
+        <w:tab/>
+      </w:r>
       <w:r>
         <w:rPr>
           <w:rFonts w:ascii="Helvetica Neue" w:hAnsi="Helvetica Neue" w:eastAsia="Helvetica Neue"/>
@@ -1945,6 +3625,7 @@
     </w:p>
     <w:p>
       <w:pPr>
+        <w:keepNext/>
         <w:spacing w:before="320" w:after="160"/>
       </w:pPr>
       <w:r>
@@ -1959,6 +3640,7 @@
     </w:p>
     <w:p>
       <w:pPr>
+        <w:keepNext/>
         <w:spacing w:before="0" w:after="160"/>
       </w:pPr>
       <w:r>
@@ -1996,8 +3678,25 @@
     <w:p>
       <w:pPr>
         <w:pStyle w:val="ListBullet"/>
+        <w:keepLines/>
+        <w:numPr>
+          <w:numId w:val="0"/>
+        </w:numPr>
+        <w:tabs>
+          <w:tab w:pos="360" w:val="left"/>
+        </w:tabs>
         <w:spacing w:before="0" w:after="160"/>
+        <w:ind w:left="360" w:hanging="360"/>
       </w:pPr>
+      <w:r>
+        <w:rPr>
+          <w:rFonts w:ascii="Helvetica Neue" w:hAnsi="Helvetica Neue" w:eastAsia="Helvetica Neue"/>
+          <w:color w:val="0C0C0C"/>
+          <w:sz w:val="24"/>
+        </w:rPr>
+        <w:t>•</w:t>
+        <w:tab/>
+      </w:r>
       <w:r>
         <w:rPr>
           <w:rFonts w:ascii="Helvetica Neue" w:hAnsi="Helvetica Neue" w:eastAsia="Helvetica Neue"/>
@@ -2011,8 +3710,25 @@
     <w:p>
       <w:pPr>
         <w:pStyle w:val="ListBullet"/>
+        <w:keepLines/>
+        <w:numPr>
+          <w:numId w:val="0"/>
+        </w:numPr>
+        <w:tabs>
+          <w:tab w:pos="360" w:val="left"/>
+        </w:tabs>
         <w:spacing w:before="0" w:after="160"/>
+        <w:ind w:left="360" w:hanging="360"/>
       </w:pPr>
+      <w:r>
+        <w:rPr>
+          <w:rFonts w:ascii="Helvetica Neue" w:hAnsi="Helvetica Neue" w:eastAsia="Helvetica Neue"/>
+          <w:color w:val="0C0C0C"/>
+          <w:sz w:val="24"/>
+        </w:rPr>
+        <w:t>•</w:t>
+        <w:tab/>
+      </w:r>
       <w:r>
         <w:rPr>
           <w:rFonts w:ascii="Helvetica Neue" w:hAnsi="Helvetica Neue" w:eastAsia="Helvetica Neue"/>
@@ -2026,8 +3742,25 @@
     <w:p>
       <w:pPr>
         <w:pStyle w:val="ListBullet"/>
+        <w:keepLines/>
+        <w:numPr>
+          <w:numId w:val="0"/>
+        </w:numPr>
+        <w:tabs>
+          <w:tab w:pos="360" w:val="left"/>
+        </w:tabs>
         <w:spacing w:before="0" w:after="160"/>
+        <w:ind w:left="360" w:hanging="360"/>
       </w:pPr>
+      <w:r>
+        <w:rPr>
+          <w:rFonts w:ascii="Helvetica Neue" w:hAnsi="Helvetica Neue" w:eastAsia="Helvetica Neue"/>
+          <w:color w:val="0C0C0C"/>
+          <w:sz w:val="24"/>
+        </w:rPr>
+        <w:t>•</w:t>
+        <w:tab/>
+      </w:r>
       <w:r>
         <w:rPr>
           <w:rFonts w:ascii="Helvetica Neue" w:hAnsi="Helvetica Neue" w:eastAsia="Helvetica Neue"/>
@@ -2040,6 +3773,7 @@
     </w:p>
     <w:p>
       <w:pPr>
+        <w:keepNext/>
         <w:spacing w:before="320" w:after="160"/>
       </w:pPr>
       <w:r>
@@ -2121,7 +3855,7 @@
           <w:color w:val="0C0C0C"/>
           <w:sz w:val="24"/>
         </w:rPr>
-        <w:t xml:space="preserve"> Large Language Model (LLM) Applications, Agentic Systems, Model Context Protocol (MCP), RAG, Embeddings, Vector Stores, Semantic Search, Pinecone, Structured Extraction, REST APIs, Django, Celery, HTMX, Pydantic, PydanticAI, OpenAI Agents SDK, Codex, Docker, PostgreSQL, SQLite, AWS Services, AWS QuickSight, Amazon Q, CI/CD, GitHub Actions, Terraform, React, Tailwind CSS, Salesforce Lightning, Lightning Web Components, Visual Studio Code, oclif</w:t>
+        <w:t xml:space="preserve"> Large Language Model (LLM) Applications, Agentic Systems, Model Context Protocol (MCP), RAG, Embeddings, Vector Stores, Semantic Search, Pinecone, Structured Extraction, REST APIs, Django, Celery, HTMX, Pydantic, PydanticAI, OpenAI Agents SDK, Codex, Docker, PostgreSQL, SQLite, AWS Services, AWS QuickSight, Amazon Q, Strands Agents SDK, CI/CD, GitHub Actions, Terraform, React, Next.js, Node.js, Tailwind CSS, Salesforce Lightning, Lightning Web Components, Visual Studio Code, oclif</w:t>
       </w:r>
     </w:p>
     <w:p>

</xml_diff>

<commit_message>
Align resume workflow with recruiter guidance
Make the full resume the canonical source, simplify the full and application variants, harden resume parsing and page checks, add regression tests, and regenerate the published artifacts.
</commit_message>
<xml_diff>
--- a/docs/downloads/bt-franklin-resume-full.docx
+++ b/docs/downloads/bt-franklin-resume-full.docx
@@ -26,17 +26,6 @@
           <w:sz w:val="24"/>
         </w:rPr>
         <w:t>Phoenix, Arizona</w:t>
-      </w:r>
-      <w:r>
-        <w:br/>
-      </w:r>
-      <w:r>
-        <w:rPr>
-          <w:rFonts w:ascii="Helvetica Neue" w:hAnsi="Helvetica Neue" w:eastAsia="Helvetica Neue"/>
-          <w:color w:val="0C0C0C"/>
-          <w:sz w:val="24"/>
-        </w:rPr>
-        <w:t>Applied AI Technical Lead / Software Architect</w:t>
       </w:r>
       <w:r>
         <w:br/>
@@ -117,1266 +106,7 @@
           <w:color w:val="0C0C0C"/>
           <w:sz w:val="24"/>
         </w:rPr>
-        <w:t>Applied AI technical lead and software architect with 20+ years of experience across enterprise software, developer tooling, and product-facing systems.</w:t>
-      </w:r>
-    </w:p>
-    <w:p>
-      <w:pPr>
-        <w:pStyle w:val="ListBullet"/>
-        <w:keepLines/>
-        <w:numPr>
-          <w:numId w:val="0"/>
-        </w:numPr>
-        <w:tabs>
-          <w:tab w:pos="360" w:val="left"/>
-        </w:tabs>
-        <w:spacing w:before="0" w:after="160"/>
-        <w:ind w:left="360" w:hanging="360"/>
-      </w:pPr>
-      <w:r>
-        <w:rPr>
-          <w:rFonts w:ascii="Helvetica Neue" w:hAnsi="Helvetica Neue" w:eastAsia="Helvetica Neue"/>
-          <w:color w:val="0C0C0C"/>
-          <w:sz w:val="24"/>
-        </w:rPr>
-        <w:t>•</w:t>
-        <w:tab/>
-      </w:r>
-      <w:r>
-        <w:rPr>
-          <w:rFonts w:ascii="Helvetica Neue" w:hAnsi="Helvetica Neue" w:eastAsia="Helvetica Neue"/>
-          <w:i w:val="0"/>
-          <w:color w:val="0C0C0C"/>
-          <w:sz w:val="24"/>
-        </w:rPr>
-        <w:t>Focused on generative AI, large language models (LLMs), agentic systems, multimodal AI integrations, and AI product architecture.</w:t>
-      </w:r>
-    </w:p>
-    <w:p>
-      <w:pPr>
-        <w:pStyle w:val="ListBullet"/>
-        <w:keepLines/>
-        <w:numPr>
-          <w:numId w:val="0"/>
-        </w:numPr>
-        <w:tabs>
-          <w:tab w:pos="360" w:val="left"/>
-        </w:tabs>
-        <w:spacing w:before="0" w:after="160"/>
-        <w:ind w:left="360" w:hanging="360"/>
-      </w:pPr>
-      <w:r>
-        <w:rPr>
-          <w:rFonts w:ascii="Helvetica Neue" w:hAnsi="Helvetica Neue" w:eastAsia="Helvetica Neue"/>
-          <w:color w:val="0C0C0C"/>
-          <w:sz w:val="24"/>
-        </w:rPr>
-        <w:t>•</w:t>
-        <w:tab/>
-      </w:r>
-      <w:r>
-        <w:rPr>
-          <w:rFonts w:ascii="Helvetica Neue" w:hAnsi="Helvetica Neue" w:eastAsia="Helvetica Neue"/>
-          <w:i w:val="0"/>
-          <w:color w:val="0C0C0C"/>
-          <w:sz w:val="24"/>
-        </w:rPr>
-        <w:t>Experienced in moving emerging AI capabilities into useful engineering workflows and product experiences.</w:t>
-      </w:r>
-    </w:p>
-    <w:p>
-      <w:pPr>
-        <w:pStyle w:val="ListBullet"/>
-        <w:keepLines/>
-        <w:numPr>
-          <w:numId w:val="0"/>
-        </w:numPr>
-        <w:tabs>
-          <w:tab w:pos="360" w:val="left"/>
-        </w:tabs>
-        <w:spacing w:before="0" w:after="160"/>
-        <w:ind w:left="360" w:hanging="360"/>
-      </w:pPr>
-      <w:r>
-        <w:rPr>
-          <w:rFonts w:ascii="Helvetica Neue" w:hAnsi="Helvetica Neue" w:eastAsia="Helvetica Neue"/>
-          <w:color w:val="0C0C0C"/>
-          <w:sz w:val="24"/>
-        </w:rPr>
-        <w:t>•</w:t>
-        <w:tab/>
-      </w:r>
-      <w:r>
-        <w:rPr>
-          <w:rFonts w:ascii="Helvetica Neue" w:hAnsi="Helvetica Neue" w:eastAsia="Helvetica Neue"/>
-          <w:i w:val="0"/>
-          <w:color w:val="0C0C0C"/>
-          <w:sz w:val="24"/>
-        </w:rPr>
-        <w:t>Combines full-stack engineering depth with product thinking, UX sensibility, technical leadership, and published computational creativity research.</w:t>
-      </w:r>
-    </w:p>
-    <w:p>
-      <w:pPr>
-        <w:keepNext/>
-        <w:spacing w:before="320" w:after="160"/>
-      </w:pPr>
-      <w:r>
-        <w:rPr>
-          <w:rFonts w:ascii="Helvetica Neue" w:hAnsi="Helvetica Neue" w:eastAsia="Helvetica Neue"/>
-          <w:b/>
-          <w:color w:val="0C0C0C"/>
-          <w:sz w:val="24"/>
-        </w:rPr>
-        <w:t>Core Expertise</w:t>
-      </w:r>
-    </w:p>
-    <w:p>
-      <w:pPr>
-        <w:pStyle w:val="ListBullet"/>
-        <w:keepLines/>
-        <w:numPr>
-          <w:numId w:val="0"/>
-        </w:numPr>
-        <w:tabs>
-          <w:tab w:pos="360" w:val="left"/>
-        </w:tabs>
-        <w:spacing w:before="0" w:after="160"/>
-        <w:ind w:left="360" w:hanging="360"/>
-      </w:pPr>
-      <w:r>
-        <w:rPr>
-          <w:rFonts w:ascii="Helvetica Neue" w:hAnsi="Helvetica Neue" w:eastAsia="Helvetica Neue"/>
-          <w:color w:val="0C0C0C"/>
-          <w:sz w:val="24"/>
-        </w:rPr>
-        <w:t>•</w:t>
-        <w:tab/>
-      </w:r>
-      <w:r>
-        <w:rPr>
-          <w:rFonts w:ascii="Helvetica Neue" w:hAnsi="Helvetica Neue" w:eastAsia="Helvetica Neue"/>
-          <w:i w:val="0"/>
-          <w:color w:val="0C0C0C"/>
-          <w:sz w:val="24"/>
-        </w:rPr>
-        <w:t>Applied AI and Large Language Model (LLM) Systems</w:t>
-      </w:r>
-    </w:p>
-    <w:p>
-      <w:pPr>
-        <w:pStyle w:val="ListBullet"/>
-        <w:keepLines/>
-        <w:numPr>
-          <w:numId w:val="0"/>
-        </w:numPr>
-        <w:tabs>
-          <w:tab w:pos="360" w:val="left"/>
-        </w:tabs>
-        <w:spacing w:before="0" w:after="160"/>
-        <w:ind w:left="360" w:hanging="360"/>
-      </w:pPr>
-      <w:r>
-        <w:rPr>
-          <w:rFonts w:ascii="Helvetica Neue" w:hAnsi="Helvetica Neue" w:eastAsia="Helvetica Neue"/>
-          <w:color w:val="0C0C0C"/>
-          <w:sz w:val="24"/>
-        </w:rPr>
-        <w:t>•</w:t>
-        <w:tab/>
-      </w:r>
-      <w:r>
-        <w:rPr>
-          <w:rFonts w:ascii="Helvetica Neue" w:hAnsi="Helvetica Neue" w:eastAsia="Helvetica Neue"/>
-          <w:i w:val="0"/>
-          <w:color w:val="0C0C0C"/>
-          <w:sz w:val="24"/>
-        </w:rPr>
-        <w:t>Agentic Workflow Design and Evaluation</w:t>
-      </w:r>
-    </w:p>
-    <w:p>
-      <w:pPr>
-        <w:pStyle w:val="ListBullet"/>
-        <w:keepLines/>
-        <w:numPr>
-          <w:numId w:val="0"/>
-        </w:numPr>
-        <w:tabs>
-          <w:tab w:pos="360" w:val="left"/>
-        </w:tabs>
-        <w:spacing w:before="0" w:after="160"/>
-        <w:ind w:left="360" w:hanging="360"/>
-      </w:pPr>
-      <w:r>
-        <w:rPr>
-          <w:rFonts w:ascii="Helvetica Neue" w:hAnsi="Helvetica Neue" w:eastAsia="Helvetica Neue"/>
-          <w:color w:val="0C0C0C"/>
-          <w:sz w:val="24"/>
-        </w:rPr>
-        <w:t>•</w:t>
-        <w:tab/>
-      </w:r>
-      <w:r>
-        <w:rPr>
-          <w:rFonts w:ascii="Helvetica Neue" w:hAnsi="Helvetica Neue" w:eastAsia="Helvetica Neue"/>
-          <w:i w:val="0"/>
-          <w:color w:val="0C0C0C"/>
-          <w:sz w:val="24"/>
-        </w:rPr>
-        <w:t>Model Context Protocol (MCP) Server Architecture</w:t>
-      </w:r>
-    </w:p>
-    <w:p>
-      <w:pPr>
-        <w:pStyle w:val="ListBullet"/>
-        <w:keepLines/>
-        <w:numPr>
-          <w:numId w:val="0"/>
-        </w:numPr>
-        <w:tabs>
-          <w:tab w:pos="360" w:val="left"/>
-        </w:tabs>
-        <w:spacing w:before="0" w:after="160"/>
-        <w:ind w:left="360" w:hanging="360"/>
-      </w:pPr>
-      <w:r>
-        <w:rPr>
-          <w:rFonts w:ascii="Helvetica Neue" w:hAnsi="Helvetica Neue" w:eastAsia="Helvetica Neue"/>
-          <w:color w:val="0C0C0C"/>
-          <w:sz w:val="24"/>
-        </w:rPr>
-        <w:t>•</w:t>
-        <w:tab/>
-      </w:r>
-      <w:r>
-        <w:rPr>
-          <w:rFonts w:ascii="Helvetica Neue" w:hAnsi="Helvetica Neue" w:eastAsia="Helvetica Neue"/>
-          <w:i w:val="0"/>
-          <w:color w:val="0C0C0C"/>
-          <w:sz w:val="24"/>
-        </w:rPr>
-        <w:t>Retrieval-Augmented Generation (RAG), Embeddings, and Semantic Matching</w:t>
-      </w:r>
-    </w:p>
-    <w:p>
-      <w:pPr>
-        <w:pStyle w:val="ListBullet"/>
-        <w:keepLines/>
-        <w:numPr>
-          <w:numId w:val="0"/>
-        </w:numPr>
-        <w:tabs>
-          <w:tab w:pos="360" w:val="left"/>
-        </w:tabs>
-        <w:spacing w:before="0" w:after="160"/>
-        <w:ind w:left="360" w:hanging="360"/>
-      </w:pPr>
-      <w:r>
-        <w:rPr>
-          <w:rFonts w:ascii="Helvetica Neue" w:hAnsi="Helvetica Neue" w:eastAsia="Helvetica Neue"/>
-          <w:color w:val="0C0C0C"/>
-          <w:sz w:val="24"/>
-        </w:rPr>
-        <w:t>•</w:t>
-        <w:tab/>
-      </w:r>
-      <w:r>
-        <w:rPr>
-          <w:rFonts w:ascii="Helvetica Neue" w:hAnsi="Helvetica Neue" w:eastAsia="Helvetica Neue"/>
-          <w:i w:val="0"/>
-          <w:color w:val="0C0C0C"/>
-          <w:sz w:val="24"/>
-        </w:rPr>
-        <w:t>Multimodal AI API Integration</w:t>
-      </w:r>
-    </w:p>
-    <w:p>
-      <w:pPr>
-        <w:pStyle w:val="ListBullet"/>
-        <w:keepLines/>
-        <w:numPr>
-          <w:numId w:val="0"/>
-        </w:numPr>
-        <w:tabs>
-          <w:tab w:pos="360" w:val="left"/>
-        </w:tabs>
-        <w:spacing w:before="0" w:after="160"/>
-        <w:ind w:left="360" w:hanging="360"/>
-      </w:pPr>
-      <w:r>
-        <w:rPr>
-          <w:rFonts w:ascii="Helvetica Neue" w:hAnsi="Helvetica Neue" w:eastAsia="Helvetica Neue"/>
-          <w:color w:val="0C0C0C"/>
-          <w:sz w:val="24"/>
-        </w:rPr>
-        <w:t>•</w:t>
-        <w:tab/>
-      </w:r>
-      <w:r>
-        <w:rPr>
-          <w:rFonts w:ascii="Helvetica Neue" w:hAnsi="Helvetica Neue" w:eastAsia="Helvetica Neue"/>
-          <w:i w:val="0"/>
-          <w:color w:val="0C0C0C"/>
-          <w:sz w:val="24"/>
-        </w:rPr>
-        <w:t>AI Product Architecture</w:t>
-      </w:r>
-    </w:p>
-    <w:p>
-      <w:pPr>
-        <w:pStyle w:val="ListBullet"/>
-        <w:keepLines/>
-        <w:numPr>
-          <w:numId w:val="0"/>
-        </w:numPr>
-        <w:tabs>
-          <w:tab w:pos="360" w:val="left"/>
-        </w:tabs>
-        <w:spacing w:before="0" w:after="160"/>
-        <w:ind w:left="360" w:hanging="360"/>
-      </w:pPr>
-      <w:r>
-        <w:rPr>
-          <w:rFonts w:ascii="Helvetica Neue" w:hAnsi="Helvetica Neue" w:eastAsia="Helvetica Neue"/>
-          <w:color w:val="0C0C0C"/>
-          <w:sz w:val="24"/>
-        </w:rPr>
-        <w:t>•</w:t>
-        <w:tab/>
-      </w:r>
-      <w:r>
-        <w:rPr>
-          <w:rFonts w:ascii="Helvetica Neue" w:hAnsi="Helvetica Neue" w:eastAsia="Helvetica Neue"/>
-          <w:i w:val="0"/>
-          <w:color w:val="0C0C0C"/>
-          <w:sz w:val="24"/>
-        </w:rPr>
-        <w:t>Developer Experience and Platform Tooling</w:t>
-      </w:r>
-    </w:p>
-    <w:p>
-      <w:pPr>
-        <w:pStyle w:val="ListBullet"/>
-        <w:keepLines/>
-        <w:numPr>
-          <w:numId w:val="0"/>
-        </w:numPr>
-        <w:tabs>
-          <w:tab w:pos="360" w:val="left"/>
-        </w:tabs>
-        <w:spacing w:before="0" w:after="160"/>
-        <w:ind w:left="360" w:hanging="360"/>
-      </w:pPr>
-      <w:r>
-        <w:rPr>
-          <w:rFonts w:ascii="Helvetica Neue" w:hAnsi="Helvetica Neue" w:eastAsia="Helvetica Neue"/>
-          <w:color w:val="0C0C0C"/>
-          <w:sz w:val="24"/>
-        </w:rPr>
-        <w:t>•</w:t>
-        <w:tab/>
-      </w:r>
-      <w:r>
-        <w:rPr>
-          <w:rFonts w:ascii="Helvetica Neue" w:hAnsi="Helvetica Neue" w:eastAsia="Helvetica Neue"/>
-          <w:i w:val="0"/>
-          <w:color w:val="0C0C0C"/>
-          <w:sz w:val="24"/>
-        </w:rPr>
-        <w:t>Full-Stack Product Engineering with React, Next.js, Node.js, and Python</w:t>
-      </w:r>
-    </w:p>
-    <w:p>
-      <w:pPr>
-        <w:pStyle w:val="ListBullet"/>
-        <w:keepLines/>
-        <w:numPr>
-          <w:numId w:val="0"/>
-        </w:numPr>
-        <w:tabs>
-          <w:tab w:pos="360" w:val="left"/>
-        </w:tabs>
-        <w:spacing w:before="0" w:after="160"/>
-        <w:ind w:left="360" w:hanging="360"/>
-      </w:pPr>
-      <w:r>
-        <w:rPr>
-          <w:rFonts w:ascii="Helvetica Neue" w:hAnsi="Helvetica Neue" w:eastAsia="Helvetica Neue"/>
-          <w:color w:val="0C0C0C"/>
-          <w:sz w:val="24"/>
-        </w:rPr>
-        <w:t>•</w:t>
-        <w:tab/>
-      </w:r>
-      <w:r>
-        <w:rPr>
-          <w:rFonts w:ascii="Helvetica Neue" w:hAnsi="Helvetica Neue" w:eastAsia="Helvetica Neue"/>
-          <w:i w:val="0"/>
-          <w:color w:val="0C0C0C"/>
-          <w:sz w:val="24"/>
-        </w:rPr>
-        <w:t>Technical Leadership</w:t>
-      </w:r>
-    </w:p>
-    <w:p>
-      <w:pPr>
-        <w:keepNext/>
-        <w:spacing w:before="320" w:after="160"/>
-      </w:pPr>
-      <w:r>
-        <w:rPr>
-          <w:rFonts w:ascii="Helvetica Neue" w:hAnsi="Helvetica Neue" w:eastAsia="Helvetica Neue"/>
-          <w:b/>
-          <w:color w:val="0C0C0C"/>
-          <w:sz w:val="32"/>
-        </w:rPr>
-        <w:t>AI Platform Experience</w:t>
-      </w:r>
-    </w:p>
-    <w:p>
-      <w:pPr>
-        <w:pStyle w:val="ListBullet"/>
-        <w:keepLines/>
-        <w:numPr>
-          <w:numId w:val="0"/>
-        </w:numPr>
-        <w:tabs>
-          <w:tab w:pos="360" w:val="left"/>
-        </w:tabs>
-        <w:spacing w:before="0" w:after="160"/>
-        <w:ind w:left="360" w:hanging="360"/>
-      </w:pPr>
-      <w:r>
-        <w:rPr>
-          <w:rFonts w:ascii="Helvetica Neue" w:hAnsi="Helvetica Neue" w:eastAsia="Helvetica Neue"/>
-          <w:color w:val="0C0C0C"/>
-          <w:sz w:val="24"/>
-        </w:rPr>
-        <w:t>•</w:t>
-        <w:tab/>
-      </w:r>
-      <w:r>
-        <w:rPr>
-          <w:rFonts w:ascii="Helvetica Neue" w:hAnsi="Helvetica Neue" w:eastAsia="Helvetica Neue"/>
-          <w:i w:val="0"/>
-          <w:color w:val="0C0C0C"/>
-          <w:sz w:val="24"/>
-        </w:rPr>
-        <w:t>Built with OpenAI GPT models from GPT-3 through current models, OpenAI image generation models, OpenAI embedding models, OpenAI speech-to-text models, and OpenAI interactive voice models across professional and serious side projects.</w:t>
-      </w:r>
-    </w:p>
-    <w:p>
-      <w:pPr>
-        <w:pStyle w:val="ListBullet"/>
-        <w:keepLines/>
-        <w:numPr>
-          <w:numId w:val="0"/>
-        </w:numPr>
-        <w:tabs>
-          <w:tab w:pos="360" w:val="left"/>
-        </w:tabs>
-        <w:spacing w:before="0" w:after="160"/>
-        <w:ind w:left="360" w:hanging="360"/>
-      </w:pPr>
-      <w:r>
-        <w:rPr>
-          <w:rFonts w:ascii="Helvetica Neue" w:hAnsi="Helvetica Neue" w:eastAsia="Helvetica Neue"/>
-          <w:color w:val="0C0C0C"/>
-          <w:sz w:val="24"/>
-        </w:rPr>
-        <w:t>•</w:t>
-        <w:tab/>
-      </w:r>
-      <w:r>
-        <w:rPr>
-          <w:rFonts w:ascii="Helvetica Neue" w:hAnsi="Helvetica Neue" w:eastAsia="Helvetica Neue"/>
-          <w:i w:val="0"/>
-          <w:color w:val="0C0C0C"/>
-          <w:sz w:val="24"/>
-        </w:rPr>
-        <w:t>Built with Anthropic Claude models, ElevenLabs speech generation models, and production-oriented LLM API workflows.</w:t>
-      </w:r>
-    </w:p>
-    <w:p>
-      <w:pPr>
-        <w:pStyle w:val="ListBullet"/>
-        <w:keepLines/>
-        <w:numPr>
-          <w:numId w:val="0"/>
-        </w:numPr>
-        <w:tabs>
-          <w:tab w:pos="360" w:val="left"/>
-        </w:tabs>
-        <w:spacing w:before="0" w:after="160"/>
-        <w:ind w:left="360" w:hanging="360"/>
-      </w:pPr>
-      <w:r>
-        <w:rPr>
-          <w:rFonts w:ascii="Helvetica Neue" w:hAnsi="Helvetica Neue" w:eastAsia="Helvetica Neue"/>
-          <w:color w:val="0C0C0C"/>
-          <w:sz w:val="24"/>
-        </w:rPr>
-        <w:t>•</w:t>
-        <w:tab/>
-      </w:r>
-      <w:r>
-        <w:rPr>
-          <w:rFonts w:ascii="Helvetica Neue" w:hAnsi="Helvetica Neue" w:eastAsia="Helvetica Neue"/>
-          <w:i w:val="0"/>
-          <w:color w:val="0C0C0C"/>
-          <w:sz w:val="24"/>
-        </w:rPr>
-        <w:t>Designed agentic workflows involving tool use, planning loops, multi-agent systems, background processing agents, self-correcting guardrail loops, and custom headless processing loops.</w:t>
-      </w:r>
-    </w:p>
-    <w:p>
-      <w:pPr>
-        <w:pStyle w:val="ListBullet"/>
-        <w:keepLines/>
-        <w:numPr>
-          <w:numId w:val="0"/>
-        </w:numPr>
-        <w:tabs>
-          <w:tab w:pos="360" w:val="left"/>
-        </w:tabs>
-        <w:spacing w:before="0" w:after="160"/>
-        <w:ind w:left="360" w:hanging="360"/>
-      </w:pPr>
-      <w:r>
-        <w:rPr>
-          <w:rFonts w:ascii="Helvetica Neue" w:hAnsi="Helvetica Neue" w:eastAsia="Helvetica Neue"/>
-          <w:color w:val="0C0C0C"/>
-          <w:sz w:val="24"/>
-        </w:rPr>
-        <w:t>•</w:t>
-        <w:tab/>
-      </w:r>
-      <w:r>
-        <w:rPr>
-          <w:rFonts w:ascii="Helvetica Neue" w:hAnsi="Helvetica Neue" w:eastAsia="Helvetica Neue"/>
-          <w:i w:val="0"/>
-          <w:color w:val="0C0C0C"/>
-          <w:sz w:val="24"/>
-        </w:rPr>
-        <w:t>Built RAG, embedding, vector-search, semantic matching, structured extraction, and document-processing systems using custom pipelines and vector stores.</w:t>
-      </w:r>
-    </w:p>
-    <w:p>
-      <w:pPr>
-        <w:pStyle w:val="ListBullet"/>
-        <w:keepLines/>
-        <w:numPr>
-          <w:numId w:val="0"/>
-        </w:numPr>
-        <w:tabs>
-          <w:tab w:pos="360" w:val="left"/>
-        </w:tabs>
-        <w:spacing w:before="0" w:after="160"/>
-        <w:ind w:left="360" w:hanging="360"/>
-      </w:pPr>
-      <w:r>
-        <w:rPr>
-          <w:rFonts w:ascii="Helvetica Neue" w:hAnsi="Helvetica Neue" w:eastAsia="Helvetica Neue"/>
-          <w:color w:val="0C0C0C"/>
-          <w:sz w:val="24"/>
-        </w:rPr>
-        <w:t>•</w:t>
-        <w:tab/>
-      </w:r>
-      <w:r>
-        <w:rPr>
-          <w:rFonts w:ascii="Helvetica Neue" w:hAnsi="Helvetica Neue" w:eastAsia="Helvetica Neue"/>
-          <w:i w:val="0"/>
-          <w:color w:val="0C0C0C"/>
-          <w:sz w:val="24"/>
-        </w:rPr>
-        <w:t>Has practical AI quality and evaluation experience through rubric grading, human review, tracing, observability, guardrail-style parsing checks, skill/workflow evaluation, automation-oriented review loops, and practical output quality checks; interested in moving deeper into formal LLM and agent evaluation without claiming deep platform-specific eval-tool specialization.</w:t>
-      </w:r>
-    </w:p>
-    <w:p>
-      <w:pPr>
-        <w:keepNext/>
-        <w:spacing w:before="320" w:after="160"/>
-      </w:pPr>
-      <w:r>
-        <w:rPr>
-          <w:rFonts w:ascii="Helvetica Neue" w:hAnsi="Helvetica Neue" w:eastAsia="Helvetica Neue"/>
-          <w:b/>
-          <w:color w:val="0C0C0C"/>
-          <w:sz w:val="32"/>
-        </w:rPr>
-        <w:t>Domain Experience</w:t>
-      </w:r>
-    </w:p>
-    <w:p>
-      <w:pPr>
-        <w:pStyle w:val="ListBullet"/>
-        <w:keepLines/>
-        <w:numPr>
-          <w:numId w:val="0"/>
-        </w:numPr>
-        <w:tabs>
-          <w:tab w:pos="360" w:val="left"/>
-        </w:tabs>
-        <w:spacing w:before="0" w:after="160"/>
-        <w:ind w:left="360" w:hanging="360"/>
-      </w:pPr>
-      <w:r>
-        <w:rPr>
-          <w:rFonts w:ascii="Helvetica Neue" w:hAnsi="Helvetica Neue" w:eastAsia="Helvetica Neue"/>
-          <w:color w:val="0C0C0C"/>
-          <w:sz w:val="24"/>
-        </w:rPr>
-        <w:t>•</w:t>
-        <w:tab/>
-      </w:r>
-      <w:r>
-        <w:rPr>
-          <w:rFonts w:ascii="Helvetica Neue" w:hAnsi="Helvetica Neue" w:eastAsia="Helvetica Neue"/>
-          <w:i w:val="0"/>
-          <w:color w:val="0C0C0C"/>
-          <w:sz w:val="24"/>
-        </w:rPr>
-        <w:t>Deepest domain experience is in pricing and revenue optimization, including pricing workflows, price management systems, formula-driven price calculations, analytics, and customer-facing explanation of pricing outputs.</w:t>
-      </w:r>
-    </w:p>
-    <w:p>
-      <w:pPr>
-        <w:pStyle w:val="ListBullet"/>
-        <w:keepLines/>
-        <w:numPr>
-          <w:numId w:val="0"/>
-        </w:numPr>
-        <w:tabs>
-          <w:tab w:pos="360" w:val="left"/>
-        </w:tabs>
-        <w:spacing w:before="0" w:after="160"/>
-        <w:ind w:left="360" w:hanging="360"/>
-      </w:pPr>
-      <w:r>
-        <w:rPr>
-          <w:rFonts w:ascii="Helvetica Neue" w:hAnsi="Helvetica Neue" w:eastAsia="Helvetica Neue"/>
-          <w:color w:val="0C0C0C"/>
-          <w:sz w:val="24"/>
-        </w:rPr>
-        <w:t>•</w:t>
-        <w:tab/>
-      </w:r>
-      <w:r>
-        <w:rPr>
-          <w:rFonts w:ascii="Helvetica Neue" w:hAnsi="Helvetica Neue" w:eastAsia="Helvetica Neue"/>
-          <w:i w:val="0"/>
-          <w:color w:val="0C0C0C"/>
-          <w:sz w:val="24"/>
-        </w:rPr>
-        <w:t>Historical domain experience in Salesforce and GTM systems, including Salesforce UI/UX, Lightning Web Components, enterprise implementation strategy, and configuration migration workflows; this is supporting context for enterprise/platform architecture, not a desired future specialization.</w:t>
-      </w:r>
-    </w:p>
-    <w:p>
-      <w:pPr>
-        <w:pStyle w:val="ListBullet"/>
-        <w:keepLines/>
-        <w:numPr>
-          <w:numId w:val="0"/>
-        </w:numPr>
-        <w:tabs>
-          <w:tab w:pos="360" w:val="left"/>
-        </w:tabs>
-        <w:spacing w:before="0" w:after="160"/>
-        <w:ind w:left="360" w:hanging="360"/>
-      </w:pPr>
-      <w:r>
-        <w:rPr>
-          <w:rFonts w:ascii="Helvetica Neue" w:hAnsi="Helvetica Neue" w:eastAsia="Helvetica Neue"/>
-          <w:color w:val="0C0C0C"/>
-          <w:sz w:val="24"/>
-        </w:rPr>
-        <w:t>•</w:t>
-        <w:tab/>
-      </w:r>
-      <w:r>
-        <w:rPr>
-          <w:rFonts w:ascii="Helvetica Neue" w:hAnsi="Helvetica Neue" w:eastAsia="Helvetica Neue"/>
-          <w:i w:val="0"/>
-          <w:color w:val="0C0C0C"/>
-          <w:sz w:val="24"/>
-        </w:rPr>
-        <w:t>Strong working knowledge of GitHub and repository intelligence, including repository architecture analysis, contributor expertise modeling, development-history analysis, agent-legible repositories, and GitHub-integrated AI product workflows.</w:t>
-      </w:r>
-    </w:p>
-    <w:p>
-      <w:pPr>
-        <w:pStyle w:val="ListBullet"/>
-        <w:keepLines/>
-        <w:numPr>
-          <w:numId w:val="0"/>
-        </w:numPr>
-        <w:tabs>
-          <w:tab w:pos="360" w:val="left"/>
-        </w:tabs>
-        <w:spacing w:before="0" w:after="160"/>
-        <w:ind w:left="360" w:hanging="360"/>
-      </w:pPr>
-      <w:r>
-        <w:rPr>
-          <w:rFonts w:ascii="Helvetica Neue" w:hAnsi="Helvetica Neue" w:eastAsia="Helvetica Neue"/>
-          <w:color w:val="0C0C0C"/>
-          <w:sz w:val="24"/>
-        </w:rPr>
-        <w:t>•</w:t>
-        <w:tab/>
-      </w:r>
-      <w:r>
-        <w:rPr>
-          <w:rFonts w:ascii="Helvetica Neue" w:hAnsi="Helvetica Neue" w:eastAsia="Helvetica Neue"/>
-          <w:i w:val="0"/>
-          <w:color w:val="0C0C0C"/>
-          <w:sz w:val="24"/>
-        </w:rPr>
-        <w:t>Practical recruiting-domain experience from building Hiredar, including resume ingestion, candidate profile extraction, explainable candidate matching, recruiter-facing workflows, and job-to-candidate semantic comparison.</w:t>
-      </w:r>
-    </w:p>
-    <w:p>
-      <w:pPr>
-        <w:pStyle w:val="ListBullet"/>
-        <w:keepLines/>
-        <w:numPr>
-          <w:numId w:val="0"/>
-        </w:numPr>
-        <w:tabs>
-          <w:tab w:pos="360" w:val="left"/>
-        </w:tabs>
-        <w:spacing w:before="0" w:after="160"/>
-        <w:ind w:left="360" w:hanging="360"/>
-      </w:pPr>
-      <w:r>
-        <w:rPr>
-          <w:rFonts w:ascii="Helvetica Neue" w:hAnsi="Helvetica Neue" w:eastAsia="Helvetica Neue"/>
-          <w:color w:val="0C0C0C"/>
-          <w:sz w:val="24"/>
-        </w:rPr>
-        <w:t>•</w:t>
-        <w:tab/>
-      </w:r>
-      <w:r>
-        <w:rPr>
-          <w:rFonts w:ascii="Helvetica Neue" w:hAnsi="Helvetica Neue" w:eastAsia="Helvetica Neue"/>
-          <w:i w:val="0"/>
-          <w:color w:val="0C0C0C"/>
-          <w:sz w:val="24"/>
-        </w:rPr>
-        <w:t>Historical medical imaging software experience from earlier career work, with the understanding that the domain knowledge is older and less current than the pricing, Salesforce, AI tooling, and repository-intelligence domains.</w:t>
-      </w:r>
-    </w:p>
-    <w:p>
-      <w:pPr>
-        <w:keepNext/>
-        <w:spacing w:before="320" w:after="160"/>
-      </w:pPr>
-      <w:r>
-        <w:rPr>
-          <w:rFonts w:ascii="Helvetica Neue" w:hAnsi="Helvetica Neue" w:eastAsia="Helvetica Neue"/>
-          <w:b/>
-          <w:color w:val="0C0C0C"/>
-          <w:sz w:val="32"/>
-        </w:rPr>
-        <w:t>Architecture and Technical Leadership Evidence</w:t>
-      </w:r>
-    </w:p>
-    <w:p>
-      <w:pPr>
-        <w:pStyle w:val="ListBullet"/>
-        <w:keepLines/>
-        <w:numPr>
-          <w:numId w:val="0"/>
-        </w:numPr>
-        <w:tabs>
-          <w:tab w:pos="360" w:val="left"/>
-        </w:tabs>
-        <w:spacing w:before="0" w:after="160"/>
-        <w:ind w:left="360" w:hanging="360"/>
-      </w:pPr>
-      <w:r>
-        <w:rPr>
-          <w:rFonts w:ascii="Helvetica Neue" w:hAnsi="Helvetica Neue" w:eastAsia="Helvetica Neue"/>
-          <w:color w:val="0C0C0C"/>
-          <w:sz w:val="24"/>
-        </w:rPr>
-        <w:t>•</w:t>
-        <w:tab/>
-      </w:r>
-      <w:r>
-        <w:rPr>
-          <w:rFonts w:ascii="Helvetica Neue" w:hAnsi="Helvetica Neue" w:eastAsia="Helvetica Neue"/>
-          <w:i w:val="0"/>
-          <w:color w:val="0C0C0C"/>
-          <w:sz w:val="24"/>
-        </w:rPr>
-        <w:t>Served as chief architect, design owner, proposal author, and implementation driver for end-to-end enterprise systems across public APIs, analytics integrations, AI workflows, developer tooling, and customer-facing product surfaces.</w:t>
-      </w:r>
-    </w:p>
-    <w:p>
-      <w:pPr>
-        <w:pStyle w:val="ListBullet"/>
-        <w:keepLines/>
-        <w:numPr>
-          <w:numId w:val="0"/>
-        </w:numPr>
-        <w:tabs>
-          <w:tab w:pos="360" w:val="left"/>
-        </w:tabs>
-        <w:spacing w:before="0" w:after="160"/>
-        <w:ind w:left="360" w:hanging="360"/>
-      </w:pPr>
-      <w:r>
-        <w:rPr>
-          <w:rFonts w:ascii="Helvetica Neue" w:hAnsi="Helvetica Neue" w:eastAsia="Helvetica Neue"/>
-          <w:color w:val="0C0C0C"/>
-          <w:sz w:val="24"/>
-        </w:rPr>
-        <w:t>•</w:t>
-        <w:tab/>
-      </w:r>
-      <w:r>
-        <w:rPr>
-          <w:rFonts w:ascii="Helvetica Neue" w:hAnsi="Helvetica Neue" w:eastAsia="Helvetica Neue"/>
-          <w:i w:val="0"/>
-          <w:color w:val="0C0C0C"/>
-          <w:sz w:val="24"/>
-        </w:rPr>
-        <w:t>Architected a data access API that exposed a public server-side surface for CRUD-style data operations against Zilliant's legacy microservice stack, enabling integrations that did not require users to work through the web UI.</w:t>
-      </w:r>
-    </w:p>
-    <w:p>
-      <w:pPr>
-        <w:pStyle w:val="ListBullet"/>
-        <w:keepLines/>
-        <w:numPr>
-          <w:numId w:val="0"/>
-        </w:numPr>
-        <w:tabs>
-          <w:tab w:pos="360" w:val="left"/>
-        </w:tabs>
-        <w:spacing w:before="0" w:after="160"/>
-        <w:ind w:left="360" w:hanging="360"/>
-      </w:pPr>
-      <w:r>
-        <w:rPr>
-          <w:rFonts w:ascii="Helvetica Neue" w:hAnsi="Helvetica Neue" w:eastAsia="Helvetica Neue"/>
-          <w:color w:val="0C0C0C"/>
-          <w:sz w:val="24"/>
-        </w:rPr>
-        <w:t>•</w:t>
-        <w:tab/>
-      </w:r>
-      <w:r>
-        <w:rPr>
-          <w:rFonts w:ascii="Helvetica Neue" w:hAnsi="Helvetica Neue" w:eastAsia="Helvetica Neue"/>
-          <w:i w:val="0"/>
-          <w:color w:val="0C0C0C"/>
-          <w:sz w:val="24"/>
-        </w:rPr>
-        <w:t>Architected and led implementation of a full AWS QuickSight and Amazon Q analytics integration, embedding generative AI-assisted analytics and on-demand visualization workflows into the product UI.</w:t>
-      </w:r>
-    </w:p>
-    <w:p>
-      <w:pPr>
-        <w:pStyle w:val="ListBullet"/>
-        <w:keepLines/>
-        <w:numPr>
-          <w:numId w:val="0"/>
-        </w:numPr>
-        <w:tabs>
-          <w:tab w:pos="360" w:val="left"/>
-        </w:tabs>
-        <w:spacing w:before="0" w:after="160"/>
-        <w:ind w:left="360" w:hanging="360"/>
-      </w:pPr>
-      <w:r>
-        <w:rPr>
-          <w:rFonts w:ascii="Helvetica Neue" w:hAnsi="Helvetica Neue" w:eastAsia="Helvetica Neue"/>
-          <w:color w:val="0C0C0C"/>
-          <w:sz w:val="24"/>
-        </w:rPr>
-        <w:t>•</w:t>
-        <w:tab/>
-      </w:r>
-      <w:r>
-        <w:rPr>
-          <w:rFonts w:ascii="Helvetica Neue" w:hAnsi="Helvetica Neue" w:eastAsia="Helvetica Neue"/>
-          <w:i w:val="0"/>
-          <w:color w:val="0C0C0C"/>
-          <w:sz w:val="24"/>
-        </w:rPr>
-        <w:t>Architected and led Zilliant Developer Experience (ZDX), a CLI that migrated complex solution configurations between deployed environments and reduced a previously multi-day process to a few hours.</w:t>
-      </w:r>
-    </w:p>
-    <w:p>
-      <w:pPr>
-        <w:pStyle w:val="ListBullet"/>
-        <w:keepLines/>
-        <w:numPr>
-          <w:numId w:val="0"/>
-        </w:numPr>
-        <w:tabs>
-          <w:tab w:pos="360" w:val="left"/>
-        </w:tabs>
-        <w:spacing w:before="0" w:after="160"/>
-        <w:ind w:left="360" w:hanging="360"/>
-      </w:pPr>
-      <w:r>
-        <w:rPr>
-          <w:rFonts w:ascii="Helvetica Neue" w:hAnsi="Helvetica Neue" w:eastAsia="Helvetica Neue"/>
-          <w:color w:val="0C0C0C"/>
-          <w:sz w:val="24"/>
-        </w:rPr>
-        <w:t>•</w:t>
-        <w:tab/>
-      </w:r>
-      <w:r>
-        <w:rPr>
-          <w:rFonts w:ascii="Helvetica Neue" w:hAnsi="Helvetica Neue" w:eastAsia="Helvetica Neue"/>
-          <w:i w:val="0"/>
-          <w:color w:val="0C0C0C"/>
-          <w:sz w:val="24"/>
-        </w:rPr>
-        <w:t>Led technical strategy across roughly six engineering teams without direct people-management authority, serving as a bridge between siloed teams, product management, engineering leadership, and implementers.</w:t>
-      </w:r>
-    </w:p>
-    <w:p>
-      <w:pPr>
-        <w:pStyle w:val="ListBullet"/>
-        <w:keepLines/>
-        <w:numPr>
-          <w:numId w:val="0"/>
-        </w:numPr>
-        <w:tabs>
-          <w:tab w:pos="360" w:val="left"/>
-        </w:tabs>
-        <w:spacing w:before="0" w:after="160"/>
-        <w:ind w:left="360" w:hanging="360"/>
-      </w:pPr>
-      <w:r>
-        <w:rPr>
-          <w:rFonts w:ascii="Helvetica Neue" w:hAnsi="Helvetica Neue" w:eastAsia="Helvetica Neue"/>
-          <w:color w:val="0C0C0C"/>
-          <w:sz w:val="24"/>
-        </w:rPr>
-        <w:t>•</w:t>
-        <w:tab/>
-      </w:r>
-      <w:r>
-        <w:rPr>
-          <w:rFonts w:ascii="Helvetica Neue" w:hAnsi="Helvetica Neue" w:eastAsia="Helvetica Neue"/>
-          <w:i w:val="0"/>
-          <w:color w:val="0C0C0C"/>
-          <w:sz w:val="24"/>
-        </w:rPr>
-        <w:t>Mentored engineers through domain-specific skill transfer, design explanation, and implementation guidance, including sustained mentorship for junior engineers and situational mentoring for senior engineers working outside their strongest domains.</w:t>
-      </w:r>
-    </w:p>
-    <w:p>
-      <w:pPr>
-        <w:pStyle w:val="ListBullet"/>
-        <w:keepLines/>
-        <w:numPr>
-          <w:numId w:val="0"/>
-        </w:numPr>
-        <w:tabs>
-          <w:tab w:pos="360" w:val="left"/>
-        </w:tabs>
-        <w:spacing w:before="0" w:after="160"/>
-        <w:ind w:left="360" w:hanging="360"/>
-      </w:pPr>
-      <w:r>
-        <w:rPr>
-          <w:rFonts w:ascii="Helvetica Neue" w:hAnsi="Helvetica Neue" w:eastAsia="Helvetica Neue"/>
-          <w:color w:val="0C0C0C"/>
-          <w:sz w:val="24"/>
-        </w:rPr>
-        <w:t>•</w:t>
-        <w:tab/>
-      </w:r>
-      <w:r>
-        <w:rPr>
-          <w:rFonts w:ascii="Helvetica Neue" w:hAnsi="Helvetica Neue" w:eastAsia="Helvetica Neue"/>
-          <w:i w:val="0"/>
-          <w:color w:val="0C0C0C"/>
-          <w:sz w:val="24"/>
-        </w:rPr>
-        <w:t>Created proposals, design documents, Confluence guidance, proof-of-concept implementations, and reference implementations so teams could align around technical direction after initial design discussions.</w:t>
-      </w:r>
-    </w:p>
-    <w:p>
-      <w:pPr>
-        <w:pStyle w:val="ListBullet"/>
-        <w:keepLines/>
-        <w:numPr>
-          <w:numId w:val="0"/>
-        </w:numPr>
-        <w:tabs>
-          <w:tab w:pos="360" w:val="left"/>
-        </w:tabs>
-        <w:spacing w:before="0" w:after="160"/>
-        <w:ind w:left="360" w:hanging="360"/>
-      </w:pPr>
-      <w:r>
-        <w:rPr>
-          <w:rFonts w:ascii="Helvetica Neue" w:hAnsi="Helvetica Neue" w:eastAsia="Helvetica Neue"/>
-          <w:color w:val="0C0C0C"/>
-          <w:sz w:val="24"/>
-        </w:rPr>
-        <w:t>•</w:t>
-        <w:tab/>
-      </w:r>
-      <w:r>
-        <w:rPr>
-          <w:rFonts w:ascii="Helvetica Neue" w:hAnsi="Helvetica Neue" w:eastAsia="Helvetica Neue"/>
-          <w:i w:val="0"/>
-          <w:color w:val="0C0C0C"/>
-          <w:sz w:val="24"/>
-        </w:rPr>
-        <w:t>Balanced product requirements, engineering constraints, trade-offs, and ambiguous implementation paths by translating between product managers and engineering teams until the group reached a design decision with understood constraints.</w:t>
-      </w:r>
-    </w:p>
-    <w:p>
-      <w:pPr>
-        <w:pStyle w:val="ListBullet"/>
-        <w:keepLines/>
-        <w:numPr>
-          <w:numId w:val="0"/>
-        </w:numPr>
-        <w:tabs>
-          <w:tab w:pos="360" w:val="left"/>
-        </w:tabs>
-        <w:spacing w:before="0" w:after="160"/>
-        <w:ind w:left="360" w:hanging="360"/>
-      </w:pPr>
-      <w:r>
-        <w:rPr>
-          <w:rFonts w:ascii="Helvetica Neue" w:hAnsi="Helvetica Neue" w:eastAsia="Helvetica Neue"/>
-          <w:color w:val="0C0C0C"/>
-          <w:sz w:val="24"/>
-        </w:rPr>
-        <w:t>•</w:t>
-        <w:tab/>
-      </w:r>
-      <w:r>
-        <w:rPr>
-          <w:rFonts w:ascii="Helvetica Neue" w:hAnsi="Helvetica Neue" w:eastAsia="Helvetica Neue"/>
-          <w:i w:val="0"/>
-          <w:color w:val="0C0C0C"/>
-          <w:sz w:val="24"/>
-        </w:rPr>
-        <w:t>Strongest architecture areas include framework design, API design, platform design, developer tooling, UI/UX architecture, AI workflow design, and agent-assisted developer workflow design.</w:t>
-      </w:r>
-    </w:p>
-    <w:p>
-      <w:pPr>
-        <w:pStyle w:val="ListBullet"/>
-        <w:keepLines/>
-        <w:numPr>
-          <w:numId w:val="0"/>
-        </w:numPr>
-        <w:tabs>
-          <w:tab w:pos="360" w:val="left"/>
-        </w:tabs>
-        <w:spacing w:before="0" w:after="160"/>
-        <w:ind w:left="360" w:hanging="360"/>
-      </w:pPr>
-      <w:r>
-        <w:rPr>
-          <w:rFonts w:ascii="Helvetica Neue" w:hAnsi="Helvetica Neue" w:eastAsia="Helvetica Neue"/>
-          <w:color w:val="0C0C0C"/>
-          <w:sz w:val="24"/>
-        </w:rPr>
-        <w:t>•</w:t>
-        <w:tab/>
-      </w:r>
-      <w:r>
-        <w:rPr>
-          <w:rFonts w:ascii="Helvetica Neue" w:hAnsi="Helvetica Neue" w:eastAsia="Helvetica Neue"/>
-          <w:i w:val="0"/>
-          <w:color w:val="0C0C0C"/>
-          <w:sz w:val="24"/>
-        </w:rPr>
-        <w:t>Created a public AI agent skills repository and brought reusable skills back into team workflows to accelerate development practices such as code review and agent-guided engineering tasks.</w:t>
-      </w:r>
-    </w:p>
-    <w:p>
-      <w:pPr>
-        <w:keepNext/>
-        <w:spacing w:before="320" w:after="160"/>
-      </w:pPr>
-      <w:r>
-        <w:rPr>
-          <w:rFonts w:ascii="Helvetica Neue" w:hAnsi="Helvetica Neue" w:eastAsia="Helvetica Neue"/>
-          <w:b/>
-          <w:color w:val="0C0C0C"/>
-          <w:sz w:val="32"/>
-        </w:rPr>
-        <w:t>Differentiators</w:t>
-      </w:r>
-    </w:p>
-    <w:p>
-      <w:pPr>
-        <w:pStyle w:val="ListBullet"/>
-        <w:keepLines/>
-        <w:numPr>
-          <w:numId w:val="0"/>
-        </w:numPr>
-        <w:tabs>
-          <w:tab w:pos="360" w:val="left"/>
-        </w:tabs>
-        <w:spacing w:before="0" w:after="160"/>
-        <w:ind w:left="360" w:hanging="360"/>
-      </w:pPr>
-      <w:r>
-        <w:rPr>
-          <w:rFonts w:ascii="Helvetica Neue" w:hAnsi="Helvetica Neue" w:eastAsia="Helvetica Neue"/>
-          <w:color w:val="0C0C0C"/>
-          <w:sz w:val="24"/>
-        </w:rPr>
-        <w:t>•</w:t>
-        <w:tab/>
-      </w:r>
-      <w:r>
-        <w:rPr>
-          <w:rFonts w:ascii="Helvetica Neue" w:hAnsi="Helvetica Neue" w:eastAsia="Helvetica Neue"/>
-          <w:i w:val="0"/>
-          <w:color w:val="0C0C0C"/>
-          <w:sz w:val="24"/>
-        </w:rPr>
-        <w:t>Long-running AI orientation that predates the current LLM wave, including graduate-level AI coursework in the 1990s, years of independent computational creativity research, and practical exposure to expert-system, game-intelligence, generative-art, and modern LLM/agentic AI paradigms.</w:t>
-      </w:r>
-    </w:p>
-    <w:p>
-      <w:pPr>
-        <w:pStyle w:val="ListBullet"/>
-        <w:keepLines/>
-        <w:numPr>
-          <w:numId w:val="0"/>
-        </w:numPr>
-        <w:tabs>
-          <w:tab w:pos="360" w:val="left"/>
-        </w:tabs>
-        <w:spacing w:before="0" w:after="160"/>
-        <w:ind w:left="360" w:hanging="360"/>
-      </w:pPr>
-      <w:r>
-        <w:rPr>
-          <w:rFonts w:ascii="Helvetica Neue" w:hAnsi="Helvetica Neue" w:eastAsia="Helvetica Neue"/>
-          <w:color w:val="0C0C0C"/>
-          <w:sz w:val="24"/>
-        </w:rPr>
-        <w:t>•</w:t>
-        <w:tab/>
-      </w:r>
-      <w:r>
-        <w:rPr>
-          <w:rFonts w:ascii="Helvetica Neue" w:hAnsi="Helvetica Neue" w:eastAsia="Helvetica Neue"/>
-          <w:i w:val="0"/>
-          <w:color w:val="0C0C0C"/>
-          <w:sz w:val="24"/>
-        </w:rPr>
-        <w:t>Builder by default: repeatedly creates working products, frameworks, libraries, games, research systems, and open-source tools outside formal job requirements, using code as the primary way to explore ideas and turn technical taste into usable systems.</w:t>
-      </w:r>
-    </w:p>
-    <w:p>
-      <w:pPr>
-        <w:pStyle w:val="ListBullet"/>
-        <w:keepLines/>
-        <w:numPr>
-          <w:numId w:val="0"/>
-        </w:numPr>
-        <w:tabs>
-          <w:tab w:pos="360" w:val="left"/>
-        </w:tabs>
-        <w:spacing w:before="0" w:after="160"/>
-        <w:ind w:left="360" w:hanging="360"/>
-      </w:pPr>
-      <w:r>
-        <w:rPr>
-          <w:rFonts w:ascii="Helvetica Neue" w:hAnsi="Helvetica Neue" w:eastAsia="Helvetica Neue"/>
-          <w:color w:val="0C0C0C"/>
-          <w:sz w:val="24"/>
-        </w:rPr>
-        <w:t>•</w:t>
-        <w:tab/>
-      </w:r>
-      <w:r>
-        <w:rPr>
-          <w:rFonts w:ascii="Helvetica Neue" w:hAnsi="Helvetica Neue" w:eastAsia="Helvetica Neue"/>
-          <w:i w:val="0"/>
-          <w:color w:val="0C0C0C"/>
-          <w:sz w:val="24"/>
-        </w:rPr>
-        <w:t>Combines enterprise architecture judgment from long Zilliant tenure with founder-style product execution from solo SaaS builds, public open-source tooling, marketing experiments, deployment work, and go-to-market attempts.</w:t>
-      </w:r>
-    </w:p>
-    <w:p>
-      <w:pPr>
-        <w:pStyle w:val="ListBullet"/>
-        <w:keepLines/>
-        <w:numPr>
-          <w:numId w:val="0"/>
-        </w:numPr>
-        <w:tabs>
-          <w:tab w:pos="360" w:val="left"/>
-        </w:tabs>
-        <w:spacing w:before="0" w:after="160"/>
-        <w:ind w:left="360" w:hanging="360"/>
-      </w:pPr>
-      <w:r>
-        <w:rPr>
-          <w:rFonts w:ascii="Helvetica Neue" w:hAnsi="Helvetica Neue" w:eastAsia="Helvetica Neue"/>
-          <w:color w:val="0C0C0C"/>
-          <w:sz w:val="24"/>
-        </w:rPr>
-        <w:t>•</w:t>
-        <w:tab/>
-      </w:r>
-      <w:r>
-        <w:rPr>
-          <w:rFonts w:ascii="Helvetica Neue" w:hAnsi="Helvetica Neue" w:eastAsia="Helvetica Neue"/>
-          <w:i w:val="0"/>
-          <w:color w:val="0C0C0C"/>
-          <w:sz w:val="24"/>
-        </w:rPr>
-        <w:t>Brings a broader AI perspective than model-training-focused ML alone: agent workflows, tool use, MCP, structured prompts, RAG, semantic matching, computational creativity, human-facing AI product UX, developer workflow acceleration, and evidence-grounded automation.</w:t>
-      </w:r>
-    </w:p>
-    <w:p>
-      <w:pPr>
-        <w:pStyle w:val="ListBullet"/>
-        <w:keepLines/>
-        <w:numPr>
-          <w:numId w:val="0"/>
-        </w:numPr>
-        <w:tabs>
-          <w:tab w:pos="360" w:val="left"/>
-        </w:tabs>
-        <w:spacing w:before="0" w:after="160"/>
-        <w:ind w:left="360" w:hanging="360"/>
-      </w:pPr>
-      <w:r>
-        <w:rPr>
-          <w:rFonts w:ascii="Helvetica Neue" w:hAnsi="Helvetica Neue" w:eastAsia="Helvetica Neue"/>
-          <w:color w:val="0C0C0C"/>
-          <w:sz w:val="24"/>
-        </w:rPr>
-        <w:t>•</w:t>
-        <w:tab/>
-      </w:r>
-      <w:r>
-        <w:rPr>
-          <w:rFonts w:ascii="Helvetica Neue" w:hAnsi="Helvetica Neue" w:eastAsia="Helvetica Neue"/>
-          <w:i w:val="0"/>
-          <w:color w:val="0C0C0C"/>
-          <w:sz w:val="24"/>
-        </w:rPr>
-        <w:t>Comfortable operating in ambiguous spaces where product goals, technical constraints, user experience, and evolving AI capabilities have to be reconciled into a design that engineers can actually build.</w:t>
+        <w:t>Applied AI technical lead and software architect with 20+ years building enterprise software, developer tools, and product-facing systems. Combines hands-on agentic AI, platform architecture, full-stack engineering, product judgment, and published computational creativity research.</w:t>
       </w:r>
     </w:p>
     <w:p>
@@ -1465,7 +195,7 @@
           <w:color w:val="0C0C0C"/>
           <w:sz w:val="24"/>
         </w:rPr>
-        <w:t>Served as organization-wide AI technical leader, guiding engineering teams on adoption of large language models (LLMs), agents, evaluation practices, and modern AI development patterns aligned with business goals.</w:t>
+        <w:t>Served as organization-wide AI technical leader, guiding teams on LLMs, agents, evaluation practices, and modern AI development aligned with business goals.</w:t>
       </w:r>
     </w:p>
     <w:p>
@@ -1497,7 +227,7 @@
           <w:color w:val="0C0C0C"/>
           <w:sz w:val="24"/>
         </w:rPr>
-        <w:t>Contributed across the client and server sides of Zilliant's Pricing Plus application, a React application built with Next.js and a Node.js server.</w:t>
+        <w:t>Contributed to the React, Next.js, and Node.js client and server layers of Zilliant's Pricing Plus application.</w:t>
       </w:r>
     </w:p>
     <w:p>
@@ -1529,7 +259,7 @@
           <w:color w:val="0C0C0C"/>
           <w:sz w:val="24"/>
         </w:rPr>
-        <w:t>Served as technical lead and prototype implementer for an agentic offering deployed on AWS and built with the Strands Agents SDK, enabling users to explore and understand pricing formulas through a conversational interface.</w:t>
+        <w:t>Led and prototyped an AWS offering built with the Strands Agents SDK for conversational exploration of pricing formulas.</w:t>
       </w:r>
     </w:p>
     <w:p>
@@ -1561,7 +291,7 @@
           <w:color w:val="0C0C0C"/>
           <w:sz w:val="24"/>
         </w:rPr>
-        <w:t>Architected the company's first Model Context Protocol (MCP) server and worked alongside a third-party contractor on its implementation, connecting the classic price management stack and formula evaluation service to agent workflows.</w:t>
+        <w:t>Architected the company's first Model Context Protocol (MCP) server and guided a third-party implementation team.</w:t>
       </w:r>
     </w:p>
     <w:p>
@@ -1593,7 +323,7 @@
           <w:color w:val="0C0C0C"/>
           <w:sz w:val="24"/>
         </w:rPr>
-        <w:t>Designed MCP tools that allow agents to retrieve calculated prices and explain the formula reasoning behind start, target, and floor price values shown in customer-facing pricing experiences.</w:t>
+        <w:t>Designed MCP tools that retrieve calculated prices and explain start, target, and floor price formulas.</w:t>
       </w:r>
     </w:p>
     <w:p>
@@ -1625,7 +355,7 @@
           <w:color w:val="0C0C0C"/>
           <w:sz w:val="24"/>
         </w:rPr>
-        <w:t>Shipped the MCP server work for existing customers on Zilliant's older stack, supporting modernization, customer retention, and license-expansion opportunities without relying on unverified revenue attribution.</w:t>
+        <w:t>Shipped the MCP server for customers on Zilliant's older stack, supporting modernization and license-expansion work without claiming unverified revenue.</w:t>
       </w:r>
     </w:p>
     <w:p>
@@ -1657,7 +387,7 @@
           <w:color w:val="0C0C0C"/>
           <w:sz w:val="24"/>
         </w:rPr>
-        <w:t>Led cross-team technical strategy for AI adoption, translating emerging AI capabilities into practical engineering workflows and product opportunities across product management, engineering leadership, and implementation teams.</w:t>
+        <w:t>Led AI strategy across roughly six engineering teams, connecting product managers, engineering leaders, and implementers without direct management authority.</w:t>
       </w:r>
     </w:p>
     <w:p>
@@ -1689,7 +419,7 @@
           <w:color w:val="0C0C0C"/>
           <w:sz w:val="24"/>
         </w:rPr>
-        <w:t>Drove broad adoption of AI tooling across engineering, including Codex workflow training, reusable code-review skills, and agent-assisted development patterns that helped move PR review and code-production workflows toward faster turnaround.</w:t>
+        <w:t>Created proposals, design guidance, proofs of concept, and reference implementations to turn emerging AI capabilities into buildable product and engineering direction.</w:t>
       </w:r>
     </w:p>
     <w:p>
@@ -1721,7 +451,39 @@
           <w:color w:val="0C0C0C"/>
           <w:sz w:val="24"/>
         </w:rPr>
-        <w:t>Provided ongoing mentorship to engineers at all levels of seniority.</w:t>
+        <w:t>Expanded AI-assisted engineering through Codex training, reusable review skills, and agent-guided development workflows.</w:t>
+      </w:r>
+    </w:p>
+    <w:p>
+      <w:pPr>
+        <w:pStyle w:val="ListBullet"/>
+        <w:keepLines/>
+        <w:numPr>
+          <w:numId w:val="0"/>
+        </w:numPr>
+        <w:tabs>
+          <w:tab w:pos="360" w:val="left"/>
+        </w:tabs>
+        <w:spacing w:before="0" w:after="160"/>
+        <w:ind w:left="360" w:hanging="360"/>
+      </w:pPr>
+      <w:r>
+        <w:rPr>
+          <w:rFonts w:ascii="Helvetica Neue" w:hAnsi="Helvetica Neue" w:eastAsia="Helvetica Neue"/>
+          <w:color w:val="0C0C0C"/>
+          <w:sz w:val="24"/>
+        </w:rPr>
+        <w:t>•</w:t>
+        <w:tab/>
+      </w:r>
+      <w:r>
+        <w:rPr>
+          <w:rFonts w:ascii="Helvetica Neue" w:hAnsi="Helvetica Neue" w:eastAsia="Helvetica Neue"/>
+          <w:i w:val="0"/>
+          <w:color w:val="0C0C0C"/>
+          <w:sz w:val="24"/>
+        </w:rPr>
+        <w:t>Mentored junior and senior engineers through design explanation, domain transfer, and implementation guidance.</w:t>
       </w:r>
     </w:p>
     <w:p>
@@ -1780,7 +542,7 @@
           <w:color w:val="0C0C0C"/>
           <w:sz w:val="24"/>
         </w:rPr>
-        <w:t>Designed and implemented a custom generative AI pipeline that enabled real-time integration of diverse pricing insights into customer-facing analytics experiences.</w:t>
+        <w:t>Built a generative AI pipeline that integrated diverse pricing insights into customer-facing analytics in real time.</w:t>
       </w:r>
     </w:p>
     <w:p>
@@ -1812,7 +574,7 @@
           <w:color w:val="0C0C0C"/>
           <w:sz w:val="24"/>
         </w:rPr>
-        <w:t>Led integration of AWS QuickSight and Amazon Q, embedding analytics visualization and generative AI-assisted question answering into the product UI to enhance customer decision support.</w:t>
+        <w:t>Led and shipped an AWS QuickSight and Amazon Q integration with embedded visualization and generative AI-assisted analysis.</w:t>
       </w:r>
     </w:p>
     <w:p>
@@ -1844,7 +606,7 @@
           <w:color w:val="0C0C0C"/>
           <w:sz w:val="24"/>
         </w:rPr>
-        <w:t>Shipped the AWS QuickSight and Amazon Q integration as a customer-facing analytics capability.</w:t>
+        <w:t>Served as chief architect for a public data API that exposed supported CRUD operations across a legacy microservice stack.</w:t>
       </w:r>
     </w:p>
     <w:p>
@@ -1876,7 +638,7 @@
           <w:color w:val="0C0C0C"/>
           <w:sz w:val="24"/>
         </w:rPr>
-        <w:t>Served as chief architect for a data access API that created a server-side integration surface for CRUD-style operations against Zilliant's data and legacy microservice stack.</w:t>
+        <w:t>Designed and launched the Zilliant Developer Experience CLI, reducing complex environment migrations from multiple days to a few hours.</w:t>
       </w:r>
     </w:p>
     <w:p>
@@ -1908,39 +670,7 @@
           <w:color w:val="0C0C0C"/>
           <w:sz w:val="24"/>
         </w:rPr>
-        <w:t>Designed and launched the Zilliant Developer Experience (ZDX) CLI, streamlining internal and external developer workflows and reducing complex configuration migration work from a multi-day process to a few hours.</w:t>
-      </w:r>
-    </w:p>
-    <w:p>
-      <w:pPr>
-        <w:pStyle w:val="ListBullet"/>
-        <w:keepLines/>
-        <w:numPr>
-          <w:numId w:val="0"/>
-        </w:numPr>
-        <w:tabs>
-          <w:tab w:pos="360" w:val="left"/>
-        </w:tabs>
-        <w:spacing w:before="0" w:after="160"/>
-        <w:ind w:left="360" w:hanging="360"/>
-      </w:pPr>
-      <w:r>
-        <w:rPr>
-          <w:rFonts w:ascii="Helvetica Neue" w:hAnsi="Helvetica Neue" w:eastAsia="Helvetica Neue"/>
-          <w:color w:val="0C0C0C"/>
-          <w:sz w:val="24"/>
-        </w:rPr>
-        <w:t>•</w:t>
-        <w:tab/>
-      </w:r>
-      <w:r>
-        <w:rPr>
-          <w:rFonts w:ascii="Helvetica Neue" w:hAnsi="Helvetica Neue" w:eastAsia="Helvetica Neue"/>
-          <w:i w:val="0"/>
-          <w:color w:val="0C0C0C"/>
-          <w:sz w:val="24"/>
-        </w:rPr>
-        <w:t>Helped shape architectural direction across AI, analytics, and developer enablement initiatives.</w:t>
+        <w:t>Shaped architecture across AI, analytics, public APIs, and developer enablement initiatives.</w:t>
       </w:r>
     </w:p>
     <w:p>
@@ -1999,7 +729,7 @@
           <w:color w:val="0C0C0C"/>
           <w:sz w:val="24"/>
         </w:rPr>
-        <w:t>Directed UI/UX strategy for enterprise Salesforce implementations, improving usability and aligning product experiences with business objectives.</w:t>
+        <w:t>Directed UI/UX strategy for enterprise Salesforce implementations, aligning usability with business objectives.</w:t>
       </w:r>
     </w:p>
     <w:p>
@@ -2031,7 +761,7 @@
           <w:color w:val="0C0C0C"/>
           <w:sz w:val="24"/>
         </w:rPr>
-        <w:t>Developed strategic proof-of-concept solutions that influenced company-wide technology direction and adoption decisions.</w:t>
+        <w:t>Built strategic proofs of concept that influenced company-wide technology direction and adoption decisions.</w:t>
       </w:r>
     </w:p>
     <w:p>
@@ -2063,7 +793,7 @@
           <w:color w:val="0C0C0C"/>
           <w:sz w:val="24"/>
         </w:rPr>
-        <w:t>Facilitated collaboration across globally distributed teams to align implementation choices with broader technical strategy.</w:t>
+        <w:t>Aligned implementation decisions across globally distributed teams with broader technical strategy.</w:t>
       </w:r>
     </w:p>
     <w:p>
@@ -2122,7 +852,7 @@
           <w:color w:val="0C0C0C"/>
           <w:sz w:val="24"/>
         </w:rPr>
-        <w:t>Championed adoption of Salesforce Lightning Web Components, contributing to major UI modernization and improved application performance.</w:t>
+        <w:t>Championed Salesforce Lightning Web Components adoption, contributing to UI modernization and improved application performance.</w:t>
       </w:r>
     </w:p>
     <w:p>
@@ -2154,7 +884,7 @@
           <w:color w:val="0C0C0C"/>
           <w:sz w:val="24"/>
         </w:rPr>
-        <w:t>Led development efforts on SalesMax and mentored interns through successful product delivery, increasing usability and competitiveness.</w:t>
+        <w:t>Led SalesMax development and mentored interns through product delivery that improved usability and competitiveness.</w:t>
       </w:r>
     </w:p>
     <w:p>
@@ -2186,7 +916,7 @@
           <w:color w:val="0C0C0C"/>
           <w:sz w:val="24"/>
         </w:rPr>
-        <w:t>Contributed across full-stack engineering, front-end architecture, and product modernization initiatives over a decade of platform evolution.</w:t>
+        <w:t>Contributed to full-stack engineering, front-end architecture, and product modernization across a decade of platform evolution.</w:t>
       </w:r>
     </w:p>
     <w:p>
@@ -2265,7 +995,7 @@
           <w:color w:val="0C0C0C"/>
           <w:sz w:val="24"/>
         </w:rPr>
-        <w:t>Built and publicly deployed a solo GitHub App-backed repository intelligence SaaS, later sunset and open-sourced as an archived reference project after it did not gain customer traction.</w:t>
+        <w:t>Built and publicly deployed a solo GitHub App-backed repository intelligence SaaS, then sunset and open-sourced it after it did not gain customer traction.</w:t>
       </w:r>
     </w:p>
     <w:p>
@@ -2297,7 +1027,7 @@
           <w:color w:val="0C0C0C"/>
           <w:sz w:val="24"/>
         </w:rPr>
-        <w:t>Designed a Django monolith with web, worker, and beat services; GitHub App authentication and installation scope; repository indexing; analytics derivation; AI artifact generation; billing; operator pages; and Sevalla deployment infrastructure.</w:t>
+        <w:t>Designed a Django monolith with web, worker, and scheduler services, GitHub App authentication, repository indexing, AI artifacts, billing, and operator workflows.</w:t>
       </w:r>
     </w:p>
     <w:p>
@@ -2329,7 +1059,7 @@
           <w:color w:val="0C0C0C"/>
           <w:sz w:val="24"/>
         </w:rPr>
-        <w:t>Built deterministic repository extraction over branch-aware snapshots, file trees, representative source excerpts, commit history, contributor aliases, pull requests, review context, path-level touch facts, and contributor-path rollups.</w:t>
+        <w:t>Built deterministic extraction across branch snapshots, file trees, source excerpts, commits, contributor aliases, pull requests, reviews, and path-level ownership facts.</w:t>
       </w:r>
     </w:p>
     <w:p>
@@ -2361,7 +1091,7 @@
           <w:color w:val="0C0C0C"/>
           <w:sz w:val="24"/>
         </w:rPr>
-        <w:t>Designed an intelligence pipeline that derived architecture areas first, mapped paths to semantic system areas, and used those architecture mappings to ground contributor expertise inference.</w:t>
+        <w:t>Derived architecture areas before mapping paths to semantic systems and grounding contributor expertise inference.</w:t>
       </w:r>
     </w:p>
     <w:p>
@@ -2393,7 +1123,7 @@
           <w:color w:val="0C0C0C"/>
           <w:sz w:val="24"/>
         </w:rPr>
-        <w:t>Produced architecture reports, expertise reports, repository-specific expert-routing suggestions, hotspot and maintenance-pressure signals, and interactive expertise-routing answers from published expertise graph state.</w:t>
+        <w:t>Produced architecture and expertise reports, expert-routing suggestions, hotspot signals, maintenance pressure, and interactive answers from published expertise graphs.</w:t>
       </w:r>
     </w:p>
     <w:p>
@@ -2425,7 +1155,7 @@
           <w:color w:val="0C0C0C"/>
           <w:sz w:val="24"/>
         </w:rPr>
-        <w:t>Designed the product around evidence-backed repository understanding: architecture visibility, current-team-first expert discovery, knowledge concentration, hotspots, ownership fragility, and coordination risk.</w:t>
+        <w:t>Focused the product on architecture visibility, current-team expert discovery, knowledge concentration, ownership fragility, and coordination risk.</w:t>
       </w:r>
     </w:p>
     <w:p>
@@ -2457,7 +1187,7 @@
           <w:color w:val="0C0C0C"/>
           <w:sz w:val="24"/>
         </w:rPr>
-        <w:t>Implemented provider-neutral billing architecture with Stripe-first hosted billing, GitHub Marketplace as a later adapter direction, repository entitlement enforcement, trial policy, and subscription normalization.</w:t>
+        <w:t>Built provider-neutral billing with Stripe-hosted payments, entitlement enforcement, trials, subscription normalization, and a future GitHub Marketplace adapter path.</w:t>
       </w:r>
     </w:p>
     <w:p>
@@ -2489,7 +1219,7 @@
           <w:color w:val="0C0C0C"/>
           <w:sz w:val="24"/>
         </w:rPr>
-        <w:t>Created sanitized deployment infrastructure with Terraform, GitHub Actions workflows, production-shaped manifests, helper scripts, and operator runbooks for Sevalla deployment.</w:t>
+        <w:t>Created Terraform, GitHub Actions workflows, deployment manifests, helper scripts, and operator runbooks for Sevalla.</w:t>
       </w:r>
     </w:p>
     <w:p>
@@ -2521,7 +1251,7 @@
           <w:color w:val="0C0C0C"/>
           <w:sz w:val="24"/>
         </w:rPr>
-        <w:t>Owned end-to-end product execution, including opportunity definition, product strategy, system architecture, UX, AI pipeline design, GitHub integration model, billing model, deployment model, and go-to-market positioning.</w:t>
+        <w:t>Owned opportunity definition, product strategy, architecture, UX, AI pipelines, GitHub integration, billing, deployment, and go-to-market positioning.</w:t>
       </w:r>
     </w:p>
     <w:p>
@@ -2585,7 +1315,7 @@
           <w:color w:val="0C0C0C"/>
           <w:sz w:val="24"/>
         </w:rPr>
-        <w:t>Built and deployed a complete solo AI recruiting SaaS in roughly two months, using AI tooling to accelerate product, engineering, UI, deployment, and go-to-market execution.</w:t>
+        <w:t>Built and deployed a solo AI recruiting SaaS in roughly two months, accelerating product, engineering, UI, deployment, and go-to-market work with AI tools.</w:t>
       </w:r>
     </w:p>
     <w:p>
@@ -2617,7 +1347,7 @@
           <w:color w:val="0C0C0C"/>
           <w:sz w:val="24"/>
         </w:rPr>
-        <w:t>Conceived, architected, and launched an AI recruiting platform focused on resume parsing, structured candidate extraction, and AI-assisted candidate-to-role matching.</w:t>
+        <w:t>Designed resume parsing, structured candidate extraction, and explainable candidate-to-role matching.</w:t>
       </w:r>
     </w:p>
     <w:p>
@@ -2649,7 +1379,7 @@
           <w:color w:val="0C0C0C"/>
           <w:sz w:val="24"/>
         </w:rPr>
-        <w:t>Built a self-service recruiter workflow with sign-up, authentication, email verification, recruiter dashboard, job opening creation, bulk resume uploads, candidate profiles, match lists, candidate detail views, and shortlist export.</w:t>
+        <w:t>Built self-service recruiting flows for authentication, job creation, bulk uploads, candidate review, match lists, and shortlist export.</w:t>
       </w:r>
     </w:p>
     <w:p>
@@ -2681,7 +1411,7 @@
           <w:color w:val="0C0C0C"/>
           <w:sz w:val="24"/>
         </w:rPr>
-        <w:t>Built a Django/Celery background processing pipeline that ingested resume documents, extracted structured candidate data with OpenAI APIs, generated embeddings, and stored matching vectors in Pinecone.</w:t>
+        <w:t>Built a Django and Celery pipeline that extracted candidate data with OpenAI APIs and stored embedding vectors in Pinecone.</w:t>
       </w:r>
     </w:p>
     <w:p>
@@ -2713,7 +1443,7 @@
           <w:color w:val="0C0C0C"/>
           <w:sz w:val="24"/>
         </w:rPr>
-        <w:t>Designed a custom RAG and semantic matching system that compared candidate-profile sections against job-description sections across skills, experience, career direction, qualifications, and holistic fit.</w:t>
+        <w:t>Designed RAG and semantic matching across skills, experience, career direction, qualifications, and holistic fit.</w:t>
       </w:r>
     </w:p>
     <w:p>
@@ -2745,7 +1475,7 @@
           <w:color w:val="0C0C0C"/>
           <w:sz w:val="24"/>
         </w:rPr>
-        <w:t>Implemented a multi-lens candidate matching engine with holistic, skills, relevant experience, wildcard, and qualifications perspectives backed by Pinecone vector namespaces for candidate profiles and job openings.</w:t>
+        <w:t>Implemented holistic, skills, experience, wildcard, and qualifications matching lenses with Pinecone namespaces.</w:t>
       </w:r>
     </w:p>
     <w:p>
@@ -2777,7 +1507,7 @@
           <w:color w:val="0C0C0C"/>
           <w:sz w:val="24"/>
         </w:rPr>
-        <w:t>Built credit-based monetization with free starting credits, Stripe Checkout for credit purchases, recruiter credit balances, premium-action credit deduction, and no-subscription/pay-as-you-go pricing.</w:t>
+        <w:t>Built pay-as-you-go monetization with free credits, Stripe Checkout, recruiter balances, and premium-action credit deduction.</w:t>
       </w:r>
     </w:p>
     <w:p>
@@ -2809,7 +1539,7 @@
           <w:color w:val="0C0C0C"/>
           <w:sz w:val="24"/>
         </w:rPr>
-        <w:t>Built HTMX-driven progress and polling UI for long-running background jobs, including task metadata, status fragments, and per-owner async job visibility.</w:t>
+        <w:t>Built HTMX polling interfaces for long-running jobs, task status, and per-owner asynchronous work visibility.</w:t>
       </w:r>
     </w:p>
     <w:p>
@@ -2841,7 +1571,7 @@
           <w:color w:val="0C0C0C"/>
           <w:sz w:val="24"/>
         </w:rPr>
-        <w:t>Deployed the application with a hosted database, production-oriented settings, Celery workers, queued email handling, S3-style storage configuration, and Sevalla-oriented production deployment concerns.</w:t>
+        <w:t>Deployed hosted data, Celery workers, queued email, S3-style storage, and production settings on Sevalla.</w:t>
       </w:r>
     </w:p>
     <w:p>
@@ -2873,7 +1603,7 @@
           <w:color w:val="0C0C0C"/>
           <w:sz w:val="24"/>
         </w:rPr>
-        <w:t>Created and ran go-to-market assets and campaign work, including positioning, marketing strategy, landing-page messaging, demo/video concepts, and recruiter-focused direct-response campaign materials.</w:t>
+        <w:t>Created positioning, landing-page messaging, demos, video concepts, and recruiter-focused campaign materials.</w:t>
       </w:r>
     </w:p>
     <w:p>
@@ -2905,7 +1635,7 @@
           <w:color w:val="0C0C0C"/>
           <w:sz w:val="24"/>
         </w:rPr>
-        <w:t>Implemented guardrail-style checks and corrective loops around resume parsing and candidate extraction quality.</w:t>
+        <w:t>Added guardrail checks and corrective loops for resume parsing and candidate extraction quality.</w:t>
       </w:r>
     </w:p>
     <w:p>
@@ -2937,7 +1667,7 @@
           <w:color w:val="0C0C0C"/>
           <w:sz w:val="24"/>
         </w:rPr>
-        <w:t>Led the full product lifecycle independently, including product strategy, application architecture, full-stack implementation, UX design, deployment, pricing model definition, and live-market validation.</w:t>
+        <w:t>Owned product strategy, architecture, full-stack implementation, UX, deployment, pricing, and live-market validation.</w:t>
       </w:r>
     </w:p>
     <w:p>
@@ -2984,7 +1714,7 @@
           <w:color w:val="0C0C0C"/>
           <w:sz w:val="24"/>
         </w:rPr>
-        <w:t>Built and published open source AI and developer tooling spanning agent orchestration, AI grounding, prompt engineering, and engineering automation.</w:t>
+        <w:t>Published open-source AI and developer tools for agent orchestration, grounding, prompt engineering, and engineering automation.</w:t>
       </w:r>
     </w:p>
     <w:p>
@@ -3016,7 +1746,7 @@
           <w:color w:val="0C0C0C"/>
           <w:sz w:val="24"/>
         </w:rPr>
-        <w:t>Created contract4agents, a typed declarative contract language and toolchain for defining AI agents with callable interfaces, context requirements, capabilities, policies, guards, assertions, eval packs, monitor rules, and provider-neutral manifests.</w:t>
+        <w:t>Created contract4agents, a typed language and toolchain for agent interfaces, context, capabilities, policies, guards, assertions, eval packs, monitors, and provider-neutral manifests.</w:t>
       </w:r>
     </w:p>
     <w:p>
@@ -3048,7 +1778,7 @@
           <w:color w:val="0C0C0C"/>
           <w:sz w:val="24"/>
         </w:rPr>
-        <w:t>Created agentic-django, a Django-native integration for building agentic apps with the OpenAI Agents SDK, persistent sessions and runs, tool calling, background tasks, and HTMX/REST status polling.</w:t>
+        <w:t>Created agentic-django for OpenAI Agents SDK applications with persistent sessions, tool calls, background tasks, and HTMX or REST status polling.</w:t>
       </w:r>
     </w:p>
     <w:p>
@@ -3080,7 +1810,7 @@
           <w:color w:val="0C0C0C"/>
           <w:sz w:val="24"/>
         </w:rPr>
-        <w:t>Created agent-simulator, a Django/Channels application for simulating realistic agent conversations against configurable mock MCP tools using real provider APIs before building the actual MCP server.</w:t>
+        <w:t>Created agent-simulator to test realistic agent conversations against configurable mock MCP tools and real provider APIs before server implementation.</w:t>
       </w:r>
     </w:p>
     <w:p>
@@ -3112,7 +1842,7 @@
           <w:color w:val="0C0C0C"/>
           <w:sz w:val="24"/>
         </w:rPr>
-        <w:t>Created and maintains a public skills repository with reusable AI agent skills for Django, OpenAI, web UI, Python packaging, structured LLM workflows, code review, production-readiness review, and agent-legible repository work.</w:t>
+        <w:t>Maintains reusable public agent skills for Django, OpenAI, web UI, Python packaging, structured LLMs, code review, production readiness, and agent-legible repositories.</w:t>
       </w:r>
     </w:p>
     <w:p>
@@ -3144,7 +1874,7 @@
           <w:color w:val="0C0C0C"/>
           <w:sz w:val="24"/>
         </w:rPr>
-        <w:t>Created compendiumscribe, an OpenAI Agents SDK research workflow that decomposes topics into planning, web research, verification, and synthesis stages; validates structured Pydantic outputs; maintains a citation ledger; and renders sourced compendiums as Markdown, XML, HTML, or PDF.</w:t>
+        <w:t>Created compendiumscribe, a research workflow with planning, web research, verification, structured Pydantic output, citation tracking, and multi-format rendering.</w:t>
       </w:r>
     </w:p>
     <w:p>
@@ -3176,7 +1906,7 @@
           <w:color w:val="0C0C0C"/>
           <w:sz w:val="24"/>
         </w:rPr>
-        <w:t>Created promptdown, a Python package for expressing structured LLM prompts in Markdown files, separating prompt assets from code and supporting reusable prompt engineering workflows.</w:t>
+        <w:t>Created promptdown to express reusable structured LLM prompts in Markdown files separate from application code.</w:t>
       </w:r>
     </w:p>
     <w:p>
@@ -3208,7 +1938,7 @@
           <w:color w:val="0C0C0C"/>
           <w:sz w:val="24"/>
         </w:rPr>
-        <w:t>Created release-notes-scribe, a GitHub Action that uses the OpenAI Responses API to generate draft GitHub release notes from tag-to-tag commits and diffs.</w:t>
+        <w:t>Created release-notes-scribe, a GitHub Action that drafts release notes from tag-to-tag commits with the OpenAI Responses API.</w:t>
       </w:r>
     </w:p>
     <w:p>
@@ -3240,7 +1970,7 @@
           <w:color w:val="0C0C0C"/>
           <w:sz w:val="24"/>
         </w:rPr>
-        <w:t>Created pywebview-htmx, a Python desktop UI library that brings HTMX-style declarative interactions to PyWebview apps through Python-bound UI attributes, target swaps, loading states, concurrency controls, and lifecycle events.</w:t>
+        <w:t>Created pywebview-htmx for declarative Python desktop interactions with target swaps, loading states, concurrency controls, and lifecycle events.</w:t>
       </w:r>
     </w:p>
     <w:p>
@@ -3272,7 +2002,7 @@
           <w:color w:val="0C0C0C"/>
           <w:sz w:val="24"/>
         </w:rPr>
-        <w:t>Other notable projects include wordsmith-engine, a composable deterministic-friendly text generation toolkit for Python, plus earlier generative creativity projects connected to published computational creativity work.</w:t>
+        <w:t>Other work includes wordsmith-engine and earlier generative creativity projects connected to published computational creativity research.</w:t>
       </w:r>
     </w:p>
     <w:p>
@@ -3471,6 +2201,38 @@
           <w:sz w:val="32"/>
         </w:rPr>
         <w:t>Research and Publications</w:t>
+      </w:r>
+    </w:p>
+    <w:p>
+      <w:pPr>
+        <w:pStyle w:val="ListBullet"/>
+        <w:keepLines/>
+        <w:numPr>
+          <w:numId w:val="0"/>
+        </w:numPr>
+        <w:tabs>
+          <w:tab w:pos="360" w:val="left"/>
+        </w:tabs>
+        <w:spacing w:before="0" w:after="160"/>
+        <w:ind w:left="360" w:hanging="360"/>
+      </w:pPr>
+      <w:r>
+        <w:rPr>
+          <w:rFonts w:ascii="Helvetica Neue" w:hAnsi="Helvetica Neue" w:eastAsia="Helvetica Neue"/>
+          <w:color w:val="0C0C0C"/>
+          <w:sz w:val="24"/>
+        </w:rPr>
+        <w:t>•</w:t>
+        <w:tab/>
+      </w:r>
+      <w:r>
+        <w:rPr>
+          <w:rFonts w:ascii="Helvetica Neue" w:hAnsi="Helvetica Neue" w:eastAsia="Helvetica Neue"/>
+          <w:i w:val="0"/>
+          <w:color w:val="0C0C0C"/>
+          <w:sz w:val="24"/>
+        </w:rPr>
+        <w:t>AI work spans graduate-level coursework in the 1990s, computational creativity research, expert systems, game intelligence, generative art, and modern LLM and agentic systems.</w:t>
       </w:r>
     </w:p>
     <w:p>
@@ -3846,7 +2608,7 @@
           <w:color w:val="0C0C0C"/>
           <w:sz w:val="24"/>
         </w:rPr>
-        <w:t>Technologies:</w:t>
+        <w:t>Frameworks and Platforms:</w:t>
       </w:r>
       <w:r>
         <w:rPr>
@@ -3855,7 +2617,7 @@
           <w:color w:val="0C0C0C"/>
           <w:sz w:val="24"/>
         </w:rPr>
-        <w:t xml:space="preserve"> Large Language Model (LLM) Applications, Agentic Systems, Model Context Protocol (MCP), RAG, Embeddings, Vector Stores, Semantic Search, Pinecone, Structured Extraction, REST APIs, Django, Celery, HTMX, Pydantic, PydanticAI, OpenAI Agents SDK, Codex, Docker, PostgreSQL, SQLite, AWS Services, AWS QuickSight, Amazon Q, Strands Agents SDK, CI/CD, GitHub Actions, Terraform, React, Next.js, Node.js, Tailwind CSS, Salesforce Lightning, Lightning Web Components, Visual Studio Code, oclif</w:t>
+        <w:t xml:space="preserve"> REST APIs, Django, Celery, HTMX, Pydantic, PydanticAI, OpenAI Agents SDK, Docker, PostgreSQL, SQLite, AWS Services, AWS QuickSight, Amazon Q, Strands Agents SDK, GitHub Actions, Terraform, React, Next.js, Node.js, Tailwind CSS, Salesforce Lightning, Lightning Web Components, oclif</w:t>
       </w:r>
     </w:p>
     <w:p>
@@ -3870,7 +2632,7 @@
           <w:color w:val="0C0C0C"/>
           <w:sz w:val="24"/>
         </w:rPr>
-        <w:t>Methodologies:</w:t>
+        <w:t>AI Methods:</w:t>
       </w:r>
       <w:r>
         <w:rPr>
@@ -3879,7 +2641,7 @@
           <w:color w:val="0C0C0C"/>
           <w:sz w:val="24"/>
         </w:rPr>
-        <w:t xml:space="preserve"> AI Development, Prompt Engineering, Tool Use, Planning Loops, Multi-Agent Systems, Guardrail Design, Rubric Grading, Human Review, Tracing, Observability, Large Language Model (LLM) Evaluation, Agent Evaluation, Framework Design, API Design, Platform Design, Reference Implementations, Technical Strategy, Developer Workflow Optimization, Agile</w:t>
+        <w:t xml:space="preserve"> Agentic Systems, Model Context Protocol (MCP), RAG, Embeddings, Vector Stores, Semantic Search, Pinecone, Structured Extraction, Prompt Engineering, Tool Use, Planning Loops, Multi-Agent Systems, Guardrail Design, Rubric Grading, Human Review, Tracing, Observability, LLM Evaluation, Agent Evaluation</w:t>
       </w:r>
     </w:p>
     <w:p>
@@ -3894,7 +2656,7 @@
           <w:color w:val="0C0C0C"/>
           <w:sz w:val="24"/>
         </w:rPr>
-        <w:t>Other Skills:</w:t>
+        <w:t>Architecture and Leadership:</w:t>
       </w:r>
       <w:r>
         <w:rPr>
@@ -3903,7 +2665,31 @@
           <w:color w:val="0C0C0C"/>
           <w:sz w:val="24"/>
         </w:rPr>
-        <w:t xml:space="preserve"> Software Architecture, AI Product Architecture, Full-Stack Development, UI/UX Design, Developer Experience, Cross-Functional Leadership, Mentorship, Git, Perforce, Jira, Confluence, HTML/CSS</w:t>
+        <w:t xml:space="preserve"> Framework Design, API Design, Platform Design, AI Product Architecture, Reference Implementations, Technical Strategy, UI/UX Design, Developer Experience, Cross-Functional Leadership, Mentorship</w:t>
+      </w:r>
+    </w:p>
+    <w:p>
+      <w:pPr>
+        <w:spacing w:before="0" w:after="160"/>
+      </w:pPr>
+      <w:r>
+        <w:rPr>
+          <w:rFonts w:ascii="Helvetica Neue" w:hAnsi="Helvetica Neue" w:eastAsia="Helvetica Neue"/>
+          <w:b/>
+          <w:i w:val="0"/>
+          <w:color w:val="0C0C0C"/>
+          <w:sz w:val="24"/>
+        </w:rPr>
+        <w:t>Engineering Tools:</w:t>
+      </w:r>
+      <w:r>
+        <w:rPr>
+          <w:rFonts w:ascii="Helvetica Neue" w:hAnsi="Helvetica Neue" w:eastAsia="Helvetica Neue"/>
+          <w:i w:val="0"/>
+          <w:color w:val="0C0C0C"/>
+          <w:sz w:val="24"/>
+        </w:rPr>
+        <w:t xml:space="preserve"> Codex, Git, Perforce, Jira, Confluence, Visual Studio Code, CI/CD, HTML/CSS</w:t>
       </w:r>
     </w:p>
     <w:sectPr>

</xml_diff>

<commit_message>
Correct Zilliant data API chronology
</commit_message>
<xml_diff>
--- a/docs/downloads/bt-franklin-resume-full.docx
+++ b/docs/downloads/bt-franklin-resume-full.docx
@@ -228,6 +228,70 @@
           <w:sz w:val="24"/>
         </w:rPr>
         <w:t>Contributed to the React, Next.js, and Node.js client and server layers of Zilliant's Pricing Plus application.</w:t>
+      </w:r>
+    </w:p>
+    <w:p>
+      <w:pPr>
+        <w:pStyle w:val="ListBullet"/>
+        <w:keepLines/>
+        <w:numPr>
+          <w:numId w:val="0"/>
+        </w:numPr>
+        <w:tabs>
+          <w:tab w:pos="360" w:val="left"/>
+        </w:tabs>
+        <w:spacing w:before="0" w:after="160"/>
+        <w:ind w:left="360" w:hanging="360"/>
+      </w:pPr>
+      <w:r>
+        <w:rPr>
+          <w:rFonts w:ascii="Helvetica Neue" w:hAnsi="Helvetica Neue" w:eastAsia="Helvetica Neue"/>
+          <w:color w:val="0C0C0C"/>
+          <w:sz w:val="24"/>
+        </w:rPr>
+        <w:t>•</w:t>
+        <w:tab/>
+      </w:r>
+      <w:r>
+        <w:rPr>
+          <w:rFonts w:ascii="Helvetica Neue" w:hAnsi="Helvetica Neue" w:eastAsia="Helvetica Neue"/>
+          <w:i w:val="0"/>
+          <w:color w:val="0C0C0C"/>
+          <w:sz w:val="24"/>
+        </w:rPr>
+        <w:t>Architected and shipped a customer-facing read-only data API across a legacy microservice stack in less than one month, earning a delivery bonus.</w:t>
+      </w:r>
+    </w:p>
+    <w:p>
+      <w:pPr>
+        <w:pStyle w:val="ListBullet"/>
+        <w:keepLines/>
+        <w:numPr>
+          <w:numId w:val="0"/>
+        </w:numPr>
+        <w:tabs>
+          <w:tab w:pos="360" w:val="left"/>
+        </w:tabs>
+        <w:spacing w:before="0" w:after="160"/>
+        <w:ind w:left="360" w:hanging="360"/>
+      </w:pPr>
+      <w:r>
+        <w:rPr>
+          <w:rFonts w:ascii="Helvetica Neue" w:hAnsi="Helvetica Neue" w:eastAsia="Helvetica Neue"/>
+          <w:color w:val="0C0C0C"/>
+          <w:sz w:val="24"/>
+        </w:rPr>
+        <w:t>•</w:t>
+        <w:tab/>
+      </w:r>
+      <w:r>
+        <w:rPr>
+          <w:rFonts w:ascii="Helvetica Neue" w:hAnsi="Helvetica Neue" w:eastAsia="Helvetica Neue"/>
+          <w:i w:val="0"/>
+          <w:color w:val="0C0C0C"/>
+          <w:sz w:val="24"/>
+        </w:rPr>
+        <w:t>Refactored Pricing Plus data access behind semantic adapters, reducing LEDS coupling and preparing the API for an independent service boundary.</w:t>
       </w:r>
     </w:p>
     <w:p>
@@ -606,38 +670,6 @@
           <w:color w:val="0C0C0C"/>
           <w:sz w:val="24"/>
         </w:rPr>
-        <w:t>Served as chief architect for a public data API that exposed supported CRUD operations across a legacy microservice stack.</w:t>
-      </w:r>
-    </w:p>
-    <w:p>
-      <w:pPr>
-        <w:pStyle w:val="ListBullet"/>
-        <w:keepLines/>
-        <w:numPr>
-          <w:numId w:val="0"/>
-        </w:numPr>
-        <w:tabs>
-          <w:tab w:pos="360" w:val="left"/>
-        </w:tabs>
-        <w:spacing w:before="0" w:after="160"/>
-        <w:ind w:left="360" w:hanging="360"/>
-      </w:pPr>
-      <w:r>
-        <w:rPr>
-          <w:rFonts w:ascii="Helvetica Neue" w:hAnsi="Helvetica Neue" w:eastAsia="Helvetica Neue"/>
-          <w:color w:val="0C0C0C"/>
-          <w:sz w:val="24"/>
-        </w:rPr>
-        <w:t>•</w:t>
-        <w:tab/>
-      </w:r>
-      <w:r>
-        <w:rPr>
-          <w:rFonts w:ascii="Helvetica Neue" w:hAnsi="Helvetica Neue" w:eastAsia="Helvetica Neue"/>
-          <w:i w:val="0"/>
-          <w:color w:val="0C0C0C"/>
-          <w:sz w:val="24"/>
-        </w:rPr>
         <w:t>Designed and launched the Zilliant Developer Experience CLI, reducing complex environment migrations from multiple days to a few hours.</w:t>
       </w:r>
     </w:p>
@@ -670,7 +702,7 @@
           <w:color w:val="0C0C0C"/>
           <w:sz w:val="24"/>
         </w:rPr>
-        <w:t>Shaped architecture across AI, analytics, public APIs, and developer enablement initiatives.</w:t>
+        <w:t>Shaped architecture across AI, analytics, and developer enablement initiatives.</w:t>
       </w:r>
     </w:p>
     <w:p>

</xml_diff>

<commit_message>
Generalize Zilliant resume terminology
</commit_message>
<xml_diff>
--- a/docs/downloads/bt-franklin-resume-full.docx
+++ b/docs/downloads/bt-franklin-resume-full.docx
@@ -227,7 +227,7 @@
           <w:color w:val="0C0C0C"/>
           <w:sz w:val="24"/>
         </w:rPr>
-        <w:t>Contributed to the React, Next.js, and Node.js client and server layers of Zilliant's Pricing Plus application.</w:t>
+        <w:t>Contributed to the React, Next.js, and Node.js client and server layers of an enterprise pricing application.</w:t>
       </w:r>
     </w:p>
     <w:p>
@@ -259,7 +259,7 @@
           <w:color w:val="0C0C0C"/>
           <w:sz w:val="24"/>
         </w:rPr>
-        <w:t>Architected and shipped a customer-facing read-only data API across a legacy microservice stack in less than one month, earning a delivery bonus.</w:t>
+        <w:t>Architected and shipped a secure, customer-facing read-only data API across a legacy enterprise microservice stack in less than one month, earning a delivery bonus.</w:t>
       </w:r>
     </w:p>
     <w:p>
@@ -291,7 +291,7 @@
           <w:color w:val="0C0C0C"/>
           <w:sz w:val="24"/>
         </w:rPr>
-        <w:t>Refactored Pricing Plus data access behind semantic adapters, reducing LEDS coupling and preparing the API for an independent service boundary.</w:t>
+        <w:t>Refactored application data access behind semantic adapters, reducing coupling to a legacy internal data service and preparing the API for an independent service boundary.</w:t>
       </w:r>
     </w:p>
     <w:p>

</xml_diff>